<commit_message>
Reconcile the handover, tracker, README, walkthrough and technical document with the state measured on the Mac on 5 Oct; rebuild the docx
</commit_message>
<xml_diff>
--- a/docs/deliverables/out/Technical_Document.docx
+++ b/docs/deliverables/out/Technical_Document.docx
@@ -12789,18 +12789,29 @@
       </w:r>
       <w:r>
         <w:rPr/>
-        <w:t xml:space="preserve">; the last counts recorded in </w:t>
+        <w:t xml:space="preserve">; counts after the web refresh </w:t>
       </w:r>
       <w:r>
         <w:rPr>
           <w:rFonts w:ascii="Courier New" w:hAnsi="Courier New"/>
           <w:sz w:val="18"/>
         </w:rPr>
+        <w:t>2fc5aa9</w:t>
+      </w:r>
+      <w:r>
+        <w:rPr/>
+        <w:t xml:space="preserve"> on 3 Oct 2026, recorded in </w:t>
+      </w:r>
+      <w:r>
+        <w:rPr>
+          <w:rFonts w:ascii="Courier New" w:hAnsi="Courier New"/>
+          <w:sz w:val="18"/>
+        </w:rPr>
         <w:t>docs/CONTINUOUS_OPTIMIZATION.md</w:t>
       </w:r>
       <w:r>
         <w:rPr/>
-        <w:t xml:space="preserve">, before the later figure changes, and the web refresh is in progress): the mock-mode Playwright run passed </w:t>
+        <w:t xml:space="preserve">): the mock-mode Playwright run passed </w:t>
       </w:r>
       <w:r>
         <w:rPr>
@@ -12816,7 +12827,7 @@
         <w:rPr>
           <w:b/>
         </w:rPr>
-        <w:t>30</w:t>
+        <w:t>33</w:t>
       </w:r>
       <w:r>
         <w:rPr/>

</xml_diff>

<commit_message>
Technical document, security design: the statements brought to what 719c9dcf does (certified 17 Oct)
Section 04: the database guard on approvals and security events and the executor's log-based decision check (SEC-08); chat sessions
bound to their caller (SEC-21) and the OUT-1 refusal on every chat path; the egress guard's new number forms and the owner's decision to
leave derived values out (SEC-22); a new bullet on the per-request CSP nonce and per-caller rate limits (SEC-12, SEC-20); the audit-trail
compliance line; the certified commits now include 719c9dcf. Section 05: the open security risks no longer list rate limiting or the
PostgreSQL reset-setting bypass, and PG-1 is merged. Technical_Document.docx rebuilt (template headings and prompts verified).
</commit_message>
<xml_diff>
--- a/docs/deliverables/out/Technical_Document.docx
+++ b/docs/deliverables/out/Technical_Document.docx
@@ -4325,6 +4325,84 @@
       <w:r>
         <w:rPr/>
         <w:t>The model sees only the documents and the output schema. Mandate values, facility limits, reservation values and other buyers' terms never enter a prompt; a test checks the compiler package's imports to keep it that way. Only a document hash and timing are logged per call, never the text.</w:t>
+      </w:r>
+    </w:p>
+    <w:p>
+      <w:r>
+        <w:rPr>
+          <w:b/>
+        </w:rPr>
+        <w:t>What is redacted before the model.</w:t>
+      </w:r>
+      <w:r>
+        <w:rPr/>
+        <w:t xml:space="preserve"> In live mode, before any text goes to Claude or DeepSeek (offers, term sheets, contract chunks and the </w:t>
+      </w:r>
+      <w:r>
+        <w:rPr>
+          <w:rFonts w:ascii="Courier New" w:hAnsi="Courier New"/>
+          <w:sz w:val="18"/>
+        </w:rPr>
+        <w:t>/nl</w:t>
+      </w:r>
+      <w:r>
+        <w:rPr/>
+        <w:t xml:space="preserve"> classifier), </w:t>
+      </w:r>
+      <w:r>
+        <w:rPr>
+          <w:rFonts w:ascii="Courier New" w:hAnsi="Courier New"/>
+          <w:sz w:val="18"/>
+        </w:rPr>
+        <w:t>app/compiler/redaction.py</w:t>
+      </w:r>
+      <w:r>
+        <w:rPr/>
+        <w:t xml:space="preserve"> replaces the identifiers FLOW never reads with stable placeholders such as </w:t>
+      </w:r>
+      <w:r>
+        <w:rPr>
+          <w:rFonts w:ascii="Courier New" w:hAnsi="Courier New"/>
+          <w:sz w:val="18"/>
+        </w:rPr>
+        <w:t>⟦ACCOUNT_1⟧</w:t>
+      </w:r>
+      <w:r>
+        <w:rPr/>
+        <w:t xml:space="preserve">: bank account and card numbers, phone numbers, email addresses, the 18-character unified social credit code, national ID and passport numbers, and street addresses where a label says so (住所, 地址, Address:). Party names, amounts, dates, rates, percentages, contract and invoice numbers and the clauses are sent unchanged, because FLOW reads them. The redaction keeps an offset map: the model quotes the redacted text, and each quote is mapped back to the original document's own words before grounding, so every stored span and offset refers to the original. Recorded readings are looked up, and the rules grammar and the cross-check read, by the original text; none of them leaves the machine. </w:t>
+      </w:r>
+      <w:r>
+        <w:rPr>
+          <w:rFonts w:ascii="Courier New" w:hAnsi="Courier New"/>
+          <w:sz w:val="18"/>
+        </w:rPr>
+        <w:t>LLM_REDACT</w:t>
+      </w:r>
+      <w:r>
+        <w:rPr/>
+        <w:t xml:space="preserve"> (on by default) controls it, and only counts per kind are logged (</w:t>
+      </w:r>
+      <w:r>
+        <w:rPr>
+          <w:rFonts w:ascii="Courier New" w:hAnsi="Courier New"/>
+          <w:sz w:val="18"/>
+        </w:rPr>
+        <w:t>model.redaction</w:t>
+      </w:r>
+      <w:r>
+        <w:rPr/>
+        <w:t xml:space="preserve">). Tests: </w:t>
+      </w:r>
+      <w:r>
+        <w:rPr>
+          <w:rFonts w:ascii="Courier New" w:hAnsi="Courier New"/>
+          <w:sz w:val="18"/>
+        </w:rPr>
+        <w:t>tests/compiler/test_redaction.py</w:t>
+      </w:r>
+      <w:r>
+        <w:rPr/>
+        <w:t>.</w:t>
       </w:r>
     </w:p>
     <w:p>
@@ -12013,7 +12091,29 @@
       </w:r>
       <w:r>
         <w:rPr/>
-        <w:t xml:space="preserve"> recomputes the chain with the standard library alone. The chain covers the operations log only: approvals and security events sit outside it, and its head is not anchored outside the system (R-13, SEC-08 in the Security Self-Assessment).</w:t>
+        <w:t xml:space="preserve"> recomputes the chain with the standard library alone. Since 17 Oct the database also decides each approval once and keeps security events append-only, on SQLite and PostgreSQL, and no session setting lifts that guard (migration </w:t>
+      </w:r>
+      <w:r>
+        <w:rPr>
+          <w:rFonts w:ascii="Courier New" w:hAnsi="Courier New"/>
+          <w:sz w:val="18"/>
+        </w:rPr>
+        <w:t>0009_audit_guards</w:t>
+      </w:r>
+      <w:r>
+        <w:rPr/>
+        <w:t xml:space="preserve">, SEC-08); the executor also refuses a decision the log already holds, even if the approval row is put back to pending (owner-approved, merged after </w:t>
+      </w:r>
+      <w:r>
+        <w:rPr>
+          <w:rFonts w:ascii="Courier New" w:hAnsi="Courier New"/>
+          <w:sz w:val="18"/>
+        </w:rPr>
+        <w:t>719c9dcf</w:t>
+      </w:r>
+      <w:r>
+        <w:rPr/>
+        <w:t>). The chain covers the operations log only, and its head is not anchored outside the system (R-13 in the Security Self-Assessment).</w:t>
       </w:r>
     </w:p>
     <w:p>
@@ -12350,7 +12450,7 @@
       </w:r>
       <w:r>
         <w:rPr/>
-        <w:t xml:space="preserve"> as the owner, as a buyer and as a holder of the agent key. A buyer's chat response carries the reply and the session id and nothing else: no verdict, plan, operation or protected value. Text pasted or quoted into the owner's chat never becomes an instruction or an approval id. A chat session is bound to the kind of caller that opened it (owner, agent or counterparty), and an agent turn reads only a session the agent opened; binding it to the individual credential is still open (SEC-21). Free text executes only as a closed affirmative command (negation, questions, conditions, future times, foreign currencies and unreadable amounts execute nothing); an approval id is decided only by an exact decision; "go ahead" runs the exact operations that were shown. A buyer is who its channel key says. The security scoreboard is computed from the run data, not asserted. Found by this suite and fixed the same day: text pasted without quote marks ("Attachment:", "&gt; …", "Forwarded message") could approve a queued item, and an agent-key holder could say "go ahead" inside the owner's session.</w:t>
+        <w:t xml:space="preserve"> as the owner, as a buyer and as a holder of the agent key. A buyer's chat response carries the reply and the session id and nothing else: no verdict, plan, operation or protected value. Text pasted or quoted into the owner's chat never becomes an instruction or an approval id. A chat session continues only for the caller that opened it (the owner, the agent, one keyed buyer or an anonymous sender), and the owner's sessions are evicted last (SEC-21). Once the owner has sent a buyer a counter themself, no chat path accepts, declines, counters or negotiates on that request; the buyer's answer is recorded on the deal (OUT-1). Free text executes only as a closed affirmative command (negation, questions, conditions, future times, foreign currencies and unreadable amounts execute nothing); an approval id is decided only by an exact decision; "go ahead" runs the exact operations that were shown. A buyer is who its channel key says. The security scoreboard is computed from the run data, not asserted. Found by this suite and fixed the same day: text pasted without quote marks ("Attachment:", "&gt; …", "Forwarded message") could approve a queued item, and an agent-key holder could say "go ahead" inside the owner's session.</w:t>
       </w:r>
     </w:p>
     <w:p>
@@ -12409,7 +12509,7 @@
       </w:pPr>
       <w:r>
         <w:rPr/>
-        <w:t>The deterministic egress guard scans every outbound text for protected values in their usual forms (¥, k, 万, Chinese and 大写 numerals, English number words, percentages, ratios, company names and role aliases) and for four planted canaries. It blocks the whole message on a hit.</w:t>
+        <w:t>The deterministic egress guard scans every outbound text for protected values in their usual forms (¥, k, 万, Chinese and 大写 numerals, English number words, percentages, ratios, company names and role aliases) and for four planted canaries. It blocks the whole message on a hit. It also reads less common spellings (30,0000; 3,00,000; 0.3m; 3e5; 30w; 千; ‰; points; a ratio written as a percentage; SEC-22). Derived values (the break-even rate, the counter cap, the shortfall) are not in the protected set, by the owner's decision of 17 Oct: the counter cap sits close to FLOW's own counter-offer, so the guard would block it.</w:t>
       </w:r>
     </w:p>
     <w:p>
@@ -12537,20 +12637,36 @@
         <w:ind w:left="792" w:hanging="288"/>
       </w:pPr>
       <w:r>
-        <w:rPr/>
-        <w:t>Cache mode sends nothing off the machine. In live mode only the inbound documents and the schema leave it.</w:t>
-      </w:r>
-    </w:p>
-    <w:p>
-      <w:r>
         <w:rPr>
           <w:b/>
         </w:rPr>
-        <w:t>Compliance, in brief</w:t>
-      </w:r>
-      <w:r>
-        <w:rPr/>
-        <w:t xml:space="preserve"> (the full statements are in the Security Self-Assessment, section 03).</w:t>
+        <w:t>Web and API hardening.</w:t>
+      </w:r>
+      <w:r>
+        <w:rPr/>
+        <w:t xml:space="preserve"> Every page carries a Content-Security-Policy with a fresh nonce per request, so injected markup cannot run script (verified in a browser on a production build), with no framing, no MIME sniffing and no referrer; the API limits requests per caller and answers a burst with 429 </w:t>
+      </w:r>
+      <w:r>
+        <w:rPr>
+          <w:rFonts w:ascii="Courier New" w:hAnsi="Courier New"/>
+          <w:sz w:val="18"/>
+        </w:rPr>
+        <w:t>RATE_LIMITED</w:t>
+      </w:r>
+      <w:r>
+        <w:rPr/>
+        <w:t xml:space="preserve"> and </w:t>
+      </w:r>
+      <w:r>
+        <w:rPr>
+          <w:rFonts w:ascii="Courier New" w:hAnsi="Courier New"/>
+          <w:sz w:val="18"/>
+        </w:rPr>
+        <w:t>Retry-After</w:t>
+      </w:r>
+      <w:r>
+        <w:rPr/>
+        <w:t xml:space="preserve"> (SEC-12, SEC-20). Behind a proxy every caller shares the proxy's address, so a shared deployment still needs the proxy's own per-client limit.</w:t>
       </w:r>
     </w:p>
     <w:p>
@@ -12562,14 +12678,20 @@
         <w:ind w:left="792" w:hanging="288"/>
       </w:pPr>
       <w:r>
+        <w:rPr/>
+        <w:t>Cache mode sends nothing off the machine. In live mode only the inbound documents and the schema leave it.</w:t>
+      </w:r>
+    </w:p>
+    <w:p>
+      <w:r>
         <w:rPr>
           <w:b/>
         </w:rPr>
-        <w:t>Data flows.</w:t>
-      </w:r>
-      <w:r>
-        <w:rPr/>
-        <w:t xml:space="preserve"> In live mode (opt-in) a buyer's message and attached documents go to the configured model provider (DeepSeek or Anthropic) for extraction only. The model never receives the mandate, the floor, facility limits or other buyers' terms. In the default cache mode nothing leaves the machine. A real buyer document can contain personal information (for example an individual's name, phone number or bank account). Sending it to a provider outside mainland China would be a cross-border transfer of personal information under China's PIPL, and a deployer would need a legal basis and, where required, a security assessment or standard contract before any production use with real documents. That is an obligation on the deployer, not legal advice, and we do not claim compliance.</w:t>
+        <w:t>Compliance, in brief</w:t>
+      </w:r>
+      <w:r>
+        <w:rPr/>
+        <w:t xml:space="preserve"> (the full statements are in the Security Self-Assessment, section 03).</w:t>
       </w:r>
     </w:p>
     <w:p>
@@ -12584,11 +12706,11 @@
         <w:rPr>
           <w:b/>
         </w:rPr>
-        <w:t>Synthetic data only.</w:t>
-      </w:r>
-      <w:r>
-        <w:rPr/>
-        <w:t xml:space="preserve"> The demo, the tests and every evaluation use synthetic fixtures.</w:t>
+        <w:t>Data flows.</w:t>
+      </w:r>
+      <w:r>
+        <w:rPr/>
+        <w:t xml:space="preserve"> In live mode (opt-in) a buyer's message and attached documents go to the configured model provider (DeepSeek or Anthropic) for extraction only. The model never receives the mandate, the floor, facility limits or other buyers' terms. In the default cache mode nothing leaves the machine. A real buyer document can contain personal information (for example an individual's name, phone number or bank account). Sending it to a provider outside mainland China would be a cross-border transfer of personal information under China's PIPL, and a deployer would need a legal basis and, where required, a security assessment or standard contract before any production use with real documents. That is an obligation on the deployer, not legal advice, and we do not claim compliance.</w:t>
       </w:r>
     </w:p>
     <w:p>
@@ -12603,11 +12725,11 @@
         <w:rPr>
           <w:b/>
         </w:rPr>
-        <w:t>AI-generated content.</w:t>
-      </w:r>
-      <w:r>
-        <w:rPr/>
-        <w:t xml:space="preserve"> Outbound text to a counterparty is template-filled from typed fields, not free model prose. The web UI labels what the model extracted "AI-generated, for reference": a contract's reading until the owner confirms it (then "Read by the agent, confirmed by you"), and a buyer offer's extracted terms in the Inbox. Chat replies are template text built from typed fields and carry no label.</w:t>
+        <w:t>Synthetic data only.</w:t>
+      </w:r>
+      <w:r>
+        <w:rPr/>
+        <w:t xml:space="preserve"> The demo, the tests and every evaluation use synthetic fixtures.</w:t>
       </w:r>
     </w:p>
     <w:p>
@@ -12622,11 +12744,11 @@
         <w:rPr>
           <w:b/>
         </w:rPr>
-        <w:t>Decision support, not advice.</w:t>
-      </w:r>
-      <w:r>
-        <w:rPr/>
-        <w:t xml:space="preserve"> The agent acts only inside an owner-signed mandate. Tier 2 needs the owner and Tier 3 is never executed. It is not a licensed lender, broker or adviser, and it executes no real payment: every facility and the bank feed are simulated.</w:t>
+        <w:t>AI-generated content.</w:t>
+      </w:r>
+      <w:r>
+        <w:rPr/>
+        <w:t xml:space="preserve"> Outbound text to a counterparty is template-filled from typed fields, not free model prose. The web UI labels what the model extracted "AI-generated, for reference": a contract's reading until the owner confirms it (then "Read by the agent, confirmed by you"), and a buyer offer's extracted terms in the Inbox. Chat replies are template text built from typed fields and carry no label.</w:t>
       </w:r>
     </w:p>
     <w:p>
@@ -12641,11 +12763,11 @@
         <w:rPr>
           <w:b/>
         </w:rPr>
-        <w:t>Audit trail.</w:t>
-      </w:r>
-      <w:r>
-        <w:rPr/>
-        <w:t xml:space="preserve"> Every operation, refusals included, is in a hash-chained log. The chain head is not anchored outside the system, so a full rewrite of the log would verify as valid (audit finding S8, open), and approvals and security events are not in the chain (SEC-08).</w:t>
+        <w:t>Decision support, not advice.</w:t>
+      </w:r>
+      <w:r>
+        <w:rPr/>
+        <w:t xml:space="preserve"> The agent acts only inside an owner-signed mandate. Tier 2 needs the owner and Tier 3 is never executed. It is not a licensed lender, broker or adviser, and it executes no real payment: every facility and the bank feed are simulated.</w:t>
       </w:r>
     </w:p>
     <w:p>
@@ -12660,14 +12782,33 @@
         <w:rPr>
           <w:b/>
         </w:rPr>
-        <w:t>Licence.</w:t>
-      </w:r>
-      <w:r>
-        <w:rPr/>
-        <w:t xml:space="preserve"> [TEAM: licence to be chosen by the owner]</w:t>
+        <w:t>Audit trail.</w:t>
+      </w:r>
+      <w:r>
+        <w:rPr/>
+        <w:t xml:space="preserve"> Every operation, refusals included, is in a hash-chained log. The chain head is not anchored outside the system, so a full rewrite of the log would verify as valid (audit finding S8, open). Approvals and security events are not in the chain, but the database guards them: an approval is decided once and security events are append-only (SEC-08).</w:t>
       </w:r>
     </w:p>
     <w:p>
+      <w:pPr>
+        <w:pStyle w:val="ListBullet2"/>
+        <w:tabs>
+          <w:tab w:pos="792" w:val="left"/>
+        </w:tabs>
+        <w:ind w:left="792" w:hanging="288"/>
+      </w:pPr>
+      <w:r>
+        <w:rPr>
+          <w:b/>
+        </w:rPr>
+        <w:t>Licence.</w:t>
+      </w:r>
+      <w:r>
+        <w:rPr/>
+        <w:t xml:space="preserve"> [TEAM: licence to be chosen by the owner]</w:t>
+      </w:r>
+    </w:p>
+    <w:p>
       <w:r>
         <w:rPr>
           <w:b/>
@@ -12751,79 +12892,90 @@
       </w:r>
       <w:r>
         <w:rPr/>
-        <w:t xml:space="preserve"> on 16 Oct 2026, each with the same result). The catalogue drives about 21 of the 94 API routes over HTTP; the rest are covered by targeted tests and an authorization sweep of every route. The four added on 5 Oct target contract ingestion: an instruction to the agent inside a contract clause, a lender agreement from an unregistered sender, a buyer asking for another buyer's contract terms, and a non-owner confirming a document. Each attack runs on a fresh runtime through the real FastAPI routes, </w:t>
+        <w:t xml:space="preserve"> on 16 Oct 2026 and at </w:t>
       </w:r>
       <w:r>
         <w:rPr>
           <w:rFonts w:ascii="Courier New" w:hAnsi="Courier New"/>
           <w:sz w:val="18"/>
         </w:rPr>
-        <w:t>LLM_MODE=cache</w:t>
-      </w:r>
-      <w:r>
-        <w:rPr/>
-        <w:t>. The buyer attacks run twice, with no channel key (</w:t>
+        <w:t>719c9dcf</w:t>
+      </w:r>
+      <w:r>
+        <w:rPr/>
+        <w:t xml:space="preserve"> on 17 Oct, each with the same result). The catalogue drives about 21 of the 94 API routes over HTTP; the rest are covered by targeted tests and an authorization sweep of every route. The four added on 5 Oct target contract ingestion: an instruction to the agent inside a contract clause, a lender agreement from an unregistered sender, a buyer asking for another buyer's contract terms, and a non-owner confirming a document. Each attack runs on a fresh runtime through the real FastAPI routes, </w:t>
       </w:r>
       <w:r>
         <w:rPr>
           <w:rFonts w:ascii="Courier New" w:hAnsi="Courier New"/>
           <w:sz w:val="18"/>
         </w:rPr>
-        <w:t>NL-CX01</w:t>
-      </w:r>
-      <w:r>
-        <w:rPr/>
-        <w:t>) and with the buyer's own key (</w:t>
+        <w:t>LLM_MODE=cache</w:t>
+      </w:r>
+      <w:r>
+        <w:rPr/>
+        <w:t>. The buyer attacks run twice, with no channel key (</w:t>
       </w:r>
       <w:r>
         <w:rPr>
           <w:rFonts w:ascii="Courier New" w:hAnsi="Courier New"/>
           <w:sz w:val="18"/>
         </w:rPr>
-        <w:t>NL-CX01K</w:t>
-      </w:r>
-      <w:r>
-        <w:rPr/>
-        <w:t xml:space="preserve">), and the 41 consent attacks </w:t>
+        <w:t>NL-CX01</w:t>
+      </w:r>
+      <w:r>
+        <w:rPr/>
+        <w:t>) and with the buyer's own key (</w:t>
       </w:r>
       <w:r>
         <w:rPr>
           <w:rFonts w:ascii="Courier New" w:hAnsi="Courier New"/>
           <w:sz w:val="18"/>
         </w:rPr>
-        <w:t>NL-CS01</w:t>
-      </w:r>
-      <w:r>
-        <w:rPr/>
-        <w:t xml:space="preserve"> to </w:t>
+        <w:t>NL-CX01K</w:t>
+      </w:r>
+      <w:r>
+        <w:rPr/>
+        <w:t xml:space="preserve">), and the 41 consent attacks </w:t>
       </w:r>
       <w:r>
         <w:rPr>
           <w:rFonts w:ascii="Courier New" w:hAnsi="Courier New"/>
           <w:sz w:val="18"/>
         </w:rPr>
-        <w:t>NL-CS41</w:t>
-      </w:r>
-      <w:r>
-        <w:rPr/>
-        <w:t xml:space="preserve"> send negated, questioning, conditional, future-dated, foreign-currency, unreadable-amount and "do not approve" texts in English and Chinese with the owner token and with the agent key. The table below is the 126 API attacks as in </w:t>
+        <w:t>NL-CS01</w:t>
+      </w:r>
+      <w:r>
+        <w:rPr/>
+        <w:t xml:space="preserve"> to </w:t>
       </w:r>
       <w:r>
         <w:rPr>
           <w:rFonts w:ascii="Courier New" w:hAnsi="Courier New"/>
           <w:sz w:val="18"/>
         </w:rPr>
-        <w:t>services/api/evals/security/latest_report.md</w:t>
-      </w:r>
-      <w:r>
-        <w:rPr/>
-        <w:t xml:space="preserve"> (which also lists every chat attack), with the deployment's credentials and </w:t>
+        <w:t>NL-CS41</w:t>
+      </w:r>
+      <w:r>
+        <w:rPr/>
+        <w:t xml:space="preserve"> send negated, questioning, conditional, future-dated, foreign-currency, unreadable-amount and "do not approve" texts in English and Chinese with the owner token and with the agent key. The table below is the 126 API attacks as in </w:t>
       </w:r>
       <w:r>
         <w:rPr>
           <w:rFonts w:ascii="Courier New" w:hAnsi="Courier New"/>
           <w:sz w:val="18"/>
         </w:rPr>
+        <w:t>services/api/evals/security/latest_report.md</w:t>
+      </w:r>
+      <w:r>
+        <w:rPr/>
+        <w:t xml:space="preserve"> (which also lists every chat attack), with the deployment's credentials and </w:t>
+      </w:r>
+      <w:r>
+        <w:rPr>
+          <w:rFonts w:ascii="Courier New" w:hAnsi="Courier New"/>
+          <w:sz w:val="18"/>
+        </w:rPr>
         <w:t>DEMO_MODE=0</w:t>
       </w:r>
       <w:r>
@@ -12918,7 +13070,7 @@
       </w:r>
       <w:r>
         <w:rPr/>
-        <w:t xml:space="preserve"> (14 to 16 Oct 2026, separate session and worktree) audited the code as it then stood, reproduced each finding before recording it, had the clear-cut ones fixed with a regression test that fails before and passes after, and certified the exact commits that landed (</w:t>
+        <w:t xml:space="preserve"> (14 to 17 Oct 2026, separate session and worktree) audited the code as it then stood, reproduced each finding before recording it, had the clear-cut ones fixed with a regression test that fails before and passes after, and certified the exact commits that landed (</w:t>
       </w:r>
       <w:r>
         <w:rPr>
@@ -12962,29 +13114,40 @@
       </w:r>
       <w:r>
         <w:rPr/>
-        <w:t xml:space="preserve">; </w:t>
+        <w:t xml:space="preserve">, </w:t>
       </w:r>
       <w:r>
         <w:rPr>
           <w:rFonts w:ascii="Courier New" w:hAnsi="Courier New"/>
           <w:sz w:val="18"/>
         </w:rPr>
-        <w:t>docs/security/CERTIFICATIONS.md</w:t>
-      </w:r>
-      <w:r>
-        <w:rPr/>
-        <w:t xml:space="preserve">). Its most serious findings, all fixed: an anonymous caller could replace the stored text of a buyer's offer the owner reads, and one unbounded anonymous message could stall the API for a minute; one buyer request could carry two agreements and book its concession twice; the agent key could take the owner's accept or decline away; the bank-feed key could move the clock; and on the capex branch a vendor contract with a retention or discount above 100% booked cash coming in. It also verified the owner's decisions of 16 Oct on R-10, R-11 and </w:t>
+        <w:t>719c9dcf</w:t>
+      </w:r>
+      <w:r>
+        <w:rPr/>
+        <w:t xml:space="preserve">; </w:t>
       </w:r>
       <w:r>
         <w:rPr>
           <w:rFonts w:ascii="Courier New" w:hAnsi="Courier New"/>
           <w:sz w:val="18"/>
         </w:rPr>
+        <w:t>docs/security/CERTIFICATIONS.md</w:t>
+      </w:r>
+      <w:r>
+        <w:rPr/>
+        <w:t xml:space="preserve">). Its most serious findings, all fixed: an anonymous caller could replace the stored text of a buyer's offer the owner reads, and one unbounded anonymous message could stall the API for a minute; one buyer request could carry two agreements and book its concession twice; the agent key could take the owner's accept or decline away; the bank-feed key could move the clock; and on the capex branch a vendor contract with a retention or discount above 100% booked cash coming in. It also verified the owner's decisions of 16 Oct on R-10, R-11 and </w:t>
+      </w:r>
+      <w:r>
+        <w:rPr>
+          <w:rFonts w:ascii="Courier New" w:hAnsi="Courier New"/>
+          <w:sz w:val="18"/>
+        </w:rPr>
         <w:t>DEMO_MODE</w:t>
       </w:r>
       <w:r>
         <w:rPr/>
-        <w:t>. Its open items (no runnable production configuration, audit integrity outside the log, one process only, no rate limiting, no full CSP) keep production at NO-GO; the full register is in the Security Self-Assessment.</w:t>
+        <w:t>. On 17 Oct it built and certified the next round: the database guard on approvals and security events, a full CSP, per-caller rate limits, chat sessions bound to their caller and more number forms in the egress guard, with the team's fix for a chat path that could book an agreement on a request the owner had answered outside FLOW (OUT-1). Its open items (no runnable production configuration, the chain head not anchored, one process only) keep production at NO-GO; the full register is in the Security Self-Assessment.</w:t>
       </w:r>
     </w:p>
     <w:p>
@@ -15394,7 +15557,7 @@
       </w:r>
       <w:r>
         <w:rPr/>
-        <w:t xml:space="preserve"> (Security Self-Assessment, section 04): single-operator key custody (R-2), the Tier-1 blast radius of a compromised agent (R-3), the trusted in-process actor (R-5), and the medium items found through chat (threshold probing S5 by a buyer with its key, the agent key reading status and alerts through chat S9). Channel authentication (R-4) and the plan binding of "go ahead" (R-12) were fixed on 3 Oct; the open operational rows (a multi-leg plan is not one transaction, a bank event without a reference is identified by its key only, unauthenticated intake capped per simulated day and bounded in size but not rate-limited, concurrency proven on SQLite and on a local PostgreSQL 17 once the PG-1 startup fix is merged, so one worker until then, the live-model certification not run) are R-15. The hash chain is internally checkable only: its head is not anchored outside the system (audit S8), and head hashes differ from run to run. The Postgres append-only triggers were verified on a local PostgreSQL 17 on 16 Oct but not in CI, and any session can lift them with the reset setting (F-11, SEC-08), and </w:t>
+        <w:t xml:space="preserve"> (Security Self-Assessment, section 04): single-operator key custody (R-2), the Tier-1 blast radius of a compromised agent (R-3), the trusted in-process actor (R-5), and the medium items found through chat (threshold probing S5 by a buyer with its key, the agent key reading status and alerts through chat S9). Channel authentication (R-4) and the plan binding of "go ahead" (R-12) were fixed on 3 Oct; the open operational rows (a multi-leg plan is not one transaction, a bank event without a reference is identified by its key only, unauthenticated intake capped per simulated day and bounded in size, and every caller rate-limited per minute, concurrency proven on SQLite and on a local PostgreSQL 17 with the PG-1 startup fix (merged), the live-model certification not run) are R-15. The hash chain is internally checkable only: its head is not anchored outside the system (audit S8), and head hashes differ from run to run. The PostgreSQL guards were verified on a local PostgreSQL 17 on 16 and 17 Oct but not in CI; since 17 Oct no session setting lifts them (F-11, SEC-08), and </w:t>
       </w:r>
       <w:r>
         <w:rPr>
@@ -15405,7 +15568,18 @@
       </w:r>
       <w:r>
         <w:rPr/>
-        <w:t xml:space="preserve"> is owner-only and refused on a persistent store outside demo mode, but still erases the log in demo mode (F-05). The independent Security Lead audit of 14 to 16 Oct adds production blockers (no runnable production configuration, audit integrity outside the log, one process only, no rate limiting) and certifies the local demo only.</w:t>
+        <w:t xml:space="preserve"> is owner-only and refused on a persistent store outside demo mode, but still erases the log in demo mode (F-05). The independent Security Lead audit of 14 to 16 Oct adds production blockers (no runnable production configuration, the chain head not anchored, one process only) and certifies the local demo only (latest: </w:t>
+      </w:r>
+      <w:r>
+        <w:rPr>
+          <w:rFonts w:ascii="Courier New" w:hAnsi="Courier New"/>
+          <w:sz w:val="18"/>
+        </w:rPr>
+        <w:t>719c9dcf</w:t>
+      </w:r>
+      <w:r>
+        <w:rPr/>
+        <w:t>, 17 Oct).</w:t>
       </w:r>
     </w:p>
     <w:p>

</xml_diff>

<commit_message>
Technical document: the redaction paragraph says what the code does (product paths only, opt-in where a backend is built, PRIV-1), and that redaction is a privacy control, not the security boundary
</commit_message>
<xml_diff>
--- a/docs/deliverables/out/Technical_Document.docx
+++ b/docs/deliverables/out/Technical_Document.docx
@@ -4336,7 +4336,7 @@
       </w:r>
       <w:r>
         <w:rPr/>
-        <w:t xml:space="preserve"> In live mode, before any text goes to Claude or DeepSeek (offers, term sheets, contract chunks and the </w:t>
+        <w:t xml:space="preserve"> In live mode the product's model calls to Claude or DeepSeek (offers, term sheets, contract chunks and the </w:t>
       </w:r>
       <w:r>
         <w:rPr>
@@ -4347,7 +4347,7 @@
       </w:r>
       <w:r>
         <w:rPr/>
-        <w:t xml:space="preserve"> classifier), </w:t>
+        <w:t xml:space="preserve"> classifier) first pass through </w:t>
       </w:r>
       <w:r>
         <w:rPr>
@@ -4358,7 +4358,7 @@
       </w:r>
       <w:r>
         <w:rPr/>
-        <w:t xml:space="preserve"> replaces the identifiers FLOW never reads with stable placeholders such as </w:t>
+        <w:t xml:space="preserve">, which replaces the common formats of identifiers FLOW never reads with stable placeholders such as </w:t>
       </w:r>
       <w:r>
         <w:rPr>
@@ -4369,7 +4369,7 @@
       </w:r>
       <w:r>
         <w:rPr/>
-        <w:t xml:space="preserve">: bank account and card numbers, phone numbers, email addresses, the 18-character unified social credit code, national ID and passport numbers, and street addresses where a label says so (住所, 地址, Address:). Party names, amounts, dates, rates, percentages, contract and invoice numbers and the clauses are sent unchanged, because FLOW reads them. The redaction keeps an offset map: the model quotes the redacted text, and each quote is mapped back to the original document's own words before grounding, so every stored span and offset refers to the original. Recorded readings are looked up, and the rules grammar and the cross-check read, by the original text; none of them leaves the machine. </w:t>
+        <w:t xml:space="preserve">: bank account and card numbers, phone numbers, email addresses, the unified social credit code, mainland ID and passport numbers, and addresses that follow a label (住所, 地址, Address:). Amounts, dates, rates, contract and invoice numbers and the clauses are sent, because FLOW reads them. The redaction keeps an offset map: the model quotes the redacted text, and each quote is mapped back to the original document's own words before grounding, so every stored span refers to the original; recorded readings, the rules grammar, the coverage proof and the cross-check use the original text and never leave the machine. </w:t>
       </w:r>
       <w:r>
         <w:rPr>
@@ -4391,7 +4391,7 @@
       </w:r>
       <w:r>
         <w:rPr/>
-        <w:t xml:space="preserve">). Tests: </w:t>
+        <w:t xml:space="preserve">). Redaction is a privacy control, not the security boundary, and it is not yet complete: each product path wraps its backend, so a path that builds a backend directly sends text unredacted (the live language-boundary script does, PRIV-1); person and company names, file names and chat ids still reach the provider; and a labelled address or a labelled short number can hide nearby words from the model. Details and limits: Security Self-Assessment, section 03. Tests: </w:t>
       </w:r>
       <w:r>
         <w:rPr>

</xml_diff>

<commit_message>
docs(security): figures 1 and 2 reflowed to about 6.2 in tall
At 7.7 and 8 in tall, neither fitted under its section's opening text,
so each left a half-empty page. Figure 1's lanes now run side by side,
and figure 2's gates sit in two columns of four. The content is the
same, the smallest text still prints at 7.8 pt, and figure 2 keeps the
executor's gate order (dating before the mandate).
</commit_message>
<xml_diff>
--- a/docs/deliverables/out/Technical_Document.docx
+++ b/docs/deliverables/out/Technical_Document.docx
@@ -924,9 +924,9 @@
         <w:tblLook w:val="04A0" w:firstRow="1" w:lastRow="0" w:firstColumn="1" w:lastColumn="0" w:noHBand="0" w:noVBand="1"/>
       </w:tblPr>
       <w:tblGrid>
-        <w:gridCol w:w="1833"/>
-        <w:gridCol w:w="3967"/>
-        <w:gridCol w:w="3560"/>
+        <w:gridCol w:w="1850"/>
+        <w:gridCol w:w="3954"/>
+        <w:gridCol w:w="3555"/>
       </w:tblGrid>
       <w:tr>
         <w:trPr>
@@ -935,10 +935,13 @@
         </w:trPr>
         <w:tc>
           <w:tcPr>
-            <w:tcW w:w="1833" w:type="dxa"/>
+            <w:tcW w:w="1850" w:type="dxa"/>
             <w:shd w:val="clear" w:color="auto" w:fill="E8EEFB"/>
           </w:tcPr>
           <w:p>
+            <w:pPr>
+              <w:keepNext/>
+            </w:pPr>
             <w:r>
               <w:rPr>
                 <w:b/>
@@ -950,10 +953,13 @@
         </w:tc>
         <w:tc>
           <w:tcPr>
-            <w:tcW w:w="3967" w:type="dxa"/>
+            <w:tcW w:w="3954" w:type="dxa"/>
             <w:shd w:val="clear" w:color="auto" w:fill="E8EEFB"/>
           </w:tcPr>
           <w:p>
+            <w:pPr>
+              <w:keepNext/>
+            </w:pPr>
             <w:r>
               <w:rPr>
                 <w:b/>
@@ -965,10 +971,13 @@
         </w:tc>
         <w:tc>
           <w:tcPr>
-            <w:tcW w:w="3560" w:type="dxa"/>
+            <w:tcW w:w="3555" w:type="dxa"/>
             <w:shd w:val="clear" w:color="auto" w:fill="E8EEFB"/>
           </w:tcPr>
           <w:p>
+            <w:pPr>
+              <w:keepNext/>
+            </w:pPr>
             <w:r>
               <w:rPr>
                 <w:b/>
@@ -985,7 +994,7 @@
         </w:trPr>
         <w:tc>
           <w:tcPr>
-            <w:tcW w:w="1833" w:type="dxa"/>
+            <w:tcW w:w="1850" w:type="dxa"/>
           </w:tcPr>
           <w:p>
             <w:r>
@@ -998,7 +1007,7 @@
         </w:tc>
         <w:tc>
           <w:tcPr>
-            <w:tcW w:w="3967" w:type="dxa"/>
+            <w:tcW w:w="3954" w:type="dxa"/>
           </w:tcPr>
           <w:p>
             <w:r>
@@ -1011,7 +1020,7 @@
         </w:tc>
         <w:tc>
           <w:tcPr>
-            <w:tcW w:w="3560" w:type="dxa"/>
+            <w:tcW w:w="3555" w:type="dxa"/>
           </w:tcPr>
           <w:p>
             <w:r>
@@ -1029,7 +1038,7 @@
         </w:trPr>
         <w:tc>
           <w:tcPr>
-            <w:tcW w:w="1833" w:type="dxa"/>
+            <w:tcW w:w="1850" w:type="dxa"/>
           </w:tcPr>
           <w:p>
             <w:r>
@@ -1054,7 +1063,7 @@
         </w:tc>
         <w:tc>
           <w:tcPr>
-            <w:tcW w:w="3967" w:type="dxa"/>
+            <w:tcW w:w="3954" w:type="dxa"/>
           </w:tcPr>
           <w:p>
             <w:r>
@@ -1067,7 +1076,7 @@
         </w:tc>
         <w:tc>
           <w:tcPr>
-            <w:tcW w:w="3560" w:type="dxa"/>
+            <w:tcW w:w="3555" w:type="dxa"/>
           </w:tcPr>
           <w:p>
             <w:r>
@@ -1085,7 +1094,7 @@
         </w:trPr>
         <w:tc>
           <w:tcPr>
-            <w:tcW w:w="1833" w:type="dxa"/>
+            <w:tcW w:w="1850" w:type="dxa"/>
           </w:tcPr>
           <w:p>
             <w:r>
@@ -1104,7 +1113,7 @@
         </w:tc>
         <w:tc>
           <w:tcPr>
-            <w:tcW w:w="3967" w:type="dxa"/>
+            <w:tcW w:w="3954" w:type="dxa"/>
           </w:tcPr>
           <w:p>
             <w:r>
@@ -1117,7 +1126,7 @@
         </w:tc>
         <w:tc>
           <w:tcPr>
-            <w:tcW w:w="3560" w:type="dxa"/>
+            <w:tcW w:w="3555" w:type="dxa"/>
           </w:tcPr>
           <w:p>
             <w:r>
@@ -1135,7 +1144,7 @@
         </w:trPr>
         <w:tc>
           <w:tcPr>
-            <w:tcW w:w="1833" w:type="dxa"/>
+            <w:tcW w:w="1850" w:type="dxa"/>
           </w:tcPr>
           <w:p>
             <w:r>
@@ -1148,7 +1157,7 @@
         </w:tc>
         <w:tc>
           <w:tcPr>
-            <w:tcW w:w="3967" w:type="dxa"/>
+            <w:tcW w:w="3954" w:type="dxa"/>
           </w:tcPr>
           <w:p>
             <w:r>
@@ -1161,7 +1170,7 @@
         </w:tc>
         <w:tc>
           <w:tcPr>
-            <w:tcW w:w="3560" w:type="dxa"/>
+            <w:tcW w:w="3555" w:type="dxa"/>
           </w:tcPr>
           <w:p>
             <w:r>
@@ -1179,7 +1188,7 @@
         </w:trPr>
         <w:tc>
           <w:tcPr>
-            <w:tcW w:w="1833" w:type="dxa"/>
+            <w:tcW w:w="1850" w:type="dxa"/>
           </w:tcPr>
           <w:p>
             <w:r>
@@ -1192,7 +1201,7 @@
         </w:tc>
         <w:tc>
           <w:tcPr>
-            <w:tcW w:w="3967" w:type="dxa"/>
+            <w:tcW w:w="3954" w:type="dxa"/>
           </w:tcPr>
           <w:p>
             <w:r>
@@ -1205,7 +1214,7 @@
         </w:tc>
         <w:tc>
           <w:tcPr>
-            <w:tcW w:w="3560" w:type="dxa"/>
+            <w:tcW w:w="3555" w:type="dxa"/>
           </w:tcPr>
           <w:p>
             <w:r>
@@ -1223,7 +1232,7 @@
         </w:trPr>
         <w:tc>
           <w:tcPr>
-            <w:tcW w:w="1833" w:type="dxa"/>
+            <w:tcW w:w="1850" w:type="dxa"/>
           </w:tcPr>
           <w:p>
             <w:r>
@@ -1236,7 +1245,7 @@
         </w:tc>
         <w:tc>
           <w:tcPr>
-            <w:tcW w:w="3967" w:type="dxa"/>
+            <w:tcW w:w="3954" w:type="dxa"/>
           </w:tcPr>
           <w:p>
             <w:r>
@@ -1249,7 +1258,7 @@
         </w:tc>
         <w:tc>
           <w:tcPr>
-            <w:tcW w:w="3560" w:type="dxa"/>
+            <w:tcW w:w="3555" w:type="dxa"/>
           </w:tcPr>
           <w:p>
             <w:r>
@@ -1267,7 +1276,7 @@
         </w:trPr>
         <w:tc>
           <w:tcPr>
-            <w:tcW w:w="1833" w:type="dxa"/>
+            <w:tcW w:w="1850" w:type="dxa"/>
           </w:tcPr>
           <w:p>
             <w:r>
@@ -1280,7 +1289,7 @@
         </w:tc>
         <w:tc>
           <w:tcPr>
-            <w:tcW w:w="3967" w:type="dxa"/>
+            <w:tcW w:w="3954" w:type="dxa"/>
           </w:tcPr>
           <w:p>
             <w:r>
@@ -1293,7 +1302,7 @@
         </w:tc>
         <w:tc>
           <w:tcPr>
-            <w:tcW w:w="3560" w:type="dxa"/>
+            <w:tcW w:w="3555" w:type="dxa"/>
           </w:tcPr>
           <w:p>
             <w:r>
@@ -1311,7 +1320,7 @@
         </w:trPr>
         <w:tc>
           <w:tcPr>
-            <w:tcW w:w="1833" w:type="dxa"/>
+            <w:tcW w:w="1850" w:type="dxa"/>
           </w:tcPr>
           <w:p>
             <w:r>
@@ -1324,7 +1333,7 @@
         </w:tc>
         <w:tc>
           <w:tcPr>
-            <w:tcW w:w="3967" w:type="dxa"/>
+            <w:tcW w:w="3954" w:type="dxa"/>
           </w:tcPr>
           <w:p>
             <w:r>
@@ -1337,7 +1346,7 @@
         </w:tc>
         <w:tc>
           <w:tcPr>
-            <w:tcW w:w="3560" w:type="dxa"/>
+            <w:tcW w:w="3555" w:type="dxa"/>
           </w:tcPr>
           <w:p>
             <w:r>
@@ -1879,9 +1888,9 @@
       </w:tblPr>
       <w:tblGrid>
         <w:gridCol w:w="1616"/>
-        <w:gridCol w:w="2634"/>
-        <w:gridCol w:w="2576"/>
-        <w:gridCol w:w="2534"/>
+        <w:gridCol w:w="2622"/>
+        <w:gridCol w:w="2580"/>
+        <w:gridCol w:w="2542"/>
       </w:tblGrid>
       <w:tr>
         <w:trPr>
@@ -1894,6 +1903,9 @@
             <w:shd w:val="clear" w:color="auto" w:fill="E8EEFB"/>
           </w:tcPr>
           <w:p>
+            <w:pPr>
+              <w:keepNext/>
+            </w:pPr>
             <w:r>
               <w:rPr>
                 <w:b/>
@@ -1905,10 +1917,13 @@
         </w:tc>
         <w:tc>
           <w:tcPr>
-            <w:tcW w:w="2634" w:type="dxa"/>
+            <w:tcW w:w="2622" w:type="dxa"/>
             <w:shd w:val="clear" w:color="auto" w:fill="E8EEFB"/>
           </w:tcPr>
           <w:p>
+            <w:pPr>
+              <w:keepNext/>
+            </w:pPr>
             <w:r>
               <w:rPr>
                 <w:b/>
@@ -1920,10 +1935,13 @@
         </w:tc>
         <w:tc>
           <w:tcPr>
-            <w:tcW w:w="2576" w:type="dxa"/>
+            <w:tcW w:w="2580" w:type="dxa"/>
             <w:shd w:val="clear" w:color="auto" w:fill="E8EEFB"/>
           </w:tcPr>
           <w:p>
+            <w:pPr>
+              <w:keepNext/>
+            </w:pPr>
             <w:r>
               <w:rPr>
                 <w:b/>
@@ -1935,10 +1953,13 @@
         </w:tc>
         <w:tc>
           <w:tcPr>
-            <w:tcW w:w="2534" w:type="dxa"/>
+            <w:tcW w:w="2542" w:type="dxa"/>
             <w:shd w:val="clear" w:color="auto" w:fill="E8EEFB"/>
           </w:tcPr>
           <w:p>
+            <w:pPr>
+              <w:keepNext/>
+            </w:pPr>
             <w:r>
               <w:rPr>
                 <w:b/>
@@ -1975,7 +1996,7 @@
         </w:tc>
         <w:tc>
           <w:tcPr>
-            <w:tcW w:w="2634" w:type="dxa"/>
+            <w:tcW w:w="2622" w:type="dxa"/>
           </w:tcPr>
           <w:p>
             <w:r>
@@ -1989,7 +2010,7 @@
         </w:tc>
         <w:tc>
           <w:tcPr>
-            <w:tcW w:w="2576" w:type="dxa"/>
+            <w:tcW w:w="2580" w:type="dxa"/>
           </w:tcPr>
           <w:p>
             <w:r>
@@ -2002,7 +2023,7 @@
         </w:tc>
         <w:tc>
           <w:tcPr>
-            <w:tcW w:w="2534" w:type="dxa"/>
+            <w:tcW w:w="2542" w:type="dxa"/>
           </w:tcPr>
           <w:p>
             <w:r>
@@ -2034,7 +2055,7 @@
         </w:tc>
         <w:tc>
           <w:tcPr>
-            <w:tcW w:w="2634" w:type="dxa"/>
+            <w:tcW w:w="2622" w:type="dxa"/>
           </w:tcPr>
           <w:p>
             <w:r>
@@ -2074,7 +2095,7 @@
         </w:tc>
         <w:tc>
           <w:tcPr>
-            <w:tcW w:w="2576" w:type="dxa"/>
+            <w:tcW w:w="2580" w:type="dxa"/>
           </w:tcPr>
           <w:p>
             <w:r>
@@ -2087,7 +2108,7 @@
         </w:tc>
         <w:tc>
           <w:tcPr>
-            <w:tcW w:w="2534" w:type="dxa"/>
+            <w:tcW w:w="2542" w:type="dxa"/>
           </w:tcPr>
           <w:p>
             <w:r>
@@ -2119,7 +2140,7 @@
         </w:tc>
         <w:tc>
           <w:tcPr>
-            <w:tcW w:w="2634" w:type="dxa"/>
+            <w:tcW w:w="2622" w:type="dxa"/>
           </w:tcPr>
           <w:p>
             <w:r>
@@ -2159,7 +2180,7 @@
         </w:tc>
         <w:tc>
           <w:tcPr>
-            <w:tcW w:w="2576" w:type="dxa"/>
+            <w:tcW w:w="2580" w:type="dxa"/>
           </w:tcPr>
           <w:p>
             <w:r>
@@ -2172,7 +2193,7 @@
         </w:tc>
         <w:tc>
           <w:tcPr>
-            <w:tcW w:w="2534" w:type="dxa"/>
+            <w:tcW w:w="2542" w:type="dxa"/>
           </w:tcPr>
           <w:p>
             <w:r>
@@ -2204,7 +2225,7 @@
         </w:tc>
         <w:tc>
           <w:tcPr>
-            <w:tcW w:w="2634" w:type="dxa"/>
+            <w:tcW w:w="2622" w:type="dxa"/>
           </w:tcPr>
           <w:p>
             <w:r>
@@ -2231,7 +2252,7 @@
         </w:tc>
         <w:tc>
           <w:tcPr>
-            <w:tcW w:w="2576" w:type="dxa"/>
+            <w:tcW w:w="2580" w:type="dxa"/>
           </w:tcPr>
           <w:p>
             <w:r>
@@ -2244,7 +2265,7 @@
         </w:tc>
         <w:tc>
           <w:tcPr>
-            <w:tcW w:w="2534" w:type="dxa"/>
+            <w:tcW w:w="2542" w:type="dxa"/>
           </w:tcPr>
           <w:p>
             <w:r>
@@ -2291,9 +2312,9 @@
         <w:tblLook w:val="04A0" w:firstRow="1" w:lastRow="0" w:firstColumn="1" w:lastColumn="0" w:noHBand="0" w:noVBand="1"/>
       </w:tblPr>
       <w:tblGrid>
-        <w:gridCol w:w="1699"/>
-        <w:gridCol w:w="4840"/>
-        <w:gridCol w:w="2821"/>
+        <w:gridCol w:w="1728"/>
+        <w:gridCol w:w="4798"/>
+        <w:gridCol w:w="2834"/>
       </w:tblGrid>
       <w:tr>
         <w:trPr>
@@ -2302,10 +2323,13 @@
         </w:trPr>
         <w:tc>
           <w:tcPr>
-            <w:tcW w:w="1699" w:type="dxa"/>
+            <w:tcW w:w="1728" w:type="dxa"/>
             <w:shd w:val="clear" w:color="auto" w:fill="E8EEFB"/>
           </w:tcPr>
           <w:p>
+            <w:pPr>
+              <w:keepNext/>
+            </w:pPr>
             <w:r>
               <w:rPr>
                 <w:b/>
@@ -2317,10 +2341,13 @@
         </w:tc>
         <w:tc>
           <w:tcPr>
-            <w:tcW w:w="4840" w:type="dxa"/>
+            <w:tcW w:w="4798" w:type="dxa"/>
             <w:shd w:val="clear" w:color="auto" w:fill="E8EEFB"/>
           </w:tcPr>
           <w:p>
+            <w:pPr>
+              <w:keepNext/>
+            </w:pPr>
             <w:r>
               <w:rPr>
                 <w:b/>
@@ -2332,10 +2359,13 @@
         </w:tc>
         <w:tc>
           <w:tcPr>
-            <w:tcW w:w="2821" w:type="dxa"/>
+            <w:tcW w:w="2834" w:type="dxa"/>
             <w:shd w:val="clear" w:color="auto" w:fill="E8EEFB"/>
           </w:tcPr>
           <w:p>
+            <w:pPr>
+              <w:keepNext/>
+            </w:pPr>
             <w:r>
               <w:rPr>
                 <w:b/>
@@ -2349,7 +2379,7 @@
       <w:tr>
         <w:tc>
           <w:tcPr>
-            <w:tcW w:w="1699" w:type="dxa"/>
+            <w:tcW w:w="1728" w:type="dxa"/>
           </w:tcPr>
           <w:p>
             <w:r>
@@ -2363,7 +2393,7 @@
         </w:tc>
         <w:tc>
           <w:tcPr>
-            <w:tcW w:w="4840" w:type="dxa"/>
+            <w:tcW w:w="4798" w:type="dxa"/>
           </w:tcPr>
           <w:p>
             <w:r>
@@ -2402,7 +2432,7 @@
         </w:tc>
         <w:tc>
           <w:tcPr>
-            <w:tcW w:w="2821" w:type="dxa"/>
+            <w:tcW w:w="2834" w:type="dxa"/>
           </w:tcPr>
           <w:p>
             <w:r>
@@ -2420,7 +2450,7 @@
         </w:trPr>
         <w:tc>
           <w:tcPr>
-            <w:tcW w:w="1699" w:type="dxa"/>
+            <w:tcW w:w="1728" w:type="dxa"/>
           </w:tcPr>
           <w:p>
             <w:r>
@@ -2434,7 +2464,7 @@
         </w:tc>
         <w:tc>
           <w:tcPr>
-            <w:tcW w:w="4840" w:type="dxa"/>
+            <w:tcW w:w="4798" w:type="dxa"/>
           </w:tcPr>
           <w:p>
             <w:r>
@@ -2447,7 +2477,7 @@
         </w:tc>
         <w:tc>
           <w:tcPr>
-            <w:tcW w:w="2821" w:type="dxa"/>
+            <w:tcW w:w="2834" w:type="dxa"/>
           </w:tcPr>
           <w:p>
             <w:r>
@@ -2465,7 +2495,7 @@
         </w:trPr>
         <w:tc>
           <w:tcPr>
-            <w:tcW w:w="1699" w:type="dxa"/>
+            <w:tcW w:w="1728" w:type="dxa"/>
           </w:tcPr>
           <w:p>
             <w:r>
@@ -2479,7 +2509,7 @@
         </w:tc>
         <w:tc>
           <w:tcPr>
-            <w:tcW w:w="4840" w:type="dxa"/>
+            <w:tcW w:w="4798" w:type="dxa"/>
           </w:tcPr>
           <w:p>
             <w:r>
@@ -2492,7 +2522,7 @@
         </w:tc>
         <w:tc>
           <w:tcPr>
-            <w:tcW w:w="2821" w:type="dxa"/>
+            <w:tcW w:w="2834" w:type="dxa"/>
           </w:tcPr>
           <w:p>
             <w:r>
@@ -2510,7 +2540,7 @@
         </w:trPr>
         <w:tc>
           <w:tcPr>
-            <w:tcW w:w="1699" w:type="dxa"/>
+            <w:tcW w:w="1728" w:type="dxa"/>
           </w:tcPr>
           <w:p>
             <w:r>
@@ -2524,7 +2554,7 @@
         </w:tc>
         <w:tc>
           <w:tcPr>
-            <w:tcW w:w="4840" w:type="dxa"/>
+            <w:tcW w:w="4798" w:type="dxa"/>
           </w:tcPr>
           <w:p>
             <w:r>
@@ -2537,7 +2567,7 @@
         </w:tc>
         <w:tc>
           <w:tcPr>
-            <w:tcW w:w="2821" w:type="dxa"/>
+            <w:tcW w:w="2834" w:type="dxa"/>
           </w:tcPr>
           <w:p>
             <w:r>
@@ -2555,7 +2585,7 @@
         </w:trPr>
         <w:tc>
           <w:tcPr>
-            <w:tcW w:w="1699" w:type="dxa"/>
+            <w:tcW w:w="1728" w:type="dxa"/>
           </w:tcPr>
           <w:p>
             <w:r>
@@ -2569,7 +2599,7 @@
         </w:tc>
         <w:tc>
           <w:tcPr>
-            <w:tcW w:w="4840" w:type="dxa"/>
+            <w:tcW w:w="4798" w:type="dxa"/>
           </w:tcPr>
           <w:p>
             <w:r>
@@ -2582,7 +2612,7 @@
         </w:tc>
         <w:tc>
           <w:tcPr>
-            <w:tcW w:w="2821" w:type="dxa"/>
+            <w:tcW w:w="2834" w:type="dxa"/>
           </w:tcPr>
           <w:p>
             <w:r>
@@ -2600,7 +2630,7 @@
         </w:trPr>
         <w:tc>
           <w:tcPr>
-            <w:tcW w:w="1699" w:type="dxa"/>
+            <w:tcW w:w="1728" w:type="dxa"/>
           </w:tcPr>
           <w:p>
             <w:r>
@@ -2614,7 +2644,7 @@
         </w:tc>
         <w:tc>
           <w:tcPr>
-            <w:tcW w:w="4840" w:type="dxa"/>
+            <w:tcW w:w="4798" w:type="dxa"/>
           </w:tcPr>
           <w:p>
             <w:r>
@@ -2627,7 +2657,7 @@
         </w:tc>
         <w:tc>
           <w:tcPr>
-            <w:tcW w:w="2821" w:type="dxa"/>
+            <w:tcW w:w="2834" w:type="dxa"/>
           </w:tcPr>
           <w:p>
             <w:r>
@@ -2645,7 +2675,7 @@
         </w:trPr>
         <w:tc>
           <w:tcPr>
-            <w:tcW w:w="1699" w:type="dxa"/>
+            <w:tcW w:w="1728" w:type="dxa"/>
           </w:tcPr>
           <w:p>
             <w:r>
@@ -2659,7 +2689,7 @@
         </w:tc>
         <w:tc>
           <w:tcPr>
-            <w:tcW w:w="4840" w:type="dxa"/>
+            <w:tcW w:w="4798" w:type="dxa"/>
           </w:tcPr>
           <w:p>
             <w:r>
@@ -2698,7 +2728,7 @@
         </w:tc>
         <w:tc>
           <w:tcPr>
-            <w:tcW w:w="2821" w:type="dxa"/>
+            <w:tcW w:w="2834" w:type="dxa"/>
           </w:tcPr>
           <w:p>
             <w:r>
@@ -2716,7 +2746,7 @@
         </w:trPr>
         <w:tc>
           <w:tcPr>
-            <w:tcW w:w="1699" w:type="dxa"/>
+            <w:tcW w:w="1728" w:type="dxa"/>
           </w:tcPr>
           <w:p>
             <w:r>
@@ -2730,7 +2760,7 @@
         </w:tc>
         <w:tc>
           <w:tcPr>
-            <w:tcW w:w="4840" w:type="dxa"/>
+            <w:tcW w:w="4798" w:type="dxa"/>
           </w:tcPr>
           <w:p>
             <w:r>
@@ -2743,7 +2773,7 @@
         </w:tc>
         <w:tc>
           <w:tcPr>
-            <w:tcW w:w="2821" w:type="dxa"/>
+            <w:tcW w:w="2834" w:type="dxa"/>
           </w:tcPr>
           <w:p>
             <w:r>
@@ -2758,7 +2788,7 @@
       <w:tr>
         <w:tc>
           <w:tcPr>
-            <w:tcW w:w="1699" w:type="dxa"/>
+            <w:tcW w:w="1728" w:type="dxa"/>
           </w:tcPr>
           <w:p>
             <w:r>
@@ -2785,7 +2815,7 @@
         </w:tc>
         <w:tc>
           <w:tcPr>
-            <w:tcW w:w="4840" w:type="dxa"/>
+            <w:tcW w:w="4798" w:type="dxa"/>
           </w:tcPr>
           <w:p>
             <w:r>
@@ -2831,7 +2861,7 @@
         </w:tc>
         <w:tc>
           <w:tcPr>
-            <w:tcW w:w="2821" w:type="dxa"/>
+            <w:tcW w:w="2834" w:type="dxa"/>
           </w:tcPr>
           <w:p>
             <w:r>
@@ -2849,7 +2879,7 @@
         </w:trPr>
         <w:tc>
           <w:tcPr>
-            <w:tcW w:w="1699" w:type="dxa"/>
+            <w:tcW w:w="1728" w:type="dxa"/>
           </w:tcPr>
           <w:p>
             <w:r>
@@ -2863,7 +2893,7 @@
         </w:tc>
         <w:tc>
           <w:tcPr>
-            <w:tcW w:w="4840" w:type="dxa"/>
+            <w:tcW w:w="4798" w:type="dxa"/>
           </w:tcPr>
           <w:p>
             <w:r>
@@ -2980,7 +3010,7 @@
         </w:tc>
         <w:tc>
           <w:tcPr>
-            <w:tcW w:w="2821" w:type="dxa"/>
+            <w:tcW w:w="2834" w:type="dxa"/>
           </w:tcPr>
           <w:p>
             <w:r>
@@ -2998,7 +3028,7 @@
         </w:trPr>
         <w:tc>
           <w:tcPr>
-            <w:tcW w:w="1699" w:type="dxa"/>
+            <w:tcW w:w="1728" w:type="dxa"/>
           </w:tcPr>
           <w:p>
             <w:r>
@@ -3012,7 +3042,7 @@
         </w:tc>
         <w:tc>
           <w:tcPr>
-            <w:tcW w:w="4840" w:type="dxa"/>
+            <w:tcW w:w="4798" w:type="dxa"/>
           </w:tcPr>
           <w:p>
             <w:r>
@@ -3025,7 +3055,7 @@
         </w:tc>
         <w:tc>
           <w:tcPr>
-            <w:tcW w:w="2821" w:type="dxa"/>
+            <w:tcW w:w="2834" w:type="dxa"/>
           </w:tcPr>
           <w:p>
             <w:r>
@@ -3043,7 +3073,7 @@
         </w:trPr>
         <w:tc>
           <w:tcPr>
-            <w:tcW w:w="1699" w:type="dxa"/>
+            <w:tcW w:w="1728" w:type="dxa"/>
           </w:tcPr>
           <w:p>
             <w:r>
@@ -3057,7 +3087,7 @@
         </w:tc>
         <w:tc>
           <w:tcPr>
-            <w:tcW w:w="4840" w:type="dxa"/>
+            <w:tcW w:w="4798" w:type="dxa"/>
           </w:tcPr>
           <w:p>
             <w:r>
@@ -3070,7 +3100,7 @@
         </w:tc>
         <w:tc>
           <w:tcPr>
-            <w:tcW w:w="2821" w:type="dxa"/>
+            <w:tcW w:w="2834" w:type="dxa"/>
           </w:tcPr>
           <w:p>
             <w:r>
@@ -3085,7 +3115,7 @@
       <w:tr>
         <w:tc>
           <w:tcPr>
-            <w:tcW w:w="1699" w:type="dxa"/>
+            <w:tcW w:w="1728" w:type="dxa"/>
           </w:tcPr>
           <w:p>
             <w:r>
@@ -3099,7 +3129,7 @@
         </w:tc>
         <w:tc>
           <w:tcPr>
-            <w:tcW w:w="4840" w:type="dxa"/>
+            <w:tcW w:w="4798" w:type="dxa"/>
           </w:tcPr>
           <w:p>
             <w:r>
@@ -3145,7 +3175,7 @@
         </w:tc>
         <w:tc>
           <w:tcPr>
-            <w:tcW w:w="2821" w:type="dxa"/>
+            <w:tcW w:w="2834" w:type="dxa"/>
           </w:tcPr>
           <w:p>
             <w:r>
@@ -3163,7 +3193,7 @@
         </w:trPr>
         <w:tc>
           <w:tcPr>
-            <w:tcW w:w="1699" w:type="dxa"/>
+            <w:tcW w:w="1728" w:type="dxa"/>
           </w:tcPr>
           <w:p>
             <w:r>
@@ -3177,7 +3207,7 @@
         </w:tc>
         <w:tc>
           <w:tcPr>
-            <w:tcW w:w="4840" w:type="dxa"/>
+            <w:tcW w:w="4798" w:type="dxa"/>
           </w:tcPr>
           <w:p>
             <w:r>
@@ -3190,7 +3220,7 @@
         </w:tc>
         <w:tc>
           <w:tcPr>
-            <w:tcW w:w="2821" w:type="dxa"/>
+            <w:tcW w:w="2834" w:type="dxa"/>
           </w:tcPr>
           <w:p>
             <w:r>
@@ -3205,7 +3235,7 @@
       <w:tr>
         <w:tc>
           <w:tcPr>
-            <w:tcW w:w="1699" w:type="dxa"/>
+            <w:tcW w:w="1728" w:type="dxa"/>
           </w:tcPr>
           <w:p>
             <w:r>
@@ -3258,7 +3288,7 @@
         </w:tc>
         <w:tc>
           <w:tcPr>
-            <w:tcW w:w="4840" w:type="dxa"/>
+            <w:tcW w:w="4798" w:type="dxa"/>
           </w:tcPr>
           <w:p>
             <w:r>
@@ -3271,7 +3301,7 @@
         </w:tc>
         <w:tc>
           <w:tcPr>
-            <w:tcW w:w="2821" w:type="dxa"/>
+            <w:tcW w:w="2834" w:type="dxa"/>
           </w:tcPr>
           <w:p>
             <w:r>
@@ -3286,7 +3316,7 @@
       <w:tr>
         <w:tc>
           <w:tcPr>
-            <w:tcW w:w="1699" w:type="dxa"/>
+            <w:tcW w:w="1728" w:type="dxa"/>
           </w:tcPr>
           <w:p>
             <w:r>
@@ -3326,7 +3356,7 @@
         </w:tc>
         <w:tc>
           <w:tcPr>
-            <w:tcW w:w="4840" w:type="dxa"/>
+            <w:tcW w:w="4798" w:type="dxa"/>
           </w:tcPr>
           <w:p>
             <w:r>
@@ -3339,7 +3369,7 @@
         </w:tc>
         <w:tc>
           <w:tcPr>
-            <w:tcW w:w="2821" w:type="dxa"/>
+            <w:tcW w:w="2834" w:type="dxa"/>
           </w:tcPr>
           <w:p>
             <w:r>
@@ -3357,7 +3387,7 @@
         </w:trPr>
         <w:tc>
           <w:tcPr>
-            <w:tcW w:w="1699" w:type="dxa"/>
+            <w:tcW w:w="1728" w:type="dxa"/>
           </w:tcPr>
           <w:p>
             <w:r>
@@ -3371,7 +3401,7 @@
         </w:tc>
         <w:tc>
           <w:tcPr>
-            <w:tcW w:w="4840" w:type="dxa"/>
+            <w:tcW w:w="4798" w:type="dxa"/>
           </w:tcPr>
           <w:p>
             <w:r>
@@ -3449,7 +3479,7 @@
         </w:tc>
         <w:tc>
           <w:tcPr>
-            <w:tcW w:w="2821" w:type="dxa"/>
+            <w:tcW w:w="2834" w:type="dxa"/>
           </w:tcPr>
           <w:p>
             <w:r>
@@ -3467,7 +3497,7 @@
         </w:trPr>
         <w:tc>
           <w:tcPr>
-            <w:tcW w:w="1699" w:type="dxa"/>
+            <w:tcW w:w="1728" w:type="dxa"/>
           </w:tcPr>
           <w:p>
             <w:r>
@@ -3481,7 +3511,7 @@
         </w:tc>
         <w:tc>
           <w:tcPr>
-            <w:tcW w:w="4840" w:type="dxa"/>
+            <w:tcW w:w="4798" w:type="dxa"/>
           </w:tcPr>
           <w:p>
             <w:r>
@@ -3546,7 +3576,7 @@
         </w:tc>
         <w:tc>
           <w:tcPr>
-            <w:tcW w:w="2821" w:type="dxa"/>
+            <w:tcW w:w="2834" w:type="dxa"/>
           </w:tcPr>
           <w:p>
             <w:r>
@@ -3564,7 +3594,7 @@
         </w:trPr>
         <w:tc>
           <w:tcPr>
-            <w:tcW w:w="1699" w:type="dxa"/>
+            <w:tcW w:w="1728" w:type="dxa"/>
           </w:tcPr>
           <w:p>
             <w:r>
@@ -3578,7 +3608,7 @@
         </w:tc>
         <w:tc>
           <w:tcPr>
-            <w:tcW w:w="4840" w:type="dxa"/>
+            <w:tcW w:w="4798" w:type="dxa"/>
           </w:tcPr>
           <w:p>
             <w:r>
@@ -3604,7 +3634,7 @@
         </w:tc>
         <w:tc>
           <w:tcPr>
-            <w:tcW w:w="2821" w:type="dxa"/>
+            <w:tcW w:w="2834" w:type="dxa"/>
           </w:tcPr>
           <w:p>
             <w:r>
@@ -3619,7 +3649,7 @@
       <w:tr>
         <w:tc>
           <w:tcPr>
-            <w:tcW w:w="1699" w:type="dxa"/>
+            <w:tcW w:w="1728" w:type="dxa"/>
           </w:tcPr>
           <w:p>
             <w:r>
@@ -3633,7 +3663,7 @@
         </w:tc>
         <w:tc>
           <w:tcPr>
-            <w:tcW w:w="4840" w:type="dxa"/>
+            <w:tcW w:w="4798" w:type="dxa"/>
           </w:tcPr>
           <w:p>
             <w:r>
@@ -3724,7 +3754,7 @@
         </w:tc>
         <w:tc>
           <w:tcPr>
-            <w:tcW w:w="2821" w:type="dxa"/>
+            <w:tcW w:w="2834" w:type="dxa"/>
           </w:tcPr>
           <w:p>
             <w:r>
@@ -3739,7 +3769,7 @@
       <w:tr>
         <w:tc>
           <w:tcPr>
-            <w:tcW w:w="1699" w:type="dxa"/>
+            <w:tcW w:w="1728" w:type="dxa"/>
           </w:tcPr>
           <w:p>
             <w:r>
@@ -3753,7 +3783,7 @@
         </w:tc>
         <w:tc>
           <w:tcPr>
-            <w:tcW w:w="4840" w:type="dxa"/>
+            <w:tcW w:w="4798" w:type="dxa"/>
           </w:tcPr>
           <w:p>
             <w:r>
@@ -3785,7 +3815,7 @@
         </w:tc>
         <w:tc>
           <w:tcPr>
-            <w:tcW w:w="2821" w:type="dxa"/>
+            <w:tcW w:w="2834" w:type="dxa"/>
           </w:tcPr>
           <w:p>
             <w:r>
@@ -4055,8 +4085,8 @@
       </w:tblPr>
       <w:tblGrid>
         <w:gridCol w:w="1400"/>
-        <w:gridCol w:w="4138"/>
-        <w:gridCol w:w="3821"/>
+        <w:gridCol w:w="4124"/>
+        <w:gridCol w:w="3836"/>
       </w:tblGrid>
       <w:tr>
         <w:trPr>
@@ -4069,6 +4099,9 @@
             <w:shd w:val="clear" w:color="auto" w:fill="E8EEFB"/>
           </w:tcPr>
           <w:p>
+            <w:pPr>
+              <w:keepNext/>
+            </w:pPr>
             <w:r>
               <w:rPr>
                 <w:b/>
@@ -4080,10 +4113,13 @@
         </w:tc>
         <w:tc>
           <w:tcPr>
-            <w:tcW w:w="4138" w:type="dxa"/>
+            <w:tcW w:w="4124" w:type="dxa"/>
             <w:shd w:val="clear" w:color="auto" w:fill="E8EEFB"/>
           </w:tcPr>
           <w:p>
+            <w:pPr>
+              <w:keepNext/>
+            </w:pPr>
             <w:r>
               <w:rPr>
                 <w:b/>
@@ -4095,10 +4131,13 @@
         </w:tc>
         <w:tc>
           <w:tcPr>
-            <w:tcW w:w="3821" w:type="dxa"/>
+            <w:tcW w:w="3836" w:type="dxa"/>
             <w:shd w:val="clear" w:color="auto" w:fill="E8EEFB"/>
           </w:tcPr>
           <w:p>
+            <w:pPr>
+              <w:keepNext/>
+            </w:pPr>
             <w:r>
               <w:rPr>
                 <w:b/>
@@ -4135,7 +4174,7 @@
         </w:tc>
         <w:tc>
           <w:tcPr>
-            <w:tcW w:w="4138" w:type="dxa"/>
+            <w:tcW w:w="4124" w:type="dxa"/>
           </w:tcPr>
           <w:p>
             <w:r>
@@ -4155,7 +4194,7 @@
         </w:tc>
         <w:tc>
           <w:tcPr>
-            <w:tcW w:w="3821" w:type="dxa"/>
+            <w:tcW w:w="3836" w:type="dxa"/>
           </w:tcPr>
           <w:p>
             <w:r>
@@ -4187,7 +4226,7 @@
         </w:tc>
         <w:tc>
           <w:tcPr>
-            <w:tcW w:w="4138" w:type="dxa"/>
+            <w:tcW w:w="4124" w:type="dxa"/>
           </w:tcPr>
           <w:p>
             <w:r>
@@ -4220,7 +4259,7 @@
         </w:tc>
         <w:tc>
           <w:tcPr>
-            <w:tcW w:w="3821" w:type="dxa"/>
+            <w:tcW w:w="3836" w:type="dxa"/>
           </w:tcPr>
           <w:p>
             <w:r>
@@ -4259,7 +4298,7 @@
         </w:tc>
         <w:tc>
           <w:tcPr>
-            <w:tcW w:w="4138" w:type="dxa"/>
+            <w:tcW w:w="4124" w:type="dxa"/>
           </w:tcPr>
           <w:p>
             <w:r>
@@ -4279,7 +4318,7 @@
         </w:tc>
         <w:tc>
           <w:tcPr>
-            <w:tcW w:w="3821" w:type="dxa"/>
+            <w:tcW w:w="3836" w:type="dxa"/>
           </w:tcPr>
           <w:p>
             <w:r>
@@ -4317,7 +4356,7 @@
         </w:tc>
         <w:tc>
           <w:tcPr>
-            <w:tcW w:w="4138" w:type="dxa"/>
+            <w:tcW w:w="4124" w:type="dxa"/>
           </w:tcPr>
           <w:p>
             <w:r>
@@ -4330,7 +4369,7 @@
         </w:tc>
         <w:tc>
           <w:tcPr>
-            <w:tcW w:w="3821" w:type="dxa"/>
+            <w:tcW w:w="3836" w:type="dxa"/>
           </w:tcPr>
           <w:p>
             <w:r>
@@ -4482,8 +4521,8 @@
         <w:tblLook w:val="04A0" w:firstRow="1" w:lastRow="0" w:firstColumn="1" w:lastColumn="0" w:noHBand="0" w:noVBand="1"/>
       </w:tblPr>
       <w:tblGrid>
-        <w:gridCol w:w="2806"/>
-        <w:gridCol w:w="4538"/>
+        <w:gridCol w:w="2827"/>
+        <w:gridCol w:w="4517"/>
         <w:gridCol w:w="2016"/>
       </w:tblGrid>
       <w:tr>
@@ -4493,10 +4532,13 @@
         </w:trPr>
         <w:tc>
           <w:tcPr>
-            <w:tcW w:w="2806" w:type="dxa"/>
+            <w:tcW w:w="2827" w:type="dxa"/>
             <w:shd w:val="clear" w:color="auto" w:fill="E8EEFB"/>
           </w:tcPr>
           <w:p>
+            <w:pPr>
+              <w:keepNext/>
+            </w:pPr>
             <w:r>
               <w:rPr>
                 <w:b/>
@@ -4508,10 +4550,13 @@
         </w:tc>
         <w:tc>
           <w:tcPr>
-            <w:tcW w:w="4538" w:type="dxa"/>
+            <w:tcW w:w="4517" w:type="dxa"/>
             <w:shd w:val="clear" w:color="auto" w:fill="E8EEFB"/>
           </w:tcPr>
           <w:p>
+            <w:pPr>
+              <w:keepNext/>
+            </w:pPr>
             <w:r>
               <w:rPr>
                 <w:b/>
@@ -4526,7 +4571,11 @@
             <w:tcW w:w="2016" w:type="dxa"/>
             <w:shd w:val="clear" w:color="auto" w:fill="E8EEFB"/>
           </w:tcPr>
-          <w:p/>
+          <w:p>
+            <w:pPr>
+              <w:keepNext/>
+            </w:pPr>
+          </w:p>
         </w:tc>
       </w:tr>
       <w:tr>
@@ -4535,7 +4584,7 @@
         </w:trPr>
         <w:tc>
           <w:tcPr>
-            <w:tcW w:w="2806" w:type="dxa"/>
+            <w:tcW w:w="2827" w:type="dxa"/>
           </w:tcPr>
           <w:p>
             <w:r>
@@ -4548,7 +4597,7 @@
         </w:tc>
         <w:tc>
           <w:tcPr>
-            <w:tcW w:w="4538" w:type="dxa"/>
+            <w:tcW w:w="4517" w:type="dxa"/>
           </w:tcPr>
           <w:p>
             <w:r>
@@ -4605,7 +4654,7 @@
         </w:trPr>
         <w:tc>
           <w:tcPr>
-            <w:tcW w:w="2806" w:type="dxa"/>
+            <w:tcW w:w="2827" w:type="dxa"/>
           </w:tcPr>
           <w:p>
             <w:r>
@@ -4618,7 +4667,7 @@
         </w:tc>
         <w:tc>
           <w:tcPr>
-            <w:tcW w:w="4538" w:type="dxa"/>
+            <w:tcW w:w="4517" w:type="dxa"/>
           </w:tcPr>
           <w:p>
             <w:r>
@@ -4682,7 +4731,7 @@
         </w:trPr>
         <w:tc>
           <w:tcPr>
-            <w:tcW w:w="2806" w:type="dxa"/>
+            <w:tcW w:w="2827" w:type="dxa"/>
           </w:tcPr>
           <w:p>
             <w:r>
@@ -4695,7 +4744,7 @@
         </w:tc>
         <w:tc>
           <w:tcPr>
-            <w:tcW w:w="4538" w:type="dxa"/>
+            <w:tcW w:w="4517" w:type="dxa"/>
           </w:tcPr>
           <w:p>
             <w:r>
@@ -4746,7 +4795,7 @@
         </w:trPr>
         <w:tc>
           <w:tcPr>
-            <w:tcW w:w="2806" w:type="dxa"/>
+            <w:tcW w:w="2827" w:type="dxa"/>
           </w:tcPr>
           <w:p>
             <w:r>
@@ -4759,7 +4808,7 @@
         </w:tc>
         <w:tc>
           <w:tcPr>
-            <w:tcW w:w="4538" w:type="dxa"/>
+            <w:tcW w:w="4517" w:type="dxa"/>
           </w:tcPr>
           <w:p>
             <w:r>
@@ -4823,7 +4872,7 @@
         </w:trPr>
         <w:tc>
           <w:tcPr>
-            <w:tcW w:w="2806" w:type="dxa"/>
+            <w:tcW w:w="2827" w:type="dxa"/>
           </w:tcPr>
           <w:p>
             <w:r>
@@ -4836,7 +4885,7 @@
         </w:tc>
         <w:tc>
           <w:tcPr>
-            <w:tcW w:w="4538" w:type="dxa"/>
+            <w:tcW w:w="4517" w:type="dxa"/>
           </w:tcPr>
           <w:p>
             <w:r>
@@ -4919,7 +4968,7 @@
         </w:trPr>
         <w:tc>
           <w:tcPr>
-            <w:tcW w:w="2806" w:type="dxa"/>
+            <w:tcW w:w="2827" w:type="dxa"/>
           </w:tcPr>
           <w:p>
             <w:r>
@@ -4932,7 +4981,7 @@
         </w:tc>
         <w:tc>
           <w:tcPr>
-            <w:tcW w:w="4538" w:type="dxa"/>
+            <w:tcW w:w="4517" w:type="dxa"/>
           </w:tcPr>
           <w:p>
             <w:r>
@@ -5032,7 +5081,7 @@
       <w:tr>
         <w:tc>
           <w:tcPr>
-            <w:tcW w:w="2806" w:type="dxa"/>
+            <w:tcW w:w="2827" w:type="dxa"/>
           </w:tcPr>
           <w:p>
             <w:r>
@@ -5045,7 +5094,7 @@
         </w:tc>
         <w:tc>
           <w:tcPr>
-            <w:tcW w:w="4538" w:type="dxa"/>
+            <w:tcW w:w="4517" w:type="dxa"/>
           </w:tcPr>
           <w:p>
             <w:r>
@@ -5161,7 +5210,7 @@
         </w:trPr>
         <w:tc>
           <w:tcPr>
-            <w:tcW w:w="2806" w:type="dxa"/>
+            <w:tcW w:w="2827" w:type="dxa"/>
           </w:tcPr>
           <w:p>
             <w:r>
@@ -5174,7 +5223,7 @@
         </w:tc>
         <w:tc>
           <w:tcPr>
-            <w:tcW w:w="4538" w:type="dxa"/>
+            <w:tcW w:w="4517" w:type="dxa"/>
           </w:tcPr>
           <w:p>
             <w:r>
@@ -5218,7 +5267,7 @@
         </w:trPr>
         <w:tc>
           <w:tcPr>
-            <w:tcW w:w="2806" w:type="dxa"/>
+            <w:tcW w:w="2827" w:type="dxa"/>
           </w:tcPr>
           <w:p>
             <w:r>
@@ -5231,7 +5280,7 @@
         </w:tc>
         <w:tc>
           <w:tcPr>
-            <w:tcW w:w="4538" w:type="dxa"/>
+            <w:tcW w:w="4517" w:type="dxa"/>
           </w:tcPr>
           <w:p>
             <w:r>
@@ -5314,7 +5363,7 @@
         </w:trPr>
         <w:tc>
           <w:tcPr>
-            <w:tcW w:w="2806" w:type="dxa"/>
+            <w:tcW w:w="2827" w:type="dxa"/>
           </w:tcPr>
           <w:p>
             <w:r>
@@ -5327,7 +5376,7 @@
         </w:tc>
         <w:tc>
           <w:tcPr>
-            <w:tcW w:w="4538" w:type="dxa"/>
+            <w:tcW w:w="4517" w:type="dxa"/>
           </w:tcPr>
           <w:p>
             <w:r>
@@ -5852,10 +5901,10 @@
         <w:tblLook w:val="04A0" w:firstRow="1" w:lastRow="0" w:firstColumn="1" w:lastColumn="0" w:noHBand="0" w:noVBand="1"/>
       </w:tblPr>
       <w:tblGrid>
-        <w:gridCol w:w="5217"/>
-        <w:gridCol w:w="1783"/>
-        <w:gridCol w:w="1491"/>
-        <w:gridCol w:w="870"/>
+        <w:gridCol w:w="5200"/>
+        <w:gridCol w:w="1807"/>
+        <w:gridCol w:w="1486"/>
+        <w:gridCol w:w="867"/>
       </w:tblGrid>
       <w:tr>
         <w:trPr>
@@ -5864,10 +5913,13 @@
         </w:trPr>
         <w:tc>
           <w:tcPr>
-            <w:tcW w:w="5217" w:type="dxa"/>
+            <w:tcW w:w="5200" w:type="dxa"/>
             <w:shd w:val="clear" w:color="auto" w:fill="E8EEFB"/>
           </w:tcPr>
           <w:p>
+            <w:pPr>
+              <w:keepNext/>
+            </w:pPr>
             <w:r>
               <w:rPr>
                 <w:b/>
@@ -5879,10 +5931,13 @@
         </w:tc>
         <w:tc>
           <w:tcPr>
-            <w:tcW w:w="1783" w:type="dxa"/>
+            <w:tcW w:w="1807" w:type="dxa"/>
             <w:shd w:val="clear" w:color="auto" w:fill="E8EEFB"/>
           </w:tcPr>
           <w:p>
+            <w:pPr>
+              <w:keepNext/>
+            </w:pPr>
             <w:r>
               <w:rPr>
                 <w:b/>
@@ -5894,10 +5949,13 @@
         </w:tc>
         <w:tc>
           <w:tcPr>
-            <w:tcW w:w="1491" w:type="dxa"/>
+            <w:tcW w:w="1486" w:type="dxa"/>
             <w:shd w:val="clear" w:color="auto" w:fill="E8EEFB"/>
           </w:tcPr>
           <w:p>
+            <w:pPr>
+              <w:keepNext/>
+            </w:pPr>
             <w:r>
               <w:rPr>
                 <w:b/>
@@ -5909,10 +5967,13 @@
         </w:tc>
         <w:tc>
           <w:tcPr>
-            <w:tcW w:w="870" w:type="dxa"/>
+            <w:tcW w:w="867" w:type="dxa"/>
             <w:shd w:val="clear" w:color="auto" w:fill="E8EEFB"/>
           </w:tcPr>
           <w:p>
+            <w:pPr>
+              <w:keepNext/>
+            </w:pPr>
             <w:r>
               <w:rPr>
                 <w:b/>
@@ -5929,7 +5990,7 @@
         </w:trPr>
         <w:tc>
           <w:tcPr>
-            <w:tcW w:w="5217" w:type="dxa"/>
+            <w:tcW w:w="5200" w:type="dxa"/>
           </w:tcPr>
           <w:p>
             <w:r>
@@ -5942,7 +6003,7 @@
         </w:tc>
         <w:tc>
           <w:tcPr>
-            <w:tcW w:w="1783" w:type="dxa"/>
+            <w:tcW w:w="1807" w:type="dxa"/>
           </w:tcPr>
           <w:p>
             <w:r>
@@ -5955,7 +6016,7 @@
         </w:tc>
         <w:tc>
           <w:tcPr>
-            <w:tcW w:w="1491" w:type="dxa"/>
+            <w:tcW w:w="1486" w:type="dxa"/>
           </w:tcPr>
           <w:p>
             <w:r>
@@ -5968,7 +6029,7 @@
         </w:tc>
         <w:tc>
           <w:tcPr>
-            <w:tcW w:w="870" w:type="dxa"/>
+            <w:tcW w:w="867" w:type="dxa"/>
           </w:tcPr>
           <w:p>
             <w:r>
@@ -5986,7 +6047,7 @@
         </w:trPr>
         <w:tc>
           <w:tcPr>
-            <w:tcW w:w="5217" w:type="dxa"/>
+            <w:tcW w:w="5200" w:type="dxa"/>
           </w:tcPr>
           <w:p>
             <w:r>
@@ -5999,7 +6060,7 @@
         </w:tc>
         <w:tc>
           <w:tcPr>
-            <w:tcW w:w="1783" w:type="dxa"/>
+            <w:tcW w:w="1807" w:type="dxa"/>
           </w:tcPr>
           <w:p>
             <w:r>
@@ -6012,7 +6073,7 @@
         </w:tc>
         <w:tc>
           <w:tcPr>
-            <w:tcW w:w="1491" w:type="dxa"/>
+            <w:tcW w:w="1486" w:type="dxa"/>
           </w:tcPr>
           <w:p>
             <w:r>
@@ -6025,7 +6086,7 @@
         </w:tc>
         <w:tc>
           <w:tcPr>
-            <w:tcW w:w="870" w:type="dxa"/>
+            <w:tcW w:w="867" w:type="dxa"/>
           </w:tcPr>
           <w:p>
             <w:r>
@@ -6043,7 +6104,7 @@
         </w:trPr>
         <w:tc>
           <w:tcPr>
-            <w:tcW w:w="5217" w:type="dxa"/>
+            <w:tcW w:w="5200" w:type="dxa"/>
           </w:tcPr>
           <w:p>
             <w:r>
@@ -6056,7 +6117,7 @@
         </w:tc>
         <w:tc>
           <w:tcPr>
-            <w:tcW w:w="1783" w:type="dxa"/>
+            <w:tcW w:w="1807" w:type="dxa"/>
           </w:tcPr>
           <w:p>
             <w:r>
@@ -6069,7 +6130,7 @@
         </w:tc>
         <w:tc>
           <w:tcPr>
-            <w:tcW w:w="1491" w:type="dxa"/>
+            <w:tcW w:w="1486" w:type="dxa"/>
           </w:tcPr>
           <w:p>
             <w:r>
@@ -6082,7 +6143,7 @@
         </w:tc>
         <w:tc>
           <w:tcPr>
-            <w:tcW w:w="870" w:type="dxa"/>
+            <w:tcW w:w="867" w:type="dxa"/>
           </w:tcPr>
           <w:p>
             <w:r>
@@ -6100,7 +6161,7 @@
         </w:trPr>
         <w:tc>
           <w:tcPr>
-            <w:tcW w:w="5217" w:type="dxa"/>
+            <w:tcW w:w="5200" w:type="dxa"/>
           </w:tcPr>
           <w:p>
             <w:r>
@@ -6125,7 +6186,7 @@
         </w:tc>
         <w:tc>
           <w:tcPr>
-            <w:tcW w:w="1783" w:type="dxa"/>
+            <w:tcW w:w="1807" w:type="dxa"/>
           </w:tcPr>
           <w:p>
             <w:r>
@@ -6138,7 +6199,7 @@
         </w:tc>
         <w:tc>
           <w:tcPr>
-            <w:tcW w:w="1491" w:type="dxa"/>
+            <w:tcW w:w="1486" w:type="dxa"/>
           </w:tcPr>
           <w:p>
             <w:r>
@@ -6151,7 +6212,7 @@
         </w:tc>
         <w:tc>
           <w:tcPr>
-            <w:tcW w:w="870" w:type="dxa"/>
+            <w:tcW w:w="867" w:type="dxa"/>
           </w:tcPr>
           <w:p>
             <w:r>
@@ -6169,7 +6230,7 @@
         </w:trPr>
         <w:tc>
           <w:tcPr>
-            <w:tcW w:w="5217" w:type="dxa"/>
+            <w:tcW w:w="5200" w:type="dxa"/>
           </w:tcPr>
           <w:p>
             <w:r>
@@ -6182,7 +6243,7 @@
         </w:tc>
         <w:tc>
           <w:tcPr>
-            <w:tcW w:w="1783" w:type="dxa"/>
+            <w:tcW w:w="1807" w:type="dxa"/>
           </w:tcPr>
           <w:p>
             <w:r>
@@ -6195,7 +6256,7 @@
         </w:tc>
         <w:tc>
           <w:tcPr>
-            <w:tcW w:w="1491" w:type="dxa"/>
+            <w:tcW w:w="1486" w:type="dxa"/>
           </w:tcPr>
           <w:p>
             <w:r>
@@ -6208,7 +6269,7 @@
         </w:tc>
         <w:tc>
           <w:tcPr>
-            <w:tcW w:w="870" w:type="dxa"/>
+            <w:tcW w:w="867" w:type="dxa"/>
           </w:tcPr>
           <w:p>
             <w:r>
@@ -6226,7 +6287,7 @@
         </w:trPr>
         <w:tc>
           <w:tcPr>
-            <w:tcW w:w="5217" w:type="dxa"/>
+            <w:tcW w:w="5200" w:type="dxa"/>
           </w:tcPr>
           <w:p>
             <w:r>
@@ -6239,7 +6300,7 @@
         </w:tc>
         <w:tc>
           <w:tcPr>
-            <w:tcW w:w="1783" w:type="dxa"/>
+            <w:tcW w:w="1807" w:type="dxa"/>
           </w:tcPr>
           <w:p>
             <w:r>
@@ -6252,7 +6313,7 @@
         </w:tc>
         <w:tc>
           <w:tcPr>
-            <w:tcW w:w="1491" w:type="dxa"/>
+            <w:tcW w:w="1486" w:type="dxa"/>
           </w:tcPr>
           <w:p>
             <w:r>
@@ -6265,7 +6326,7 @@
         </w:tc>
         <w:tc>
           <w:tcPr>
-            <w:tcW w:w="870" w:type="dxa"/>
+            <w:tcW w:w="867" w:type="dxa"/>
           </w:tcPr>
           <w:p>
             <w:r>
@@ -6283,7 +6344,7 @@
         </w:trPr>
         <w:tc>
           <w:tcPr>
-            <w:tcW w:w="5217" w:type="dxa"/>
+            <w:tcW w:w="5200" w:type="dxa"/>
           </w:tcPr>
           <w:p>
             <w:r>
@@ -6296,7 +6357,7 @@
         </w:tc>
         <w:tc>
           <w:tcPr>
-            <w:tcW w:w="1783" w:type="dxa"/>
+            <w:tcW w:w="1807" w:type="dxa"/>
           </w:tcPr>
           <w:p>
             <w:r>
@@ -6309,7 +6370,7 @@
         </w:tc>
         <w:tc>
           <w:tcPr>
-            <w:tcW w:w="1491" w:type="dxa"/>
+            <w:tcW w:w="1486" w:type="dxa"/>
           </w:tcPr>
           <w:p>
             <w:r>
@@ -6322,7 +6383,7 @@
         </w:tc>
         <w:tc>
           <w:tcPr>
-            <w:tcW w:w="870" w:type="dxa"/>
+            <w:tcW w:w="867" w:type="dxa"/>
           </w:tcPr>
           <w:p>
             <w:r>
@@ -6340,7 +6401,7 @@
         </w:trPr>
         <w:tc>
           <w:tcPr>
-            <w:tcW w:w="5217" w:type="dxa"/>
+            <w:tcW w:w="5200" w:type="dxa"/>
           </w:tcPr>
           <w:p>
             <w:r>
@@ -6353,7 +6414,7 @@
         </w:tc>
         <w:tc>
           <w:tcPr>
-            <w:tcW w:w="1783" w:type="dxa"/>
+            <w:tcW w:w="1807" w:type="dxa"/>
           </w:tcPr>
           <w:p>
             <w:r>
@@ -6366,7 +6427,7 @@
         </w:tc>
         <w:tc>
           <w:tcPr>
-            <w:tcW w:w="1491" w:type="dxa"/>
+            <w:tcW w:w="1486" w:type="dxa"/>
           </w:tcPr>
           <w:p>
             <w:r>
@@ -6379,7 +6440,7 @@
         </w:tc>
         <w:tc>
           <w:tcPr>
-            <w:tcW w:w="870" w:type="dxa"/>
+            <w:tcW w:w="867" w:type="dxa"/>
           </w:tcPr>
           <w:p>
             <w:r>
@@ -8781,10 +8842,10 @@
         <w:tblLook w:val="04A0" w:firstRow="1" w:lastRow="0" w:firstColumn="1" w:lastColumn="0" w:noHBand="0" w:noVBand="1"/>
       </w:tblPr>
       <w:tblGrid>
-        <w:gridCol w:w="2537"/>
-        <w:gridCol w:w="1683"/>
-        <w:gridCol w:w="2472"/>
-        <w:gridCol w:w="2668"/>
+        <w:gridCol w:w="2524"/>
+        <w:gridCol w:w="1700"/>
+        <w:gridCol w:w="2470"/>
+        <w:gridCol w:w="2666"/>
       </w:tblGrid>
       <w:tr>
         <w:trPr>
@@ -8793,10 +8854,13 @@
         </w:trPr>
         <w:tc>
           <w:tcPr>
-            <w:tcW w:w="2537" w:type="dxa"/>
+            <w:tcW w:w="2524" w:type="dxa"/>
             <w:shd w:val="clear" w:color="auto" w:fill="E8EEFB"/>
           </w:tcPr>
           <w:p>
+            <w:pPr>
+              <w:keepNext/>
+            </w:pPr>
             <w:r>
               <w:rPr>
                 <w:b/>
@@ -8808,10 +8872,13 @@
         </w:tc>
         <w:tc>
           <w:tcPr>
-            <w:tcW w:w="1683" w:type="dxa"/>
+            <w:tcW w:w="1700" w:type="dxa"/>
             <w:shd w:val="clear" w:color="auto" w:fill="E8EEFB"/>
           </w:tcPr>
           <w:p>
+            <w:pPr>
+              <w:keepNext/>
+            </w:pPr>
             <w:r>
               <w:rPr>
                 <w:b/>
@@ -8823,10 +8890,13 @@
         </w:tc>
         <w:tc>
           <w:tcPr>
-            <w:tcW w:w="2472" w:type="dxa"/>
+            <w:tcW w:w="2470" w:type="dxa"/>
             <w:shd w:val="clear" w:color="auto" w:fill="E8EEFB"/>
           </w:tcPr>
           <w:p>
+            <w:pPr>
+              <w:keepNext/>
+            </w:pPr>
             <w:r>
               <w:rPr>
                 <w:b/>
@@ -8838,10 +8908,13 @@
         </w:tc>
         <w:tc>
           <w:tcPr>
-            <w:tcW w:w="2668" w:type="dxa"/>
+            <w:tcW w:w="2666" w:type="dxa"/>
             <w:shd w:val="clear" w:color="auto" w:fill="E8EEFB"/>
           </w:tcPr>
           <w:p>
+            <w:pPr>
+              <w:keepNext/>
+            </w:pPr>
             <w:r>
               <w:rPr>
                 <w:b/>
@@ -8855,7 +8928,7 @@
       <w:tr>
         <w:tc>
           <w:tcPr>
-            <w:tcW w:w="2537" w:type="dxa"/>
+            <w:tcW w:w="2524" w:type="dxa"/>
           </w:tcPr>
           <w:p>
             <w:r>
@@ -8881,7 +8954,7 @@
         </w:tc>
         <w:tc>
           <w:tcPr>
-            <w:tcW w:w="1683" w:type="dxa"/>
+            <w:tcW w:w="1700" w:type="dxa"/>
           </w:tcPr>
           <w:p>
             <w:r>
@@ -8894,7 +8967,7 @@
         </w:tc>
         <w:tc>
           <w:tcPr>
-            <w:tcW w:w="2472" w:type="dxa"/>
+            <w:tcW w:w="2470" w:type="dxa"/>
           </w:tcPr>
           <w:p>
             <w:r>
@@ -8907,7 +8980,7 @@
         </w:tc>
         <w:tc>
           <w:tcPr>
-            <w:tcW w:w="2668" w:type="dxa"/>
+            <w:tcW w:w="2666" w:type="dxa"/>
           </w:tcPr>
           <w:p>
             <w:r>
@@ -8958,7 +9031,7 @@
         </w:trPr>
         <w:tc>
           <w:tcPr>
-            <w:tcW w:w="2537" w:type="dxa"/>
+            <w:tcW w:w="2524" w:type="dxa"/>
           </w:tcPr>
           <w:p>
             <w:r>
@@ -8984,7 +9057,7 @@
         </w:tc>
         <w:tc>
           <w:tcPr>
-            <w:tcW w:w="1683" w:type="dxa"/>
+            <w:tcW w:w="1700" w:type="dxa"/>
           </w:tcPr>
           <w:p>
             <w:r>
@@ -8997,7 +9070,7 @@
         </w:tc>
         <w:tc>
           <w:tcPr>
-            <w:tcW w:w="2472" w:type="dxa"/>
+            <w:tcW w:w="2470" w:type="dxa"/>
           </w:tcPr>
           <w:p>
             <w:r>
@@ -9010,7 +9083,7 @@
         </w:tc>
         <w:tc>
           <w:tcPr>
-            <w:tcW w:w="2668" w:type="dxa"/>
+            <w:tcW w:w="2666" w:type="dxa"/>
           </w:tcPr>
           <w:p>
             <w:r>
@@ -9028,7 +9101,7 @@
         </w:trPr>
         <w:tc>
           <w:tcPr>
-            <w:tcW w:w="2537" w:type="dxa"/>
+            <w:tcW w:w="2524" w:type="dxa"/>
           </w:tcPr>
           <w:p>
             <w:r>
@@ -9054,7 +9127,7 @@
         </w:tc>
         <w:tc>
           <w:tcPr>
-            <w:tcW w:w="1683" w:type="dxa"/>
+            <w:tcW w:w="1700" w:type="dxa"/>
           </w:tcPr>
           <w:p>
             <w:r>
@@ -9067,7 +9140,7 @@
         </w:tc>
         <w:tc>
           <w:tcPr>
-            <w:tcW w:w="2472" w:type="dxa"/>
+            <w:tcW w:w="2470" w:type="dxa"/>
           </w:tcPr>
           <w:p>
             <w:r>
@@ -9093,7 +9166,7 @@
         </w:tc>
         <w:tc>
           <w:tcPr>
-            <w:tcW w:w="2668" w:type="dxa"/>
+            <w:tcW w:w="2666" w:type="dxa"/>
           </w:tcPr>
           <w:p>
             <w:r>
@@ -9147,13 +9220,13 @@
         <w:tblLook w:val="04A0" w:firstRow="1" w:lastRow="0" w:firstColumn="1" w:lastColumn="0" w:noHBand="0" w:noVBand="1"/>
       </w:tblPr>
       <w:tblGrid>
-        <w:gridCol w:w="1339"/>
-        <w:gridCol w:w="1626"/>
-        <w:gridCol w:w="1797"/>
+        <w:gridCol w:w="1305"/>
+        <w:gridCol w:w="1593"/>
+        <w:gridCol w:w="1826"/>
         <w:gridCol w:w="1185"/>
-        <w:gridCol w:w="1094"/>
-        <w:gridCol w:w="1014"/>
-        <w:gridCol w:w="1305"/>
+        <w:gridCol w:w="1101"/>
+        <w:gridCol w:w="1043"/>
+        <w:gridCol w:w="1307"/>
       </w:tblGrid>
       <w:tr>
         <w:trPr>
@@ -9162,10 +9235,13 @@
         </w:trPr>
         <w:tc>
           <w:tcPr>
-            <w:tcW w:w="1339" w:type="dxa"/>
+            <w:tcW w:w="1305" w:type="dxa"/>
             <w:shd w:val="clear" w:color="auto" w:fill="E8EEFB"/>
           </w:tcPr>
           <w:p>
+            <w:pPr>
+              <w:keepNext/>
+            </w:pPr>
             <w:r>
               <w:rPr>
                 <w:b/>
@@ -9177,10 +9253,13 @@
         </w:tc>
         <w:tc>
           <w:tcPr>
-            <w:tcW w:w="1626" w:type="dxa"/>
+            <w:tcW w:w="1593" w:type="dxa"/>
             <w:shd w:val="clear" w:color="auto" w:fill="E8EEFB"/>
           </w:tcPr>
           <w:p>
+            <w:pPr>
+              <w:keepNext/>
+            </w:pPr>
             <w:r>
               <w:rPr>
                 <w:b/>
@@ -9192,10 +9271,13 @@
         </w:tc>
         <w:tc>
           <w:tcPr>
-            <w:tcW w:w="1797" w:type="dxa"/>
+            <w:tcW w:w="1826" w:type="dxa"/>
             <w:shd w:val="clear" w:color="auto" w:fill="E8EEFB"/>
           </w:tcPr>
           <w:p>
+            <w:pPr>
+              <w:keepNext/>
+            </w:pPr>
             <w:r>
               <w:rPr>
                 <w:b/>
@@ -9211,6 +9293,9 @@
             <w:shd w:val="clear" w:color="auto" w:fill="E8EEFB"/>
           </w:tcPr>
           <w:p>
+            <w:pPr>
+              <w:keepNext/>
+            </w:pPr>
             <w:r>
               <w:rPr>
                 <w:b/>
@@ -9222,10 +9307,13 @@
         </w:tc>
         <w:tc>
           <w:tcPr>
-            <w:tcW w:w="1094" w:type="dxa"/>
+            <w:tcW w:w="1101" w:type="dxa"/>
             <w:shd w:val="clear" w:color="auto" w:fill="E8EEFB"/>
           </w:tcPr>
           <w:p>
+            <w:pPr>
+              <w:keepNext/>
+            </w:pPr>
             <w:r>
               <w:rPr>
                 <w:b/>
@@ -9237,10 +9325,13 @@
         </w:tc>
         <w:tc>
           <w:tcPr>
-            <w:tcW w:w="1014" w:type="dxa"/>
+            <w:tcW w:w="1043" w:type="dxa"/>
             <w:shd w:val="clear" w:color="auto" w:fill="E8EEFB"/>
           </w:tcPr>
           <w:p>
+            <w:pPr>
+              <w:keepNext/>
+            </w:pPr>
             <w:r>
               <w:rPr>
                 <w:b/>
@@ -9252,10 +9343,13 @@
         </w:tc>
         <w:tc>
           <w:tcPr>
-            <w:tcW w:w="1305" w:type="dxa"/>
+            <w:tcW w:w="1307" w:type="dxa"/>
             <w:shd w:val="clear" w:color="auto" w:fill="E8EEFB"/>
           </w:tcPr>
           <w:p>
+            <w:pPr>
+              <w:keepNext/>
+            </w:pPr>
             <w:r>
               <w:rPr>
                 <w:b/>
@@ -9272,7 +9366,7 @@
         </w:trPr>
         <w:tc>
           <w:tcPr>
-            <w:tcW w:w="1339" w:type="dxa"/>
+            <w:tcW w:w="1305" w:type="dxa"/>
           </w:tcPr>
           <w:p>
             <w:r>
@@ -9285,7 +9379,7 @@
         </w:tc>
         <w:tc>
           <w:tcPr>
-            <w:tcW w:w="1626" w:type="dxa"/>
+            <w:tcW w:w="1593" w:type="dxa"/>
           </w:tcPr>
           <w:p>
             <w:r>
@@ -9299,7 +9393,7 @@
         </w:tc>
         <w:tc>
           <w:tcPr>
-            <w:tcW w:w="1797" w:type="dxa"/>
+            <w:tcW w:w="1826" w:type="dxa"/>
           </w:tcPr>
           <w:p>
             <w:r>
@@ -9325,7 +9419,7 @@
         </w:tc>
         <w:tc>
           <w:tcPr>
-            <w:tcW w:w="1094" w:type="dxa"/>
+            <w:tcW w:w="1101" w:type="dxa"/>
           </w:tcPr>
           <w:p>
             <w:r>
@@ -9338,7 +9432,7 @@
         </w:tc>
         <w:tc>
           <w:tcPr>
-            <w:tcW w:w="1014" w:type="dxa"/>
+            <w:tcW w:w="1043" w:type="dxa"/>
           </w:tcPr>
           <w:p>
             <w:r>
@@ -9351,7 +9445,7 @@
         </w:tc>
         <w:tc>
           <w:tcPr>
-            <w:tcW w:w="1305" w:type="dxa"/>
+            <w:tcW w:w="1307" w:type="dxa"/>
           </w:tcPr>
           <w:p>
             <w:r>
@@ -9370,7 +9464,7 @@
         </w:trPr>
         <w:tc>
           <w:tcPr>
-            <w:tcW w:w="1339" w:type="dxa"/>
+            <w:tcW w:w="1305" w:type="dxa"/>
           </w:tcPr>
           <w:p>
             <w:r>
@@ -9383,7 +9477,7 @@
         </w:tc>
         <w:tc>
           <w:tcPr>
-            <w:tcW w:w="1626" w:type="dxa"/>
+            <w:tcW w:w="1593" w:type="dxa"/>
           </w:tcPr>
           <w:p>
             <w:r>
@@ -9396,7 +9490,7 @@
         </w:tc>
         <w:tc>
           <w:tcPr>
-            <w:tcW w:w="1797" w:type="dxa"/>
+            <w:tcW w:w="1826" w:type="dxa"/>
           </w:tcPr>
           <w:p>
             <w:r>
@@ -9422,7 +9516,7 @@
         </w:tc>
         <w:tc>
           <w:tcPr>
-            <w:tcW w:w="1094" w:type="dxa"/>
+            <w:tcW w:w="1101" w:type="dxa"/>
           </w:tcPr>
           <w:p>
             <w:r>
@@ -9435,7 +9529,7 @@
         </w:tc>
         <w:tc>
           <w:tcPr>
-            <w:tcW w:w="1014" w:type="dxa"/>
+            <w:tcW w:w="1043" w:type="dxa"/>
           </w:tcPr>
           <w:p>
             <w:r>
@@ -9448,7 +9542,7 @@
         </w:tc>
         <w:tc>
           <w:tcPr>
-            <w:tcW w:w="1305" w:type="dxa"/>
+            <w:tcW w:w="1307" w:type="dxa"/>
           </w:tcPr>
           <w:p>
             <w:r>
@@ -9473,7 +9567,7 @@
         </w:trPr>
         <w:tc>
           <w:tcPr>
-            <w:tcW w:w="1339" w:type="dxa"/>
+            <w:tcW w:w="1305" w:type="dxa"/>
           </w:tcPr>
           <w:p>
             <w:r>
@@ -9486,7 +9580,7 @@
         </w:tc>
         <w:tc>
           <w:tcPr>
-            <w:tcW w:w="1626" w:type="dxa"/>
+            <w:tcW w:w="1593" w:type="dxa"/>
           </w:tcPr>
           <w:p>
             <w:r>
@@ -9499,7 +9593,7 @@
         </w:tc>
         <w:tc>
           <w:tcPr>
-            <w:tcW w:w="1797" w:type="dxa"/>
+            <w:tcW w:w="1826" w:type="dxa"/>
           </w:tcPr>
           <w:p>
             <w:r>
@@ -9541,7 +9635,7 @@
         </w:tc>
         <w:tc>
           <w:tcPr>
-            <w:tcW w:w="1094" w:type="dxa"/>
+            <w:tcW w:w="1101" w:type="dxa"/>
           </w:tcPr>
           <w:p>
             <w:r>
@@ -9554,7 +9648,7 @@
         </w:tc>
         <w:tc>
           <w:tcPr>
-            <w:tcW w:w="1014" w:type="dxa"/>
+            <w:tcW w:w="1043" w:type="dxa"/>
           </w:tcPr>
           <w:p>
             <w:r>
@@ -9567,7 +9661,7 @@
         </w:tc>
         <w:tc>
           <w:tcPr>
-            <w:tcW w:w="1305" w:type="dxa"/>
+            <w:tcW w:w="1307" w:type="dxa"/>
           </w:tcPr>
           <w:p>
             <w:r>
@@ -9592,7 +9686,7 @@
         </w:trPr>
         <w:tc>
           <w:tcPr>
-            <w:tcW w:w="1339" w:type="dxa"/>
+            <w:tcW w:w="1305" w:type="dxa"/>
           </w:tcPr>
           <w:p>
             <w:r>
@@ -9605,7 +9699,7 @@
         </w:tc>
         <w:tc>
           <w:tcPr>
-            <w:tcW w:w="1626" w:type="dxa"/>
+            <w:tcW w:w="1593" w:type="dxa"/>
           </w:tcPr>
           <w:p>
             <w:r>
@@ -9618,7 +9712,7 @@
         </w:tc>
         <w:tc>
           <w:tcPr>
-            <w:tcW w:w="1797" w:type="dxa"/>
+            <w:tcW w:w="1826" w:type="dxa"/>
           </w:tcPr>
           <w:p>
             <w:r>
@@ -9644,7 +9738,7 @@
         </w:tc>
         <w:tc>
           <w:tcPr>
-            <w:tcW w:w="1094" w:type="dxa"/>
+            <w:tcW w:w="1101" w:type="dxa"/>
           </w:tcPr>
           <w:p>
             <w:r>
@@ -9657,7 +9751,7 @@
         </w:tc>
         <w:tc>
           <w:tcPr>
-            <w:tcW w:w="1014" w:type="dxa"/>
+            <w:tcW w:w="1043" w:type="dxa"/>
           </w:tcPr>
           <w:p>
             <w:r>
@@ -9670,7 +9764,7 @@
         </w:tc>
         <w:tc>
           <w:tcPr>
-            <w:tcW w:w="1305" w:type="dxa"/>
+            <w:tcW w:w="1307" w:type="dxa"/>
           </w:tcPr>
           <w:p>
             <w:r>
@@ -9695,7 +9789,7 @@
         </w:trPr>
         <w:tc>
           <w:tcPr>
-            <w:tcW w:w="1339" w:type="dxa"/>
+            <w:tcW w:w="1305" w:type="dxa"/>
           </w:tcPr>
           <w:p>
             <w:r>
@@ -9708,7 +9802,7 @@
         </w:tc>
         <w:tc>
           <w:tcPr>
-            <w:tcW w:w="1626" w:type="dxa"/>
+            <w:tcW w:w="1593" w:type="dxa"/>
           </w:tcPr>
           <w:p>
             <w:r>
@@ -9721,7 +9815,7 @@
         </w:tc>
         <w:tc>
           <w:tcPr>
-            <w:tcW w:w="1797" w:type="dxa"/>
+            <w:tcW w:w="1826" w:type="dxa"/>
           </w:tcPr>
           <w:p>
             <w:r>
@@ -9747,7 +9841,7 @@
         </w:tc>
         <w:tc>
           <w:tcPr>
-            <w:tcW w:w="1094" w:type="dxa"/>
+            <w:tcW w:w="1101" w:type="dxa"/>
           </w:tcPr>
           <w:p>
             <w:r>
@@ -9760,7 +9854,7 @@
         </w:tc>
         <w:tc>
           <w:tcPr>
-            <w:tcW w:w="1014" w:type="dxa"/>
+            <w:tcW w:w="1043" w:type="dxa"/>
           </w:tcPr>
           <w:p>
             <w:r>
@@ -9773,7 +9867,7 @@
         </w:tc>
         <w:tc>
           <w:tcPr>
-            <w:tcW w:w="1305" w:type="dxa"/>
+            <w:tcW w:w="1307" w:type="dxa"/>
           </w:tcPr>
           <w:p>
             <w:r>
@@ -9930,10 +10024,10 @@
         <w:tblLook w:val="04A0" w:firstRow="1" w:lastRow="0" w:firstColumn="1" w:lastColumn="0" w:noHBand="0" w:noVBand="1"/>
       </w:tblPr>
       <w:tblGrid>
-        <w:gridCol w:w="1112"/>
-        <w:gridCol w:w="2388"/>
-        <w:gridCol w:w="4847"/>
-        <w:gridCol w:w="1014"/>
+        <w:gridCol w:w="1140"/>
+        <w:gridCol w:w="2396"/>
+        <w:gridCol w:w="4781"/>
+        <w:gridCol w:w="1043"/>
       </w:tblGrid>
       <w:tr>
         <w:trPr>
@@ -9942,10 +10036,13 @@
         </w:trPr>
         <w:tc>
           <w:tcPr>
-            <w:tcW w:w="1112" w:type="dxa"/>
+            <w:tcW w:w="1140" w:type="dxa"/>
             <w:shd w:val="clear" w:color="auto" w:fill="E8EEFB"/>
           </w:tcPr>
           <w:p>
+            <w:pPr>
+              <w:keepNext/>
+            </w:pPr>
             <w:r>
               <w:rPr>
                 <w:b/>
@@ -9957,10 +10054,13 @@
         </w:tc>
         <w:tc>
           <w:tcPr>
-            <w:tcW w:w="2388" w:type="dxa"/>
+            <w:tcW w:w="2396" w:type="dxa"/>
             <w:shd w:val="clear" w:color="auto" w:fill="E8EEFB"/>
           </w:tcPr>
           <w:p>
+            <w:pPr>
+              <w:keepNext/>
+            </w:pPr>
             <w:r>
               <w:rPr>
                 <w:b/>
@@ -9972,10 +10072,13 @@
         </w:tc>
         <w:tc>
           <w:tcPr>
-            <w:tcW w:w="4847" w:type="dxa"/>
+            <w:tcW w:w="4781" w:type="dxa"/>
             <w:shd w:val="clear" w:color="auto" w:fill="E8EEFB"/>
           </w:tcPr>
           <w:p>
+            <w:pPr>
+              <w:keepNext/>
+            </w:pPr>
             <w:r>
               <w:rPr>
                 <w:b/>
@@ -9987,10 +10090,13 @@
         </w:tc>
         <w:tc>
           <w:tcPr>
-            <w:tcW w:w="1014" w:type="dxa"/>
+            <w:tcW w:w="1043" w:type="dxa"/>
             <w:shd w:val="clear" w:color="auto" w:fill="E8EEFB"/>
           </w:tcPr>
           <w:p>
+            <w:pPr>
+              <w:keepNext/>
+            </w:pPr>
             <w:r>
               <w:rPr>
                 <w:b/>
@@ -10007,7 +10113,7 @@
         </w:trPr>
         <w:tc>
           <w:tcPr>
-            <w:tcW w:w="1112" w:type="dxa"/>
+            <w:tcW w:w="1140" w:type="dxa"/>
           </w:tcPr>
           <w:p>
             <w:r>
@@ -10020,7 +10126,7 @@
         </w:tc>
         <w:tc>
           <w:tcPr>
-            <w:tcW w:w="2388" w:type="dxa"/>
+            <w:tcW w:w="2396" w:type="dxa"/>
           </w:tcPr>
           <w:p>
             <w:r>
@@ -10033,7 +10139,7 @@
         </w:tc>
         <w:tc>
           <w:tcPr>
-            <w:tcW w:w="4847" w:type="dxa"/>
+            <w:tcW w:w="4781" w:type="dxa"/>
           </w:tcPr>
           <w:p>
             <w:r>
@@ -10053,7 +10159,7 @@
         </w:tc>
         <w:tc>
           <w:tcPr>
-            <w:tcW w:w="1014" w:type="dxa"/>
+            <w:tcW w:w="1043" w:type="dxa"/>
           </w:tcPr>
           <w:p>
             <w:r>
@@ -10071,7 +10177,7 @@
         </w:trPr>
         <w:tc>
           <w:tcPr>
-            <w:tcW w:w="1112" w:type="dxa"/>
+            <w:tcW w:w="1140" w:type="dxa"/>
           </w:tcPr>
           <w:p>
             <w:r>
@@ -10084,7 +10190,7 @@
         </w:tc>
         <w:tc>
           <w:tcPr>
-            <w:tcW w:w="2388" w:type="dxa"/>
+            <w:tcW w:w="2396" w:type="dxa"/>
           </w:tcPr>
           <w:p>
             <w:r>
@@ -10097,7 +10203,7 @@
         </w:tc>
         <w:tc>
           <w:tcPr>
-            <w:tcW w:w="4847" w:type="dxa"/>
+            <w:tcW w:w="4781" w:type="dxa"/>
           </w:tcPr>
           <w:p>
             <w:r>
@@ -10162,7 +10268,7 @@
         </w:tc>
         <w:tc>
           <w:tcPr>
-            <w:tcW w:w="1014" w:type="dxa"/>
+            <w:tcW w:w="1043" w:type="dxa"/>
           </w:tcPr>
           <w:p>
             <w:r>
@@ -10180,7 +10286,7 @@
         </w:trPr>
         <w:tc>
           <w:tcPr>
-            <w:tcW w:w="1112" w:type="dxa"/>
+            <w:tcW w:w="1140" w:type="dxa"/>
           </w:tcPr>
           <w:p>
             <w:r>
@@ -10193,7 +10299,7 @@
         </w:tc>
         <w:tc>
           <w:tcPr>
-            <w:tcW w:w="2388" w:type="dxa"/>
+            <w:tcW w:w="2396" w:type="dxa"/>
           </w:tcPr>
           <w:p>
             <w:r>
@@ -10206,7 +10312,7 @@
         </w:tc>
         <w:tc>
           <w:tcPr>
-            <w:tcW w:w="4847" w:type="dxa"/>
+            <w:tcW w:w="4781" w:type="dxa"/>
           </w:tcPr>
           <w:p>
             <w:r>
@@ -10271,7 +10377,7 @@
         </w:tc>
         <w:tc>
           <w:tcPr>
-            <w:tcW w:w="1014" w:type="dxa"/>
+            <w:tcW w:w="1043" w:type="dxa"/>
           </w:tcPr>
           <w:p>
             <w:r>
@@ -10286,7 +10392,7 @@
       <w:tr>
         <w:tc>
           <w:tcPr>
-            <w:tcW w:w="1112" w:type="dxa"/>
+            <w:tcW w:w="1140" w:type="dxa"/>
           </w:tcPr>
           <w:p>
             <w:r>
@@ -10299,7 +10405,7 @@
         </w:tc>
         <w:tc>
           <w:tcPr>
-            <w:tcW w:w="2388" w:type="dxa"/>
+            <w:tcW w:w="2396" w:type="dxa"/>
           </w:tcPr>
           <w:p>
             <w:r>
@@ -10312,7 +10418,7 @@
         </w:tc>
         <w:tc>
           <w:tcPr>
-            <w:tcW w:w="4847" w:type="dxa"/>
+            <w:tcW w:w="4781" w:type="dxa"/>
           </w:tcPr>
           <w:p>
             <w:r>
@@ -10370,7 +10476,7 @@
         </w:tc>
         <w:tc>
           <w:tcPr>
-            <w:tcW w:w="1014" w:type="dxa"/>
+            <w:tcW w:w="1043" w:type="dxa"/>
           </w:tcPr>
           <w:p>
             <w:r>
@@ -10388,7 +10494,7 @@
         </w:trPr>
         <w:tc>
           <w:tcPr>
-            <w:tcW w:w="1112" w:type="dxa"/>
+            <w:tcW w:w="1140" w:type="dxa"/>
           </w:tcPr>
           <w:p>
             <w:r>
@@ -10401,7 +10507,7 @@
         </w:tc>
         <w:tc>
           <w:tcPr>
-            <w:tcW w:w="2388" w:type="dxa"/>
+            <w:tcW w:w="2396" w:type="dxa"/>
           </w:tcPr>
           <w:p>
             <w:r>
@@ -10414,7 +10520,7 @@
         </w:tc>
         <w:tc>
           <w:tcPr>
-            <w:tcW w:w="4847" w:type="dxa"/>
+            <w:tcW w:w="4781" w:type="dxa"/>
           </w:tcPr>
           <w:p>
             <w:r>
@@ -10460,7 +10566,7 @@
         </w:tc>
         <w:tc>
           <w:tcPr>
-            <w:tcW w:w="1014" w:type="dxa"/>
+            <w:tcW w:w="1043" w:type="dxa"/>
           </w:tcPr>
           <w:p>
             <w:r>
@@ -10478,7 +10584,7 @@
         </w:trPr>
         <w:tc>
           <w:tcPr>
-            <w:tcW w:w="1112" w:type="dxa"/>
+            <w:tcW w:w="1140" w:type="dxa"/>
           </w:tcPr>
           <w:p>
             <w:r>
@@ -10491,7 +10597,7 @@
         </w:tc>
         <w:tc>
           <w:tcPr>
-            <w:tcW w:w="2388" w:type="dxa"/>
+            <w:tcW w:w="2396" w:type="dxa"/>
           </w:tcPr>
           <w:p>
             <w:r>
@@ -10504,7 +10610,7 @@
         </w:tc>
         <w:tc>
           <w:tcPr>
-            <w:tcW w:w="4847" w:type="dxa"/>
+            <w:tcW w:w="4781" w:type="dxa"/>
           </w:tcPr>
           <w:p>
             <w:r>
@@ -10517,7 +10623,7 @@
         </w:tc>
         <w:tc>
           <w:tcPr>
-            <w:tcW w:w="1014" w:type="dxa"/>
+            <w:tcW w:w="1043" w:type="dxa"/>
           </w:tcPr>
           <w:p>
             <w:r>
@@ -10808,8 +10914,8 @@
       </w:tblPr>
       <w:tblGrid>
         <w:gridCol w:w="1400"/>
-        <w:gridCol w:w="3195"/>
-        <w:gridCol w:w="4764"/>
+        <w:gridCol w:w="3211"/>
+        <w:gridCol w:w="4748"/>
       </w:tblGrid>
       <w:tr>
         <w:trPr>
@@ -10822,6 +10928,9 @@
             <w:shd w:val="clear" w:color="auto" w:fill="E8EEFB"/>
           </w:tcPr>
           <w:p>
+            <w:pPr>
+              <w:keepNext/>
+            </w:pPr>
             <w:r>
               <w:rPr>
                 <w:b/>
@@ -10833,10 +10942,13 @@
         </w:tc>
         <w:tc>
           <w:tcPr>
-            <w:tcW w:w="3195" w:type="dxa"/>
+            <w:tcW w:w="3211" w:type="dxa"/>
             <w:shd w:val="clear" w:color="auto" w:fill="E8EEFB"/>
           </w:tcPr>
           <w:p>
+            <w:pPr>
+              <w:keepNext/>
+            </w:pPr>
             <w:r>
               <w:rPr>
                 <w:b/>
@@ -10848,10 +10960,13 @@
         </w:tc>
         <w:tc>
           <w:tcPr>
-            <w:tcW w:w="4764" w:type="dxa"/>
+            <w:tcW w:w="4748" w:type="dxa"/>
             <w:shd w:val="clear" w:color="auto" w:fill="E8EEFB"/>
           </w:tcPr>
           <w:p>
+            <w:pPr>
+              <w:keepNext/>
+            </w:pPr>
             <w:r>
               <w:rPr>
                 <w:b/>
@@ -10881,7 +10996,7 @@
         </w:tc>
         <w:tc>
           <w:tcPr>
-            <w:tcW w:w="3195" w:type="dxa"/>
+            <w:tcW w:w="3211" w:type="dxa"/>
           </w:tcPr>
           <w:p>
             <w:r>
@@ -10908,7 +11023,7 @@
         </w:tc>
         <w:tc>
           <w:tcPr>
-            <w:tcW w:w="4764" w:type="dxa"/>
+            <w:tcW w:w="4748" w:type="dxa"/>
           </w:tcPr>
           <w:p>
             <w:r>
@@ -10952,7 +11067,7 @@
         </w:tc>
         <w:tc>
           <w:tcPr>
-            <w:tcW w:w="3195" w:type="dxa"/>
+            <w:tcW w:w="3211" w:type="dxa"/>
           </w:tcPr>
           <w:p>
             <w:r>
@@ -10979,7 +11094,7 @@
         </w:tc>
         <w:tc>
           <w:tcPr>
-            <w:tcW w:w="4764" w:type="dxa"/>
+            <w:tcW w:w="4748" w:type="dxa"/>
           </w:tcPr>
           <w:p>
             <w:r>
@@ -11010,7 +11125,7 @@
         </w:tc>
         <w:tc>
           <w:tcPr>
-            <w:tcW w:w="3195" w:type="dxa"/>
+            <w:tcW w:w="3211" w:type="dxa"/>
           </w:tcPr>
           <w:p>
             <w:r>
@@ -11037,7 +11152,7 @@
         </w:tc>
         <w:tc>
           <w:tcPr>
-            <w:tcW w:w="4764" w:type="dxa"/>
+            <w:tcW w:w="4748" w:type="dxa"/>
           </w:tcPr>
           <w:p>
             <w:r>
@@ -11081,7 +11196,7 @@
         </w:tc>
         <w:tc>
           <w:tcPr>
-            <w:tcW w:w="3195" w:type="dxa"/>
+            <w:tcW w:w="3211" w:type="dxa"/>
           </w:tcPr>
           <w:p>
             <w:r>
@@ -11108,7 +11223,7 @@
         </w:tc>
         <w:tc>
           <w:tcPr>
-            <w:tcW w:w="4764" w:type="dxa"/>
+            <w:tcW w:w="4748" w:type="dxa"/>
           </w:tcPr>
           <w:p>
             <w:r>
@@ -11175,7 +11290,7 @@
         </w:tc>
         <w:tc>
           <w:tcPr>
-            <w:tcW w:w="3195" w:type="dxa"/>
+            <w:tcW w:w="3211" w:type="dxa"/>
           </w:tcPr>
           <w:p>
             <w:r>
@@ -11188,7 +11303,7 @@
         </w:tc>
         <w:tc>
           <w:tcPr>
-            <w:tcW w:w="4764" w:type="dxa"/>
+            <w:tcW w:w="4748" w:type="dxa"/>
           </w:tcPr>
           <w:p>
             <w:r>
@@ -11455,9 +11570,9 @@
         <w:tblLook w:val="04A0" w:firstRow="1" w:lastRow="0" w:firstColumn="1" w:lastColumn="0" w:noHBand="0" w:noVBand="1"/>
       </w:tblPr>
       <w:tblGrid>
-        <w:gridCol w:w="2069"/>
-        <w:gridCol w:w="3655"/>
-        <w:gridCol w:w="3637"/>
+        <w:gridCol w:w="2081"/>
+        <w:gridCol w:w="3648"/>
+        <w:gridCol w:w="3632"/>
       </w:tblGrid>
       <w:tr>
         <w:trPr>
@@ -11466,10 +11581,13 @@
         </w:trPr>
         <w:tc>
           <w:tcPr>
-            <w:tcW w:w="2069" w:type="dxa"/>
+            <w:tcW w:w="2081" w:type="dxa"/>
             <w:shd w:val="clear" w:color="auto" w:fill="E8EEFB"/>
           </w:tcPr>
           <w:p>
+            <w:pPr>
+              <w:keepNext/>
+            </w:pPr>
             <w:r>
               <w:rPr>
                 <w:b/>
@@ -11481,10 +11599,13 @@
         </w:tc>
         <w:tc>
           <w:tcPr>
-            <w:tcW w:w="3655" w:type="dxa"/>
+            <w:tcW w:w="3648" w:type="dxa"/>
             <w:shd w:val="clear" w:color="auto" w:fill="E8EEFB"/>
           </w:tcPr>
           <w:p>
+            <w:pPr>
+              <w:keepNext/>
+            </w:pPr>
             <w:r>
               <w:rPr>
                 <w:b/>
@@ -11496,10 +11617,13 @@
         </w:tc>
         <w:tc>
           <w:tcPr>
-            <w:tcW w:w="3637" w:type="dxa"/>
+            <w:tcW w:w="3632" w:type="dxa"/>
             <w:shd w:val="clear" w:color="auto" w:fill="E8EEFB"/>
           </w:tcPr>
           <w:p>
+            <w:pPr>
+              <w:keepNext/>
+            </w:pPr>
             <w:r>
               <w:rPr>
                 <w:b/>
@@ -11513,7 +11637,7 @@
       <w:tr>
         <w:tc>
           <w:tcPr>
-            <w:tcW w:w="2069" w:type="dxa"/>
+            <w:tcW w:w="2081" w:type="dxa"/>
           </w:tcPr>
           <w:p>
             <w:r>
@@ -11527,7 +11651,7 @@
         </w:tc>
         <w:tc>
           <w:tcPr>
-            <w:tcW w:w="3655" w:type="dxa"/>
+            <w:tcW w:w="3648" w:type="dxa"/>
           </w:tcPr>
           <w:p>
             <w:r>
@@ -11572,7 +11696,7 @@
         </w:tc>
         <w:tc>
           <w:tcPr>
-            <w:tcW w:w="3637" w:type="dxa"/>
+            <w:tcW w:w="3632" w:type="dxa"/>
           </w:tcPr>
           <w:p>
             <w:r>
@@ -11587,7 +11711,7 @@
       <w:tr>
         <w:tc>
           <w:tcPr>
-            <w:tcW w:w="2069" w:type="dxa"/>
+            <w:tcW w:w="2081" w:type="dxa"/>
           </w:tcPr>
           <w:p>
             <w:r>
@@ -11601,7 +11725,7 @@
         </w:tc>
         <w:tc>
           <w:tcPr>
-            <w:tcW w:w="3655" w:type="dxa"/>
+            <w:tcW w:w="3648" w:type="dxa"/>
           </w:tcPr>
           <w:p>
             <w:r>
@@ -11673,7 +11797,7 @@
         </w:tc>
         <w:tc>
           <w:tcPr>
-            <w:tcW w:w="3637" w:type="dxa"/>
+            <w:tcW w:w="3632" w:type="dxa"/>
           </w:tcPr>
           <w:p>
             <w:r>
@@ -11691,7 +11815,7 @@
         </w:trPr>
         <w:tc>
           <w:tcPr>
-            <w:tcW w:w="2069" w:type="dxa"/>
+            <w:tcW w:w="2081" w:type="dxa"/>
           </w:tcPr>
           <w:p>
             <w:r>
@@ -11705,7 +11829,7 @@
         </w:tc>
         <w:tc>
           <w:tcPr>
-            <w:tcW w:w="3655" w:type="dxa"/>
+            <w:tcW w:w="3648" w:type="dxa"/>
           </w:tcPr>
           <w:p>
             <w:r>
@@ -11718,7 +11842,7 @@
         </w:tc>
         <w:tc>
           <w:tcPr>
-            <w:tcW w:w="3637" w:type="dxa"/>
+            <w:tcW w:w="3632" w:type="dxa"/>
           </w:tcPr>
           <w:p>
             <w:r>
@@ -13128,6 +13252,9 @@
             <w:shd w:val="clear" w:color="auto" w:fill="E8EEFB"/>
           </w:tcPr>
           <w:p>
+            <w:pPr>
+              <w:keepNext/>
+            </w:pPr>
             <w:r>
               <w:rPr>
                 <w:b/>
@@ -13143,6 +13270,9 @@
             <w:shd w:val="clear" w:color="auto" w:fill="E8EEFB"/>
           </w:tcPr>
           <w:p>
+            <w:pPr>
+              <w:keepNext/>
+            </w:pPr>
             <w:r>
               <w:rPr>
                 <w:b/>
@@ -14045,10 +14175,10 @@
         <w:tblLook w:val="04A0" w:firstRow="1" w:lastRow="0" w:firstColumn="1" w:lastColumn="0" w:noHBand="0" w:noVBand="1"/>
       </w:tblPr>
       <w:tblGrid>
-        <w:gridCol w:w="3960"/>
-        <w:gridCol w:w="1169"/>
+        <w:gridCol w:w="3920"/>
+        <w:gridCol w:w="1189"/>
         <w:gridCol w:w="3061"/>
-        <w:gridCol w:w="1169"/>
+        <w:gridCol w:w="1189"/>
       </w:tblGrid>
       <w:tr>
         <w:trPr>
@@ -14057,10 +14187,13 @@
         </w:trPr>
         <w:tc>
           <w:tcPr>
-            <w:tcW w:w="3960" w:type="dxa"/>
+            <w:tcW w:w="3920" w:type="dxa"/>
             <w:shd w:val="clear" w:color="auto" w:fill="E8EEFB"/>
           </w:tcPr>
           <w:p>
+            <w:pPr>
+              <w:keepNext/>
+            </w:pPr>
             <w:r>
               <w:rPr>
                 <w:b/>
@@ -14072,10 +14205,13 @@
         </w:tc>
         <w:tc>
           <w:tcPr>
-            <w:tcW w:w="1169" w:type="dxa"/>
+            <w:tcW w:w="1189" w:type="dxa"/>
             <w:shd w:val="clear" w:color="auto" w:fill="E8EEFB"/>
           </w:tcPr>
           <w:p>
+            <w:pPr>
+              <w:keepNext/>
+            </w:pPr>
             <w:r>
               <w:rPr>
                 <w:b/>
@@ -14091,6 +14227,9 @@
             <w:shd w:val="clear" w:color="auto" w:fill="E8EEFB"/>
           </w:tcPr>
           <w:p>
+            <w:pPr>
+              <w:keepNext/>
+            </w:pPr>
             <w:r>
               <w:rPr>
                 <w:b/>
@@ -14102,10 +14241,13 @@
         </w:tc>
         <w:tc>
           <w:tcPr>
-            <w:tcW w:w="1169" w:type="dxa"/>
+            <w:tcW w:w="1189" w:type="dxa"/>
             <w:shd w:val="clear" w:color="auto" w:fill="E8EEFB"/>
           </w:tcPr>
           <w:p>
+            <w:pPr>
+              <w:keepNext/>
+            </w:pPr>
             <w:r>
               <w:rPr>
                 <w:b/>
@@ -14122,7 +14264,7 @@
         </w:trPr>
         <w:tc>
           <w:tcPr>
-            <w:tcW w:w="3960" w:type="dxa"/>
+            <w:tcW w:w="3920" w:type="dxa"/>
           </w:tcPr>
           <w:p>
             <w:r>
@@ -14135,7 +14277,7 @@
         </w:tc>
         <w:tc>
           <w:tcPr>
-            <w:tcW w:w="1169" w:type="dxa"/>
+            <w:tcW w:w="1189" w:type="dxa"/>
           </w:tcPr>
           <w:p>
             <w:r>
@@ -14161,7 +14303,7 @@
         </w:tc>
         <w:tc>
           <w:tcPr>
-            <w:tcW w:w="1169" w:type="dxa"/>
+            <w:tcW w:w="1189" w:type="dxa"/>
           </w:tcPr>
           <w:p>
             <w:r>
@@ -14179,7 +14321,7 @@
         </w:trPr>
         <w:tc>
           <w:tcPr>
-            <w:tcW w:w="3960" w:type="dxa"/>
+            <w:tcW w:w="3920" w:type="dxa"/>
           </w:tcPr>
           <w:p>
             <w:r>
@@ -14192,7 +14334,7 @@
         </w:tc>
         <w:tc>
           <w:tcPr>
-            <w:tcW w:w="1169" w:type="dxa"/>
+            <w:tcW w:w="1189" w:type="dxa"/>
           </w:tcPr>
           <w:p>
             <w:r>
@@ -14218,7 +14360,7 @@
         </w:tc>
         <w:tc>
           <w:tcPr>
-            <w:tcW w:w="1169" w:type="dxa"/>
+            <w:tcW w:w="1189" w:type="dxa"/>
           </w:tcPr>
           <w:p>
             <w:r>
@@ -14236,7 +14378,7 @@
         </w:trPr>
         <w:tc>
           <w:tcPr>
-            <w:tcW w:w="3960" w:type="dxa"/>
+            <w:tcW w:w="3920" w:type="dxa"/>
           </w:tcPr>
           <w:p>
             <w:r>
@@ -14249,7 +14391,7 @@
         </w:tc>
         <w:tc>
           <w:tcPr>
-            <w:tcW w:w="1169" w:type="dxa"/>
+            <w:tcW w:w="1189" w:type="dxa"/>
           </w:tcPr>
           <w:p>
             <w:r>
@@ -14275,7 +14417,7 @@
         </w:tc>
         <w:tc>
           <w:tcPr>
-            <w:tcW w:w="1169" w:type="dxa"/>
+            <w:tcW w:w="1189" w:type="dxa"/>
           </w:tcPr>
           <w:p>
             <w:r>
@@ -14293,7 +14435,7 @@
         </w:trPr>
         <w:tc>
           <w:tcPr>
-            <w:tcW w:w="3960" w:type="dxa"/>
+            <w:tcW w:w="3920" w:type="dxa"/>
           </w:tcPr>
           <w:p>
             <w:r>
@@ -14306,7 +14448,7 @@
         </w:tc>
         <w:tc>
           <w:tcPr>
-            <w:tcW w:w="1169" w:type="dxa"/>
+            <w:tcW w:w="1189" w:type="dxa"/>
           </w:tcPr>
           <w:p>
             <w:r>
@@ -14332,7 +14474,7 @@
         </w:tc>
         <w:tc>
           <w:tcPr>
-            <w:tcW w:w="1169" w:type="dxa"/>
+            <w:tcW w:w="1189" w:type="dxa"/>
           </w:tcPr>
           <w:p>
             <w:r>
@@ -14350,7 +14492,7 @@
         </w:trPr>
         <w:tc>
           <w:tcPr>
-            <w:tcW w:w="3960" w:type="dxa"/>
+            <w:tcW w:w="3920" w:type="dxa"/>
           </w:tcPr>
           <w:p>
             <w:r>
@@ -14363,7 +14505,7 @@
         </w:tc>
         <w:tc>
           <w:tcPr>
-            <w:tcW w:w="1169" w:type="dxa"/>
+            <w:tcW w:w="1189" w:type="dxa"/>
           </w:tcPr>
           <w:p>
             <w:r>
@@ -14389,7 +14531,7 @@
         </w:tc>
         <w:tc>
           <w:tcPr>
-            <w:tcW w:w="1169" w:type="dxa"/>
+            <w:tcW w:w="1189" w:type="dxa"/>
           </w:tcPr>
           <w:p>
             <w:r>
@@ -14407,7 +14549,7 @@
         </w:trPr>
         <w:tc>
           <w:tcPr>
-            <w:tcW w:w="3960" w:type="dxa"/>
+            <w:tcW w:w="3920" w:type="dxa"/>
           </w:tcPr>
           <w:p>
             <w:r>
@@ -14420,7 +14562,7 @@
         </w:tc>
         <w:tc>
           <w:tcPr>
-            <w:tcW w:w="1169" w:type="dxa"/>
+            <w:tcW w:w="1189" w:type="dxa"/>
           </w:tcPr>
           <w:p>
             <w:r>
@@ -14446,7 +14588,7 @@
         </w:tc>
         <w:tc>
           <w:tcPr>
-            <w:tcW w:w="1169" w:type="dxa"/>
+            <w:tcW w:w="1189" w:type="dxa"/>
           </w:tcPr>
           <w:p>
             <w:r>
@@ -14464,7 +14606,7 @@
         </w:trPr>
         <w:tc>
           <w:tcPr>
-            <w:tcW w:w="3960" w:type="dxa"/>
+            <w:tcW w:w="3920" w:type="dxa"/>
           </w:tcPr>
           <w:p>
             <w:r>
@@ -14477,7 +14619,7 @@
         </w:tc>
         <w:tc>
           <w:tcPr>
-            <w:tcW w:w="1169" w:type="dxa"/>
+            <w:tcW w:w="1189" w:type="dxa"/>
           </w:tcPr>
           <w:p>
             <w:r>
@@ -14503,7 +14645,7 @@
         </w:tc>
         <w:tc>
           <w:tcPr>
-            <w:tcW w:w="1169" w:type="dxa"/>
+            <w:tcW w:w="1189" w:type="dxa"/>
           </w:tcPr>
           <w:p>
             <w:r>
@@ -14521,7 +14663,7 @@
         </w:trPr>
         <w:tc>
           <w:tcPr>
-            <w:tcW w:w="3960" w:type="dxa"/>
+            <w:tcW w:w="3920" w:type="dxa"/>
           </w:tcPr>
           <w:p>
             <w:r>
@@ -14534,7 +14676,7 @@
         </w:tc>
         <w:tc>
           <w:tcPr>
-            <w:tcW w:w="1169" w:type="dxa"/>
+            <w:tcW w:w="1189" w:type="dxa"/>
           </w:tcPr>
           <w:p>
             <w:r>
@@ -14560,7 +14702,7 @@
         </w:tc>
         <w:tc>
           <w:tcPr>
-            <w:tcW w:w="1169" w:type="dxa"/>
+            <w:tcW w:w="1189" w:type="dxa"/>
           </w:tcPr>
           <w:p>
             <w:r>
@@ -14578,7 +14720,7 @@
         </w:trPr>
         <w:tc>
           <w:tcPr>
-            <w:tcW w:w="3960" w:type="dxa"/>
+            <w:tcW w:w="3920" w:type="dxa"/>
           </w:tcPr>
           <w:p>
             <w:r>
@@ -14591,7 +14733,7 @@
         </w:tc>
         <w:tc>
           <w:tcPr>
-            <w:tcW w:w="1169" w:type="dxa"/>
+            <w:tcW w:w="1189" w:type="dxa"/>
           </w:tcPr>
           <w:p>
             <w:r>
@@ -14617,7 +14759,7 @@
         </w:tc>
         <w:tc>
           <w:tcPr>
-            <w:tcW w:w="1169" w:type="dxa"/>
+            <w:tcW w:w="1189" w:type="dxa"/>
           </w:tcPr>
           <w:p>
             <w:r>
@@ -14635,7 +14777,7 @@
         </w:trPr>
         <w:tc>
           <w:tcPr>
-            <w:tcW w:w="3960" w:type="dxa"/>
+            <w:tcW w:w="3920" w:type="dxa"/>
           </w:tcPr>
           <w:p>
             <w:r>
@@ -14648,7 +14790,7 @@
         </w:tc>
         <w:tc>
           <w:tcPr>
-            <w:tcW w:w="1169" w:type="dxa"/>
+            <w:tcW w:w="1189" w:type="dxa"/>
           </w:tcPr>
           <w:p>
             <w:r>
@@ -14674,7 +14816,7 @@
         </w:tc>
         <w:tc>
           <w:tcPr>
-            <w:tcW w:w="1169" w:type="dxa"/>
+            <w:tcW w:w="1189" w:type="dxa"/>
           </w:tcPr>
           <w:p>
             <w:r>
@@ -14692,7 +14834,7 @@
         </w:trPr>
         <w:tc>
           <w:tcPr>
-            <w:tcW w:w="3960" w:type="dxa"/>
+            <w:tcW w:w="3920" w:type="dxa"/>
           </w:tcPr>
           <w:p>
             <w:r>
@@ -14705,7 +14847,7 @@
         </w:tc>
         <w:tc>
           <w:tcPr>
-            <w:tcW w:w="1169" w:type="dxa"/>
+            <w:tcW w:w="1189" w:type="dxa"/>
           </w:tcPr>
           <w:p>
             <w:r>
@@ -14731,7 +14873,7 @@
         </w:tc>
         <w:tc>
           <w:tcPr>
-            <w:tcW w:w="1169" w:type="dxa"/>
+            <w:tcW w:w="1189" w:type="dxa"/>
           </w:tcPr>
           <w:p>
             <w:r>
@@ -14749,7 +14891,7 @@
         </w:trPr>
         <w:tc>
           <w:tcPr>
-            <w:tcW w:w="3960" w:type="dxa"/>
+            <w:tcW w:w="3920" w:type="dxa"/>
           </w:tcPr>
           <w:p>
             <w:r>
@@ -14762,7 +14904,7 @@
         </w:tc>
         <w:tc>
           <w:tcPr>
-            <w:tcW w:w="1169" w:type="dxa"/>
+            <w:tcW w:w="1189" w:type="dxa"/>
           </w:tcPr>
           <w:p>
             <w:r>
@@ -14788,7 +14930,7 @@
         </w:tc>
         <w:tc>
           <w:tcPr>
-            <w:tcW w:w="1169" w:type="dxa"/>
+            <w:tcW w:w="1189" w:type="dxa"/>
           </w:tcPr>
           <w:p>
             <w:r>
@@ -14806,7 +14948,7 @@
         </w:trPr>
         <w:tc>
           <w:tcPr>
-            <w:tcW w:w="3960" w:type="dxa"/>
+            <w:tcW w:w="3920" w:type="dxa"/>
           </w:tcPr>
           <w:p>
             <w:r>
@@ -14819,7 +14961,7 @@
         </w:tc>
         <w:tc>
           <w:tcPr>
-            <w:tcW w:w="1169" w:type="dxa"/>
+            <w:tcW w:w="1189" w:type="dxa"/>
           </w:tcPr>
           <w:p>
             <w:r>
@@ -14845,7 +14987,7 @@
         </w:tc>
         <w:tc>
           <w:tcPr>
-            <w:tcW w:w="1169" w:type="dxa"/>
+            <w:tcW w:w="1189" w:type="dxa"/>
           </w:tcPr>
           <w:p>
             <w:r>
@@ -14863,7 +15005,7 @@
         </w:trPr>
         <w:tc>
           <w:tcPr>
-            <w:tcW w:w="3960" w:type="dxa"/>
+            <w:tcW w:w="3920" w:type="dxa"/>
           </w:tcPr>
           <w:p>
             <w:r>
@@ -14876,7 +15018,7 @@
         </w:tc>
         <w:tc>
           <w:tcPr>
-            <w:tcW w:w="1169" w:type="dxa"/>
+            <w:tcW w:w="1189" w:type="dxa"/>
           </w:tcPr>
           <w:p>
             <w:r>
@@ -14902,7 +15044,7 @@
         </w:tc>
         <w:tc>
           <w:tcPr>
-            <w:tcW w:w="1169" w:type="dxa"/>
+            <w:tcW w:w="1189" w:type="dxa"/>
           </w:tcPr>
           <w:p>
             <w:r>
@@ -14920,7 +15062,7 @@
         </w:trPr>
         <w:tc>
           <w:tcPr>
-            <w:tcW w:w="3960" w:type="dxa"/>
+            <w:tcW w:w="3920" w:type="dxa"/>
           </w:tcPr>
           <w:p>
             <w:r>
@@ -14933,7 +15075,7 @@
         </w:tc>
         <w:tc>
           <w:tcPr>
-            <w:tcW w:w="1169" w:type="dxa"/>
+            <w:tcW w:w="1189" w:type="dxa"/>
           </w:tcPr>
           <w:p>
             <w:r>
@@ -14959,7 +15101,7 @@
         </w:tc>
         <w:tc>
           <w:tcPr>
-            <w:tcW w:w="1169" w:type="dxa"/>
+            <w:tcW w:w="1189" w:type="dxa"/>
           </w:tcPr>
           <w:p>
             <w:r>
@@ -16131,31 +16273,31 @@
       </w:rPr>
     </w:lvl>
   </w:abstractNum>
-  <w:num w:numId="1" w16cid:durableId="726496284">
+  <w:num w:numId="1" w16cid:durableId="676074986">
     <w:abstractNumId w:val="8"/>
   </w:num>
-  <w:num w:numId="2" w16cid:durableId="1165509764">
+  <w:num w:numId="2" w16cid:durableId="417603839">
     <w:abstractNumId w:val="6"/>
   </w:num>
-  <w:num w:numId="3" w16cid:durableId="570769842">
+  <w:num w:numId="3" w16cid:durableId="1885092444">
     <w:abstractNumId w:val="5"/>
   </w:num>
-  <w:num w:numId="4" w16cid:durableId="1639800082">
+  <w:num w:numId="4" w16cid:durableId="1222405895">
     <w:abstractNumId w:val="4"/>
   </w:num>
-  <w:num w:numId="5" w16cid:durableId="909192320">
+  <w:num w:numId="5" w16cid:durableId="2007904922">
     <w:abstractNumId w:val="7"/>
   </w:num>
-  <w:num w:numId="6" w16cid:durableId="989866266">
+  <w:num w:numId="6" w16cid:durableId="757412577">
     <w:abstractNumId w:val="3"/>
   </w:num>
-  <w:num w:numId="7" w16cid:durableId="729764793">
+  <w:num w:numId="7" w16cid:durableId="2061897019">
     <w:abstractNumId w:val="2"/>
   </w:num>
-  <w:num w:numId="8" w16cid:durableId="1686052822">
+  <w:num w:numId="8" w16cid:durableId="1724402813">
     <w:abstractNumId w:val="1"/>
   </w:num>
-  <w:num w:numId="9" w16cid:durableId="1747219214">
+  <w:num w:numId="9" w16cid:durableId="934361107">
     <w:abstractNumId w:val="0"/>
   </w:num>
 </w:numbering>
@@ -27576,7 +27718,7 @@
     <w:uiPriority w:val="39"/>
     <w:semiHidden/>
     <w:unhideWhenUsed/>
-    <w:rsid w:val="007B190A"/>
+    <w:rsid w:val="004A1715"/>
     <w:pPr>
       <w:spacing w:after="0"/>
     </w:pPr>
@@ -27592,7 +27734,7 @@
     <w:uiPriority w:val="39"/>
     <w:semiHidden/>
     <w:unhideWhenUsed/>
-    <w:rsid w:val="007B190A"/>
+    <w:rsid w:val="004A1715"/>
     <w:pPr>
       <w:spacing w:after="0"/>
       <w:ind w:left="210"/>
@@ -27609,7 +27751,7 @@
     <w:uiPriority w:val="39"/>
     <w:semiHidden/>
     <w:unhideWhenUsed/>
-    <w:rsid w:val="007B190A"/>
+    <w:rsid w:val="004A1715"/>
     <w:pPr>
       <w:spacing w:after="0"/>
       <w:ind w:left="420"/>

</xml_diff>

<commit_message>
docs(deliverables): demo:keep, confirm outcome and 22 intents
The README review found lines that no longer match the code or the
changes landing for the submission.

- Technical document: pnpm demo:keep in the quickstart and the demo
  limits; after confirming, FLOW says what was saved and where
- TEST_CASES and SYSTEM_WALKTHROUGH: 22 intents, as the registry has
- figures README: fig5 source path relative to figures/

Tests: build_deliverables.py verification passes for all three
documents.
Refs: docs/deliverables/evidence/EVIDENCE_PACK.md
</commit_message>
<xml_diff>
--- a/docs/deliverables/out/Technical_Document.docx
+++ b/docs/deliverables/out/Technical_Document.docx
@@ -11580,7 +11580,7 @@
         <w:rPr>
           <w:sz w:val="20"/>
         </w:rPr>
-        <w:t>A confirmed document never changes the books.</w:t>
+        <w:t>A confirmed document never changes the books. After confirming, FLOW says what was saved, under which customer, and that the forecast is unchanged.</w:t>
       </w:r>
     </w:p>
     <w:p>
@@ -12794,6 +12794,42 @@
           <w:rFonts w:ascii="Courier New" w:hAnsi="Courier New"/>
           <w:sz w:val="18"/>
         </w:rPr>
+        <w:t>pnpm demo:keep</w:t>
+      </w:r>
+      <w:r>
+        <w:rPr>
+          <w:sz w:val="20"/>
+        </w:rPr>
+        <w:t xml:space="preserve"> keeps the books in a local file, so uploads, confirmations and the day survive a restart; </w:t>
+      </w:r>
+      <w:r>
+        <w:rPr>
+          <w:rFonts w:ascii="Courier New" w:hAnsi="Courier New"/>
+          <w:sz w:val="18"/>
+        </w:rPr>
+        <w:t>pnpm demo:keep --fresh</w:t>
+      </w:r>
+      <w:r>
+        <w:rPr>
+          <w:sz w:val="20"/>
+        </w:rPr>
+        <w:t xml:space="preserve"> starts over.</w:t>
+      </w:r>
+    </w:p>
+    <w:p>
+      <w:pPr>
+        <w:pStyle w:val="ListBullet2"/>
+        <w:tabs>
+          <w:tab w:pos="792" w:val="left"/>
+        </w:tabs>
+        <w:spacing w:before="0" w:after="60" w:line="259" w:lineRule="auto"/>
+        <w:ind w:left="792" w:hanging="288"/>
+      </w:pPr>
+      <w:r>
+        <w:rPr>
+          <w:rFonts w:ascii="Courier New" w:hAnsi="Courier New"/>
+          <w:sz w:val="18"/>
+        </w:rPr>
         <w:t>pnpm demo:blank</w:t>
       </w:r>
       <w:r>
@@ -14552,13 +14588,39 @@
           <w:b/>
           <w:sz w:val="20"/>
         </w:rPr>
-        <w:t>The demo forgets on restart.</w:t>
-      </w:r>
-      <w:r>
-        <w:rPr>
-          <w:sz w:val="20"/>
-        </w:rPr>
-        <w:t xml:space="preserve"> The demo keeps the books in memory, so restarting it starts fresh.</w:t>
+        <w:t>The plain demo forgets on restart.</w:t>
+      </w:r>
+      <w:r>
+        <w:rPr>
+          <w:sz w:val="20"/>
+        </w:rPr>
+        <w:t xml:space="preserve"> </w:t>
+      </w:r>
+      <w:r>
+        <w:rPr>
+          <w:rFonts w:ascii="Courier New" w:hAnsi="Courier New"/>
+          <w:sz w:val="18"/>
+        </w:rPr>
+        <w:t>pnpm demo</w:t>
+      </w:r>
+      <w:r>
+        <w:rPr>
+          <w:sz w:val="20"/>
+        </w:rPr>
+        <w:t xml:space="preserve"> keeps the books in memory, so restarting it starts fresh. </w:t>
+      </w:r>
+      <w:r>
+        <w:rPr>
+          <w:rFonts w:ascii="Courier New" w:hAnsi="Courier New"/>
+          <w:sz w:val="18"/>
+        </w:rPr>
+        <w:t>pnpm demo:keep</w:t>
+      </w:r>
+      <w:r>
+        <w:rPr>
+          <w:sz w:val="20"/>
+        </w:rPr>
+        <w:t xml:space="preserve"> keeps them in a local SQLite file instead.</w:t>
       </w:r>
     </w:p>
     <w:p>

</xml_diff>

<commit_message>
docs(deliverables): disclose the demo company's single payroll
The demo books hold one payroll, on day 12, sized for the 60-day
story; their 120-day forecast is optimistic after day 30. Real books
from setup repeat payroll. The owner chose to disclose it rather than
move every golden value three days before the deadline.

- Known limitations: the demo company is a fixed test set

Tests: build_deliverables.py verification passes.
Refs: fixtures/scenarios/golden_sme.json
</commit_message>
<xml_diff>
--- a/docs/deliverables/out/Technical_Document.docx
+++ b/docs/deliverables/out/Technical_Document.docx
@@ -14932,6 +14932,29 @@
           <w:sz w:val="20"/>
         </w:rPr>
         <w:t xml:space="preserve"> The demo replays recorded model readings. A new document gets the rules reading unless live mode is on.</w:t>
+      </w:r>
+    </w:p>
+    <w:p>
+      <w:pPr>
+        <w:pStyle w:val="ListBullet2"/>
+        <w:tabs>
+          <w:tab w:pos="792" w:val="left"/>
+        </w:tabs>
+        <w:spacing w:before="0" w:after="60" w:line="259" w:lineRule="auto"/>
+        <w:ind w:left="792" w:hanging="288"/>
+      </w:pPr>
+      <w:r>
+        <w:rPr>
+          <w:b/>
+          <w:sz w:val="20"/>
+        </w:rPr>
+        <w:t>The demo company is a fixed test set.</w:t>
+      </w:r>
+      <w:r>
+        <w:rPr>
+          <w:sz w:val="20"/>
+        </w:rPr>
+        <w:t xml:space="preserve"> Its books hold one payroll (¥340,000 on day 12), sized for the 60-day story, so its 120-day forecast has no later payrolls and is optimistic after day 30. No decision in the story depends on that period. Books opened through setup repeat payroll monthly (or quarterly or yearly) across the whole forecast.</w:t>
       </w:r>
     </w:p>
     <w:p>

</xml_diff>

<commit_message>
docs(deliverables): drop the demo payroll line from limitations
The owner asked not to list it in the technical document.

- Revert 98fd94c6

Tests: build_deliverables.py verification passes.
Refs: 98fd94c6
</commit_message>
<xml_diff>
--- a/docs/deliverables/out/Technical_Document.docx
+++ b/docs/deliverables/out/Technical_Document.docx
@@ -14932,29 +14932,6 @@
           <w:sz w:val="20"/>
         </w:rPr>
         <w:t xml:space="preserve"> The demo replays recorded model readings. A new document gets the rules reading unless live mode is on.</w:t>
-      </w:r>
-    </w:p>
-    <w:p>
-      <w:pPr>
-        <w:pStyle w:val="ListBullet2"/>
-        <w:tabs>
-          <w:tab w:pos="792" w:val="left"/>
-        </w:tabs>
-        <w:spacing w:before="0" w:after="60" w:line="259" w:lineRule="auto"/>
-        <w:ind w:left="792" w:hanging="288"/>
-      </w:pPr>
-      <w:r>
-        <w:rPr>
-          <w:b/>
-          <w:sz w:val="20"/>
-        </w:rPr>
-        <w:t>The demo company is a fixed test set.</w:t>
-      </w:r>
-      <w:r>
-        <w:rPr>
-          <w:sz w:val="20"/>
-        </w:rPr>
-        <w:t xml:space="preserve"> Its books hold one payroll (¥340,000 on day 12), sized for the 60-day story, so its 120-day forecast has no later payrolls and is optimistic after day 30. No decision in the story depends on that period. Books opened through setup repeat payroll monthly (or quarterly or yearly) across the whole forecast.</w:t>
       </w:r>
     </w:p>
     <w:p>

</xml_diff>

<commit_message>
docs(deliverables): owner questions answered from the books; 23 intents
Batch 6 added the question gate and the read-only answer module; the
technical document now reports what they measure and how the chat
treats a question.

- At-a-glance table and Table 9: 288 of 503 owner-question asks
  answered from the books, 0 wrong, all 30 priority questions answered
- Section 03: 23 intents; a question is answered, never acted on
- Table 13: the baseline command and its result on dev 3f0ed53e
- TEST_CASES and SYSTEM_WALKTHROUGH: 23 intents

Tests: build_deliverables.py verification passes for all three
documents.
Refs: services/api/evals/owner_questions/BASELINE.md
</commit_message>
<xml_diff>
--- a/docs/deliverables/out/Technical_Document.docx
+++ b/docs/deliverables/out/Technical_Document.docx
@@ -242,7 +242,7 @@
         </w:trPr>
         <w:tc>
           <w:tcPr>
-            <w:tcW w:type="dxa" w:w="1336"/>
+            <w:tcW w:type="dxa" w:w="1508"/>
             <w:shd w:val="clear" w:color="auto" w:fill="E8EEFB"/>
           </w:tcPr>
           <w:p>
@@ -261,7 +261,7 @@
         </w:tc>
         <w:tc>
           <w:tcPr>
-            <w:tcW w:type="dxa" w:w="8024"/>
+            <w:tcW w:type="dxa" w:w="7852"/>
             <w:shd w:val="clear" w:color="auto" w:fill="E8EEFB"/>
           </w:tcPr>
           <w:p>
@@ -285,7 +285,7 @@
         </w:trPr>
         <w:tc>
           <w:tcPr>
-            <w:tcW w:type="dxa" w:w="1336"/>
+            <w:tcW w:type="dxa" w:w="1508"/>
           </w:tcPr>
           <w:p>
             <w:pPr>
@@ -301,7 +301,7 @@
         </w:tc>
         <w:tc>
           <w:tcPr>
-            <w:tcW w:type="dxa" w:w="8024"/>
+            <w:tcW w:type="dxa" w:w="7852"/>
           </w:tcPr>
           <w:p>
             <w:pPr>
@@ -322,7 +322,7 @@
         </w:trPr>
         <w:tc>
           <w:tcPr>
-            <w:tcW w:type="dxa" w:w="1336"/>
+            <w:tcW w:type="dxa" w:w="1508"/>
           </w:tcPr>
           <w:p>
             <w:pPr>
@@ -338,7 +338,7 @@
         </w:tc>
         <w:tc>
           <w:tcPr>
-            <w:tcW w:type="dxa" w:w="8024"/>
+            <w:tcW w:type="dxa" w:w="7852"/>
           </w:tcPr>
           <w:p>
             <w:pPr>
@@ -359,7 +359,7 @@
         </w:trPr>
         <w:tc>
           <w:tcPr>
-            <w:tcW w:type="dxa" w:w="1336"/>
+            <w:tcW w:type="dxa" w:w="1508"/>
           </w:tcPr>
           <w:p>
             <w:pPr>
@@ -375,7 +375,7 @@
         </w:tc>
         <w:tc>
           <w:tcPr>
-            <w:tcW w:type="dxa" w:w="8024"/>
+            <w:tcW w:type="dxa" w:w="7852"/>
           </w:tcPr>
           <w:p>
             <w:pPr>
@@ -396,7 +396,7 @@
         </w:trPr>
         <w:tc>
           <w:tcPr>
-            <w:tcW w:type="dxa" w:w="1336"/>
+            <w:tcW w:type="dxa" w:w="1508"/>
           </w:tcPr>
           <w:p>
             <w:pPr>
@@ -412,7 +412,7 @@
         </w:tc>
         <w:tc>
           <w:tcPr>
-            <w:tcW w:type="dxa" w:w="8024"/>
+            <w:tcW w:type="dxa" w:w="7852"/>
           </w:tcPr>
           <w:p>
             <w:pPr>
@@ -433,7 +433,7 @@
         </w:trPr>
         <w:tc>
           <w:tcPr>
-            <w:tcW w:type="dxa" w:w="1336"/>
+            <w:tcW w:type="dxa" w:w="1508"/>
           </w:tcPr>
           <w:p>
             <w:pPr>
@@ -449,7 +449,7 @@
         </w:tc>
         <w:tc>
           <w:tcPr>
-            <w:tcW w:type="dxa" w:w="8024"/>
+            <w:tcW w:type="dxa" w:w="7852"/>
           </w:tcPr>
           <w:p>
             <w:pPr>
@@ -470,7 +470,7 @@
         </w:trPr>
         <w:tc>
           <w:tcPr>
-            <w:tcW w:type="dxa" w:w="1336"/>
+            <w:tcW w:type="dxa" w:w="1508"/>
           </w:tcPr>
           <w:p>
             <w:pPr>
@@ -486,7 +486,7 @@
         </w:tc>
         <w:tc>
           <w:tcPr>
-            <w:tcW w:type="dxa" w:w="8024"/>
+            <w:tcW w:type="dxa" w:w="7852"/>
           </w:tcPr>
           <w:p>
             <w:pPr>
@@ -507,7 +507,7 @@
         </w:trPr>
         <w:tc>
           <w:tcPr>
-            <w:tcW w:type="dxa" w:w="1336"/>
+            <w:tcW w:type="dxa" w:w="1508"/>
           </w:tcPr>
           <w:p>
             <w:pPr>
@@ -523,7 +523,7 @@
         </w:tc>
         <w:tc>
           <w:tcPr>
-            <w:tcW w:type="dxa" w:w="8024"/>
+            <w:tcW w:type="dxa" w:w="7852"/>
           </w:tcPr>
           <w:p>
             <w:pPr>
@@ -544,33 +544,33 @@
         </w:trPr>
         <w:tc>
           <w:tcPr>
-            <w:tcW w:type="dxa" w:w="1336"/>
-          </w:tcPr>
-          <w:p>
-            <w:pPr>
-              <w:spacing w:before="20" w:after="20" w:line="240" w:lineRule="auto"/>
-            </w:pPr>
-            <w:r>
-              <w:rPr>
-                <w:sz w:val="18"/>
-              </w:rPr>
-              <w:t>Tests</w:t>
-            </w:r>
-          </w:p>
-        </w:tc>
-        <w:tc>
-          <w:tcPr>
-            <w:tcW w:type="dxa" w:w="8024"/>
-          </w:tcPr>
-          <w:p>
-            <w:pPr>
-              <w:spacing w:before="20" w:after="20" w:line="240" w:lineRule="auto"/>
-            </w:pPr>
-            <w:r>
-              <w:rPr>
-                <w:sz w:val="18"/>
-              </w:rPr>
-              <w:t>9,085 API tests (9,040 passed, 1 known machine-specific hash failure, the rest skipped by design), 169 web unit tests, 445 mock and 139 live browser tests</w:t>
+            <w:tcW w:type="dxa" w:w="1508"/>
+          </w:tcPr>
+          <w:p>
+            <w:pPr>
+              <w:spacing w:before="20" w:after="20" w:line="240" w:lineRule="auto"/>
+            </w:pPr>
+            <w:r>
+              <w:rPr>
+                <w:sz w:val="18"/>
+              </w:rPr>
+              <w:t>Owner questions</w:t>
+            </w:r>
+          </w:p>
+        </w:tc>
+        <w:tc>
+          <w:tcPr>
+            <w:tcW w:type="dxa" w:w="7852"/>
+          </w:tcPr>
+          <w:p>
+            <w:pPr>
+              <w:spacing w:before="20" w:after="20" w:line="240" w:lineRule="auto"/>
+            </w:pPr>
+            <w:r>
+              <w:rPr>
+                <w:sz w:val="18"/>
+              </w:rPr>
+              <w:t>Ask FLOW answers 288 of 503 owner, CEO and CFO questions (122 questions in English and Chinese, with rewordings) directly from the books, with 0 wrong answers. A question is answered, never acted on</w:t>
             </w:r>
           </w:p>
         </w:tc>
@@ -581,7 +581,44 @@
         </w:trPr>
         <w:tc>
           <w:tcPr>
-            <w:tcW w:type="dxa" w:w="1336"/>
+            <w:tcW w:type="dxa" w:w="1508"/>
+          </w:tcPr>
+          <w:p>
+            <w:pPr>
+              <w:spacing w:before="20" w:after="20" w:line="240" w:lineRule="auto"/>
+            </w:pPr>
+            <w:r>
+              <w:rPr>
+                <w:sz w:val="18"/>
+              </w:rPr>
+              <w:t>Tests</w:t>
+            </w:r>
+          </w:p>
+        </w:tc>
+        <w:tc>
+          <w:tcPr>
+            <w:tcW w:type="dxa" w:w="7852"/>
+          </w:tcPr>
+          <w:p>
+            <w:pPr>
+              <w:spacing w:before="20" w:after="20" w:line="240" w:lineRule="auto"/>
+            </w:pPr>
+            <w:r>
+              <w:rPr>
+                <w:sz w:val="18"/>
+              </w:rPr>
+              <w:t>9,085 API tests (9,040 passed, 1 known machine-specific hash failure, the rest skipped by design), 169 web unit tests, 445 mock and 139 live browser tests</w:t>
+            </w:r>
+          </w:p>
+        </w:tc>
+      </w:tr>
+      <w:tr>
+        <w:trPr>
+          <w:cantSplit w:val="true"/>
+        </w:trPr>
+        <w:tc>
+          <w:tcPr>
+            <w:tcW w:type="dxa" w:w="1508"/>
           </w:tcPr>
           <w:p>
             <w:pPr>
@@ -597,7 +634,7 @@
         </w:tc>
         <w:tc>
           <w:tcPr>
-            <w:tcW w:type="dxa" w:w="8024"/>
+            <w:tcW w:type="dxa" w:w="7852"/>
           </w:tcPr>
           <w:p>
             <w:pPr>
@@ -4606,13 +4643,36 @@
           <w:b/>
           <w:sz w:val="20"/>
         </w:rPr>
-        <w:t>A deterministic parser (Chinese and English) maps each chat request to one of 22 intents</w:t>
-      </w:r>
-      <w:r>
-        <w:rPr>
-          <w:sz w:val="20"/>
-        </w:rPr>
-        <w:t xml:space="preserve"> and fills typed slots. Examples: evaluate an offer, negotiate, speed up a receipt, fund a gap, show status, compare financing, explain, what-if, approve, reject, out of scope.</w:t>
+        <w:t>A deterministic parser (Chinese and English) maps each chat request to one of 23 intents</w:t>
+      </w:r>
+      <w:r>
+        <w:rPr>
+          <w:sz w:val="20"/>
+        </w:rPr>
+        <w:t xml:space="preserve"> and fills typed slots. Examples: evaluate an offer, negotiate, speed up a receipt, fund a gap, show status, compare financing, explain, what-if, approve, reject, answer from the books, out of scope.</w:t>
+      </w:r>
+    </w:p>
+    <w:p>
+      <w:pPr>
+        <w:pStyle w:val="ListBullet2"/>
+        <w:tabs>
+          <w:tab w:pos="792" w:val="left"/>
+        </w:tabs>
+        <w:spacing w:before="0" w:after="60" w:line="259" w:lineRule="auto"/>
+        <w:ind w:left="792" w:hanging="288"/>
+      </w:pPr>
+      <w:r>
+        <w:rPr>
+          <w:b/>
+          <w:sz w:val="20"/>
+        </w:rPr>
+        <w:t>A question is answered, never acted on.</w:t>
+      </w:r>
+      <w:r>
+        <w:rPr>
+          <w:sz w:val="20"/>
+        </w:rPr>
+        <w:t xml:space="preserve"> A question gate runs before every action rule. "Can we pay off our loans?" is answered from the books; it never proposes a repayment, compiles an offer, queues anything or writes to the log. Answers come from a read-only module of about 40 figures computed by the engine's own functions, so every number is the one the screens show, and each answer leads with the yes, the no or the figure.</w:t>
       </w:r>
     </w:p>
     <w:p>
@@ -9954,7 +10014,7 @@
         </w:trPr>
         <w:tc>
           <w:tcPr>
-            <w:tcW w:type="dxa" w:w="2832"/>
+            <w:tcW w:type="dxa" w:w="3133"/>
             <w:shd w:val="clear" w:color="auto" w:fill="E8EEFB"/>
           </w:tcPr>
           <w:p>
@@ -9973,7 +10033,7 @@
         </w:tc>
         <w:tc>
           <w:tcPr>
-            <w:tcW w:type="dxa" w:w="6528"/>
+            <w:tcW w:type="dxa" w:w="6227"/>
             <w:shd w:val="clear" w:color="auto" w:fill="E8EEFB"/>
           </w:tcPr>
           <w:p>
@@ -9997,7 +10057,7 @@
         </w:trPr>
         <w:tc>
           <w:tcPr>
-            <w:tcW w:type="dxa" w:w="2832"/>
+            <w:tcW w:type="dxa" w:w="3133"/>
           </w:tcPr>
           <w:p>
             <w:pPr>
@@ -10013,7 +10073,7 @@
         </w:tc>
         <w:tc>
           <w:tcPr>
-            <w:tcW w:type="dxa" w:w="6528"/>
+            <w:tcW w:type="dxa" w:w="6227"/>
           </w:tcPr>
           <w:p>
             <w:pPr>
@@ -10034,7 +10094,7 @@
         </w:trPr>
         <w:tc>
           <w:tcPr>
-            <w:tcW w:type="dxa" w:w="2832"/>
+            <w:tcW w:type="dxa" w:w="3133"/>
           </w:tcPr>
           <w:p>
             <w:pPr>
@@ -10050,7 +10110,7 @@
         </w:tc>
         <w:tc>
           <w:tcPr>
-            <w:tcW w:type="dxa" w:w="6528"/>
+            <w:tcW w:type="dxa" w:w="6227"/>
           </w:tcPr>
           <w:p>
             <w:pPr>
@@ -10068,7 +10128,7 @@
       <w:tr>
         <w:tc>
           <w:tcPr>
-            <w:tcW w:type="dxa" w:w="2832"/>
+            <w:tcW w:type="dxa" w:w="3133"/>
           </w:tcPr>
           <w:p>
             <w:pPr>
@@ -10084,7 +10144,7 @@
         </w:tc>
         <w:tc>
           <w:tcPr>
-            <w:tcW w:type="dxa" w:w="6528"/>
+            <w:tcW w:type="dxa" w:w="6227"/>
           </w:tcPr>
           <w:p>
             <w:pPr>
@@ -10105,7 +10165,7 @@
         </w:trPr>
         <w:tc>
           <w:tcPr>
-            <w:tcW w:type="dxa" w:w="2832"/>
+            <w:tcW w:type="dxa" w:w="3133"/>
           </w:tcPr>
           <w:p>
             <w:pPr>
@@ -10121,7 +10181,7 @@
         </w:tc>
         <w:tc>
           <w:tcPr>
-            <w:tcW w:type="dxa" w:w="6528"/>
+            <w:tcW w:type="dxa" w:w="6227"/>
           </w:tcPr>
           <w:p>
             <w:pPr>
@@ -10142,7 +10202,7 @@
         </w:trPr>
         <w:tc>
           <w:tcPr>
-            <w:tcW w:type="dxa" w:w="2832"/>
+            <w:tcW w:type="dxa" w:w="3133"/>
           </w:tcPr>
           <w:p>
             <w:pPr>
@@ -10158,7 +10218,7 @@
         </w:tc>
         <w:tc>
           <w:tcPr>
-            <w:tcW w:type="dxa" w:w="6528"/>
+            <w:tcW w:type="dxa" w:w="6227"/>
           </w:tcPr>
           <w:p>
             <w:pPr>
@@ -10179,7 +10239,7 @@
         </w:trPr>
         <w:tc>
           <w:tcPr>
-            <w:tcW w:type="dxa" w:w="2832"/>
+            <w:tcW w:type="dxa" w:w="3133"/>
           </w:tcPr>
           <w:p>
             <w:pPr>
@@ -10195,7 +10255,7 @@
         </w:tc>
         <w:tc>
           <w:tcPr>
-            <w:tcW w:type="dxa" w:w="6528"/>
+            <w:tcW w:type="dxa" w:w="6227"/>
           </w:tcPr>
           <w:p>
             <w:pPr>
@@ -10206,6 +10266,53 @@
                 <w:sz w:val="18"/>
               </w:rPr>
               <w:t>49/49 scripted chat tasks (87 turns); every evidence chain verifies, and a tampered copy is rejected</w:t>
+            </w:r>
+          </w:p>
+        </w:tc>
+      </w:tr>
+      <w:tr>
+        <w:tc>
+          <w:tcPr>
+            <w:tcW w:type="dxa" w:w="3133"/>
+          </w:tcPr>
+          <w:p>
+            <w:pPr>
+              <w:spacing w:before="20" w:after="20" w:line="240" w:lineRule="auto"/>
+            </w:pPr>
+            <w:r>
+              <w:rPr>
+                <w:sz w:val="18"/>
+              </w:rPr>
+              <w:t>Does it answer an owner's questions?</w:t>
+            </w:r>
+          </w:p>
+        </w:tc>
+        <w:tc>
+          <w:tcPr>
+            <w:tcW w:type="dxa" w:w="6227"/>
+          </w:tcPr>
+          <w:p>
+            <w:pPr>
+              <w:spacing w:before="20" w:after="20" w:line="240" w:lineRule="auto"/>
+            </w:pPr>
+            <w:r>
+              <w:rPr>
+                <w:sz w:val="18"/>
+              </w:rPr>
+              <w:t xml:space="preserve">A bank of 122 owner, CEO and CFO questions in English and Chinese, with rewordings (503 asks): 288 answered directly from the books (57%), 38 partly, 0 wrong, 177 declined honestly, naming the nearest thing FLOW can show. All 30 priority questions are answered in every wording. No question executes or queues anything (dev </w:t>
+            </w:r>
+            <w:r>
+              <w:rPr>
+                <w:rFonts w:ascii="Courier New" w:hAnsi="Courier New"/>
+                <w:sz w:val="18"/>
+              </w:rPr>
+              <w:t>3f0ed53e</w:t>
+            </w:r>
+            <w:r>
+              <w:rPr>
+                <w:sz w:val="18"/>
+              </w:rPr>
+              <w:t>, 17 Oct)</w:t>
             </w:r>
           </w:p>
         </w:tc>
@@ -10216,7 +10323,7 @@
         </w:trPr>
         <w:tc>
           <w:tcPr>
-            <w:tcW w:type="dxa" w:w="2832"/>
+            <w:tcW w:type="dxa" w:w="3133"/>
           </w:tcPr>
           <w:p>
             <w:pPr>
@@ -10232,7 +10339,7 @@
         </w:tc>
         <w:tc>
           <w:tcPr>
-            <w:tcW w:type="dxa" w:w="6528"/>
+            <w:tcW w:type="dxa" w:w="6227"/>
           </w:tcPr>
           <w:p>
             <w:pPr>
@@ -10253,7 +10360,7 @@
         </w:trPr>
         <w:tc>
           <w:tcPr>
-            <w:tcW w:type="dxa" w:w="2832"/>
+            <w:tcW w:type="dxa" w:w="3133"/>
           </w:tcPr>
           <w:p>
             <w:pPr>
@@ -10269,7 +10376,7 @@
         </w:tc>
         <w:tc>
           <w:tcPr>
-            <w:tcW w:type="dxa" w:w="6528"/>
+            <w:tcW w:type="dxa" w:w="6227"/>
           </w:tcPr>
           <w:p>
             <w:pPr>
@@ -13391,7 +13498,7 @@
         </w:trPr>
         <w:tc>
           <w:tcPr>
-            <w:tcW w:type="dxa" w:w="1703"/>
+            <w:tcW w:type="dxa" w:w="1692"/>
             <w:shd w:val="clear" w:color="auto" w:fill="E8EEFB"/>
           </w:tcPr>
           <w:p>
@@ -13410,7 +13517,7 @@
         </w:tc>
         <w:tc>
           <w:tcPr>
-            <w:tcW w:type="dxa" w:w="4021"/>
+            <w:tcW w:type="dxa" w:w="4084"/>
             <w:shd w:val="clear" w:color="auto" w:fill="E8EEFB"/>
           </w:tcPr>
           <w:p>
@@ -13429,7 +13536,7 @@
         </w:tc>
         <w:tc>
           <w:tcPr>
-            <w:tcW w:type="dxa" w:w="3635"/>
+            <w:tcW w:type="dxa" w:w="3585"/>
             <w:shd w:val="clear" w:color="auto" w:fill="E8EEFB"/>
           </w:tcPr>
           <w:p>
@@ -13453,7 +13560,7 @@
         </w:trPr>
         <w:tc>
           <w:tcPr>
-            <w:tcW w:type="dxa" w:w="1703"/>
+            <w:tcW w:type="dxa" w:w="1692"/>
           </w:tcPr>
           <w:p>
             <w:pPr>
@@ -13469,7 +13576,7 @@
         </w:tc>
         <w:tc>
           <w:tcPr>
-            <w:tcW w:type="dxa" w:w="4021"/>
+            <w:tcW w:type="dxa" w:w="4084"/>
           </w:tcPr>
           <w:p>
             <w:pPr>
@@ -13492,7 +13599,7 @@
         </w:tc>
         <w:tc>
           <w:tcPr>
-            <w:tcW w:type="dxa" w:w="3635"/>
+            <w:tcW w:type="dxa" w:w="3585"/>
           </w:tcPr>
           <w:p>
             <w:pPr>
@@ -13513,7 +13620,7 @@
         </w:trPr>
         <w:tc>
           <w:tcPr>
-            <w:tcW w:type="dxa" w:w="1703"/>
+            <w:tcW w:type="dxa" w:w="1692"/>
           </w:tcPr>
           <w:p>
             <w:pPr>
@@ -13529,7 +13636,7 @@
         </w:tc>
         <w:tc>
           <w:tcPr>
-            <w:tcW w:type="dxa" w:w="4021"/>
+            <w:tcW w:type="dxa" w:w="4084"/>
           </w:tcPr>
           <w:p>
             <w:pPr>
@@ -13578,7 +13685,7 @@
         </w:tc>
         <w:tc>
           <w:tcPr>
-            <w:tcW w:type="dxa" w:w="3635"/>
+            <w:tcW w:type="dxa" w:w="3585"/>
           </w:tcPr>
           <w:p>
             <w:pPr>
@@ -13599,7 +13706,7 @@
         </w:trPr>
         <w:tc>
           <w:tcPr>
-            <w:tcW w:type="dxa" w:w="1703"/>
+            <w:tcW w:type="dxa" w:w="1692"/>
           </w:tcPr>
           <w:p>
             <w:pPr>
@@ -13615,7 +13722,7 @@
         </w:tc>
         <w:tc>
           <w:tcPr>
-            <w:tcW w:type="dxa" w:w="4021"/>
+            <w:tcW w:type="dxa" w:w="4084"/>
           </w:tcPr>
           <w:p>
             <w:pPr>
@@ -13638,7 +13745,7 @@
         </w:tc>
         <w:tc>
           <w:tcPr>
-            <w:tcW w:type="dxa" w:w="3635"/>
+            <w:tcW w:type="dxa" w:w="3585"/>
           </w:tcPr>
           <w:p>
             <w:pPr>
@@ -13659,7 +13766,7 @@
         </w:trPr>
         <w:tc>
           <w:tcPr>
-            <w:tcW w:type="dxa" w:w="1703"/>
+            <w:tcW w:type="dxa" w:w="1692"/>
           </w:tcPr>
           <w:p>
             <w:pPr>
@@ -13675,7 +13782,7 @@
         </w:tc>
         <w:tc>
           <w:tcPr>
-            <w:tcW w:type="dxa" w:w="4021"/>
+            <w:tcW w:type="dxa" w:w="4084"/>
           </w:tcPr>
           <w:p>
             <w:pPr>
@@ -13698,7 +13805,7 @@
         </w:tc>
         <w:tc>
           <w:tcPr>
-            <w:tcW w:type="dxa" w:w="3635"/>
+            <w:tcW w:type="dxa" w:w="3585"/>
           </w:tcPr>
           <w:p>
             <w:pPr>
@@ -13719,7 +13826,7 @@
         </w:trPr>
         <w:tc>
           <w:tcPr>
-            <w:tcW w:type="dxa" w:w="1703"/>
+            <w:tcW w:type="dxa" w:w="1692"/>
           </w:tcPr>
           <w:p>
             <w:pPr>
@@ -13735,7 +13842,7 @@
         </w:tc>
         <w:tc>
           <w:tcPr>
-            <w:tcW w:type="dxa" w:w="4021"/>
+            <w:tcW w:type="dxa" w:w="4084"/>
           </w:tcPr>
           <w:p>
             <w:pPr>
@@ -13752,7 +13859,7 @@
         </w:tc>
         <w:tc>
           <w:tcPr>
-            <w:tcW w:type="dxa" w:w="3635"/>
+            <w:tcW w:type="dxa" w:w="3585"/>
           </w:tcPr>
           <w:p>
             <w:pPr>
@@ -13773,23 +13880,23 @@
         </w:trPr>
         <w:tc>
           <w:tcPr>
-            <w:tcW w:type="dxa" w:w="1703"/>
-          </w:tcPr>
-          <w:p>
-            <w:pPr>
-              <w:spacing w:before="20" w:after="20" w:line="240" w:lineRule="auto"/>
-            </w:pPr>
-            <w:r>
-              <w:rPr>
-                <w:sz w:val="18"/>
-              </w:rPr>
-              <w:t>Offline evaluation</w:t>
-            </w:r>
-          </w:p>
-        </w:tc>
-        <w:tc>
-          <w:tcPr>
-            <w:tcW w:type="dxa" w:w="4021"/>
+            <w:tcW w:type="dxa" w:w="1692"/>
+          </w:tcPr>
+          <w:p>
+            <w:pPr>
+              <w:spacing w:before="20" w:after="20" w:line="240" w:lineRule="auto"/>
+            </w:pPr>
+            <w:r>
+              <w:rPr>
+                <w:sz w:val="18"/>
+              </w:rPr>
+              <w:t>Owner questions</w:t>
+            </w:r>
+          </w:p>
+        </w:tc>
+        <w:tc>
+          <w:tcPr>
+            <w:tcW w:type="dxa" w:w="4084"/>
           </w:tcPr>
           <w:p>
             <w:pPr>
@@ -13800,29 +13907,36 @@
                 <w:rFonts w:ascii="Courier New" w:hAnsi="Courier New"/>
                 <w:sz w:val="18"/>
               </w:rPr>
-              <w:t>scripts/evaluate.py</w:t>
-            </w:r>
-            <w:r>
-              <w:rPr>
-                <w:sz w:val="18"/>
-              </w:rPr>
-              <w:t xml:space="preserve"> (7 min 41 s, including the funding brute force)</w:t>
-            </w:r>
-          </w:p>
-        </w:tc>
-        <w:tc>
-          <w:tcPr>
-            <w:tcW w:type="dxa" w:w="3635"/>
-          </w:tcPr>
-          <w:p>
-            <w:pPr>
-              <w:spacing w:before="20" w:after="20" w:line="240" w:lineRule="auto"/>
-            </w:pPr>
-            <w:r>
-              <w:rPr>
-                <w:sz w:val="18"/>
-              </w:rPr>
-              <w:t>every target met; figures in Tables 9 and 6</w:t>
+              <w:t>uv run python scripts/owner_questions_baseline.py</w:t>
+            </w:r>
+            <w:r>
+              <w:rPr>
+                <w:sz w:val="18"/>
+              </w:rPr>
+              <w:t xml:space="preserve"> (services/api), on dev </w:t>
+            </w:r>
+            <w:r>
+              <w:rPr>
+                <w:rFonts w:ascii="Courier New" w:hAnsi="Courier New"/>
+                <w:sz w:val="18"/>
+              </w:rPr>
+              <w:t>3f0ed53e</w:t>
+            </w:r>
+          </w:p>
+        </w:tc>
+        <w:tc>
+          <w:tcPr>
+            <w:tcW w:type="dxa" w:w="3585"/>
+          </w:tcPr>
+          <w:p>
+            <w:pPr>
+              <w:spacing w:before="20" w:after="20" w:line="240" w:lineRule="auto"/>
+            </w:pPr>
+            <w:r>
+              <w:rPr>
+                <w:sz w:val="18"/>
+              </w:rPr>
+              <w:t>288 answered, 38 partly, 0 wrong, 177 declined of 503</w:t>
             </w:r>
           </w:p>
         </w:tc>
@@ -13833,23 +13947,23 @@
         </w:trPr>
         <w:tc>
           <w:tcPr>
-            <w:tcW w:type="dxa" w:w="1703"/>
-          </w:tcPr>
-          <w:p>
-            <w:pPr>
-              <w:spacing w:before="20" w:after="20" w:line="240" w:lineRule="auto"/>
-            </w:pPr>
-            <w:r>
-              <w:rPr>
-                <w:sz w:val="18"/>
-              </w:rPr>
-              <w:t>Autonomy funnel</w:t>
-            </w:r>
-          </w:p>
-        </w:tc>
-        <w:tc>
-          <w:tcPr>
-            <w:tcW w:type="dxa" w:w="4021"/>
+            <w:tcW w:type="dxa" w:w="1692"/>
+          </w:tcPr>
+          <w:p>
+            <w:pPr>
+              <w:spacing w:before="20" w:after="20" w:line="240" w:lineRule="auto"/>
+            </w:pPr>
+            <w:r>
+              <w:rPr>
+                <w:sz w:val="18"/>
+              </w:rPr>
+              <w:t>Offline evaluation</w:t>
+            </w:r>
+          </w:p>
+        </w:tc>
+        <w:tc>
+          <w:tcPr>
+            <w:tcW w:type="dxa" w:w="4084"/>
           </w:tcPr>
           <w:p>
             <w:pPr>
@@ -13860,23 +13974,29 @@
                 <w:rFonts w:ascii="Courier New" w:hAnsi="Courier New"/>
                 <w:sz w:val="18"/>
               </w:rPr>
-              <w:t>scripts/analysis/autonomy_funnel.py fixtures/heldout3 fixtures/heldout2</w:t>
-            </w:r>
-          </w:p>
-        </w:tc>
-        <w:tc>
-          <w:tcPr>
-            <w:tcW w:type="dxa" w:w="3635"/>
-          </w:tcPr>
-          <w:p>
-            <w:pPr>
-              <w:spacing w:before="20" w:after="20" w:line="240" w:lineRule="auto"/>
-            </w:pPr>
-            <w:r>
-              <w:rPr>
-                <w:sz w:val="18"/>
-              </w:rPr>
-              <w:t>Table 7</w:t>
+              <w:t>scripts/evaluate.py</w:t>
+            </w:r>
+            <w:r>
+              <w:rPr>
+                <w:sz w:val="18"/>
+              </w:rPr>
+              <w:t xml:space="preserve"> (7 min 41 s, including the funding brute force)</w:t>
+            </w:r>
+          </w:p>
+        </w:tc>
+        <w:tc>
+          <w:tcPr>
+            <w:tcW w:type="dxa" w:w="3585"/>
+          </w:tcPr>
+          <w:p>
+            <w:pPr>
+              <w:spacing w:before="20" w:after="20" w:line="240" w:lineRule="auto"/>
+            </w:pPr>
+            <w:r>
+              <w:rPr>
+                <w:sz w:val="18"/>
+              </w:rPr>
+              <w:t>every target met; figures in Tables 9 and 6</w:t>
             </w:r>
           </w:p>
         </w:tc>
@@ -13887,23 +14007,23 @@
         </w:trPr>
         <w:tc>
           <w:tcPr>
-            <w:tcW w:type="dxa" w:w="1703"/>
-          </w:tcPr>
-          <w:p>
-            <w:pPr>
-              <w:spacing w:before="20" w:after="20" w:line="240" w:lineRule="auto"/>
-            </w:pPr>
-            <w:r>
-              <w:rPr>
-                <w:sz w:val="18"/>
-              </w:rPr>
-              <w:t>Contract reading</w:t>
-            </w:r>
-          </w:p>
-        </w:tc>
-        <w:tc>
-          <w:tcPr>
-            <w:tcW w:type="dxa" w:w="4021"/>
+            <w:tcW w:type="dxa" w:w="1692"/>
+          </w:tcPr>
+          <w:p>
+            <w:pPr>
+              <w:spacing w:before="20" w:after="20" w:line="240" w:lineRule="auto"/>
+            </w:pPr>
+            <w:r>
+              <w:rPr>
+                <w:sz w:val="18"/>
+              </w:rPr>
+              <w:t>Autonomy funnel</w:t>
+            </w:r>
+          </w:p>
+        </w:tc>
+        <w:tc>
+          <w:tcPr>
+            <w:tcW w:type="dxa" w:w="4084"/>
           </w:tcPr>
           <w:p>
             <w:pPr>
@@ -13914,29 +14034,23 @@
                 <w:rFonts w:ascii="Courier New" w:hAnsi="Courier New"/>
                 <w:sz w:val="18"/>
               </w:rPr>
-              <w:t>scripts/eval_contracts.py</w:t>
-            </w:r>
-            <w:r>
-              <w:rPr>
-                <w:sz w:val="18"/>
-              </w:rPr>
-              <w:t xml:space="preserve"> on the 70 synthetic contracts, recorded DeepSeek readings</w:t>
-            </w:r>
-          </w:p>
-        </w:tc>
-        <w:tc>
-          <w:tcPr>
-            <w:tcW w:type="dxa" w:w="3635"/>
-          </w:tcPr>
-          <w:p>
-            <w:pPr>
-              <w:spacing w:before="20" w:after="20" w:line="240" w:lineRule="auto"/>
-            </w:pPr>
-            <w:r>
-              <w:rPr>
-                <w:sz w:val="18"/>
-              </w:rPr>
-              <w:t>75% held-out, 86% after fixes, 98% tuned; measured in session, 17 Oct</w:t>
+              <w:t>scripts/analysis/autonomy_funnel.py fixtures/heldout3 fixtures/heldout2</w:t>
+            </w:r>
+          </w:p>
+        </w:tc>
+        <w:tc>
+          <w:tcPr>
+            <w:tcW w:type="dxa" w:w="3585"/>
+          </w:tcPr>
+          <w:p>
+            <w:pPr>
+              <w:spacing w:before="20" w:after="20" w:line="240" w:lineRule="auto"/>
+            </w:pPr>
+            <w:r>
+              <w:rPr>
+                <w:sz w:val="18"/>
+              </w:rPr>
+              <w:t>Table 7</w:t>
             </w:r>
           </w:p>
         </w:tc>
@@ -13947,7 +14061,67 @@
         </w:trPr>
         <w:tc>
           <w:tcPr>
-            <w:tcW w:type="dxa" w:w="1703"/>
+            <w:tcW w:type="dxa" w:w="1692"/>
+          </w:tcPr>
+          <w:p>
+            <w:pPr>
+              <w:spacing w:before="20" w:after="20" w:line="240" w:lineRule="auto"/>
+            </w:pPr>
+            <w:r>
+              <w:rPr>
+                <w:sz w:val="18"/>
+              </w:rPr>
+              <w:t>Contract reading</w:t>
+            </w:r>
+          </w:p>
+        </w:tc>
+        <w:tc>
+          <w:tcPr>
+            <w:tcW w:type="dxa" w:w="4084"/>
+          </w:tcPr>
+          <w:p>
+            <w:pPr>
+              <w:spacing w:before="20" w:after="20" w:line="240" w:lineRule="auto"/>
+            </w:pPr>
+            <w:r>
+              <w:rPr>
+                <w:rFonts w:ascii="Courier New" w:hAnsi="Courier New"/>
+                <w:sz w:val="18"/>
+              </w:rPr>
+              <w:t>scripts/eval_contracts.py</w:t>
+            </w:r>
+            <w:r>
+              <w:rPr>
+                <w:sz w:val="18"/>
+              </w:rPr>
+              <w:t xml:space="preserve"> on the 70 synthetic contracts, recorded DeepSeek readings</w:t>
+            </w:r>
+          </w:p>
+        </w:tc>
+        <w:tc>
+          <w:tcPr>
+            <w:tcW w:type="dxa" w:w="3585"/>
+          </w:tcPr>
+          <w:p>
+            <w:pPr>
+              <w:spacing w:before="20" w:after="20" w:line="240" w:lineRule="auto"/>
+            </w:pPr>
+            <w:r>
+              <w:rPr>
+                <w:sz w:val="18"/>
+              </w:rPr>
+              <w:t>75% held-out, 86% after fixes, 98% tuned; measured in session, 17 Oct</w:t>
+            </w:r>
+          </w:p>
+        </w:tc>
+      </w:tr>
+      <w:tr>
+        <w:trPr>
+          <w:cantSplit w:val="true"/>
+        </w:trPr>
+        <w:tc>
+          <w:tcPr>
+            <w:tcW w:type="dxa" w:w="1692"/>
           </w:tcPr>
           <w:p>
             <w:pPr>
@@ -13963,7 +14137,7 @@
         </w:tc>
         <w:tc>
           <w:tcPr>
-            <w:tcW w:type="dxa" w:w="4021"/>
+            <w:tcW w:type="dxa" w:w="4084"/>
           </w:tcPr>
           <w:p>
             <w:pPr>
@@ -13986,7 +14160,7 @@
         </w:tc>
         <w:tc>
           <w:tcPr>
-            <w:tcW w:type="dxa" w:w="3635"/>
+            <w:tcW w:type="dxa" w:w="3585"/>
           </w:tcPr>
           <w:p>
             <w:pPr>

</xml_diff>

<commit_message>
docs(deliverables): contract terms in the technical document; ADR-0014 accepted
The owner chose to ship ADR-0014 switched on; the technical document
and the ADR now say what the step does and what it does not.

- Section 03: the owner can set up a confirmed contract's repeating
  invoice so the forecast counts it
- Section 04: setting up contract terms and adding a customer are
  Tier 2; confirming never changes the books, only the separate
  owner step does, bound, re-checked, logged and undoable
- Limitations: one repeating invoice per contract; conflicts refused;
  rebates and milestones shown, not set up
- Appendix C: refile, terms, terms/undo, customers, session reset
- ADR-0014: accepted by the owner; Security Lead review pending

Tests: build_deliverables.py verification passes for all three
documents.
Refs: ADR-0014
</commit_message>
<xml_diff>
--- a/docs/deliverables/out/Technical_Document.docx
+++ b/docs/deliverables/out/Technical_Document.docx
@@ -5233,7 +5233,7 @@
         <w:rPr>
           <w:sz w:val="20"/>
         </w:rPr>
-        <w:t xml:space="preserve"> hold a document's reading with each term's quoted clause and the owner's hash-bound decision (ADR-0012).</w:t>
+        <w:t xml:space="preserve"> hold a document's reading with each term's quoted clause and the owner's hash-bound decision (ADR-0012). From a confirmed customer contract, the owner can set up that customer's repeating invoice in the books, so the forecast counts it (ADR-0014).</w:t>
       </w:r>
     </w:p>
     <w:p>
@@ -11249,7 +11249,7 @@
         <w:rPr>
           <w:sz w:val="20"/>
         </w:rPr>
-        <w:t>an equipment purchase;</w:t>
+        <w:t>setting up a confirmed contract's repeating invoice in the books (ADR-0014);</w:t>
       </w:r>
     </w:p>
     <w:p>
@@ -11265,7 +11265,7 @@
         <w:rPr>
           <w:sz w:val="20"/>
         </w:rPr>
-        <w:t>a draw above the rate ceiling;</w:t>
+        <w:t>adding a customer to the books;</w:t>
       </w:r>
     </w:p>
     <w:p>
@@ -11281,6 +11281,38 @@
         <w:rPr>
           <w:sz w:val="20"/>
         </w:rPr>
+        <w:t>an equipment purchase;</w:t>
+      </w:r>
+    </w:p>
+    <w:p>
+      <w:pPr>
+        <w:pStyle w:val="ListBullet3"/>
+        <w:tabs>
+          <w:tab w:pos="1152" w:val="left"/>
+        </w:tabs>
+        <w:spacing w:before="0" w:after="60" w:line="259" w:lineRule="auto"/>
+        <w:ind w:left="1152" w:hanging="288"/>
+      </w:pPr>
+      <w:r>
+        <w:rPr>
+          <w:sz w:val="20"/>
+        </w:rPr>
+        <w:t>a draw above the rate ceiling;</w:t>
+      </w:r>
+    </w:p>
+    <w:p>
+      <w:pPr>
+        <w:pStyle w:val="ListBullet3"/>
+        <w:tabs>
+          <w:tab w:pos="1152" w:val="left"/>
+        </w:tabs>
+        <w:spacing w:before="0" w:after="60" w:line="259" w:lineRule="auto"/>
+        <w:ind w:left="1152" w:hanging="288"/>
+      </w:pPr>
+      <w:r>
+        <w:rPr>
+          <w:sz w:val="20"/>
+        </w:rPr>
         <w:t>a receipt reported by anyone other than the bank or the owner.</w:t>
       </w:r>
     </w:p>
@@ -11944,7 +11976,23 @@
         <w:rPr>
           <w:sz w:val="20"/>
         </w:rPr>
-        <w:t>A confirmed document never changes the books. After confirming, FLOW says what was saved, under which customer, and that the forecast is unchanged.</w:t>
+        <w:t>Confirming a document never changes the books. After confirming, FLOW says what was saved, under which customer, and that the forecast is unchanged.</w:t>
+      </w:r>
+    </w:p>
+    <w:p>
+      <w:pPr>
+        <w:pStyle w:val="ListBullet3"/>
+        <w:tabs>
+          <w:tab w:pos="1152" w:val="left"/>
+        </w:tabs>
+        <w:spacing w:before="0" w:after="60" w:line="259" w:lineRule="auto"/>
+        <w:ind w:left="1152" w:hanging="288"/>
+      </w:pPr>
+      <w:r>
+        <w:rPr>
+          <w:sz w:val="20"/>
+        </w:rPr>
+        <w:t>Only a separate owner step, "Set up in my books", can add a confirmed customer contract's repeating invoice (ADR-0014). It uses only terms quoted word for word and re-read by code, is bound to the document and the exact terms shown, is re-checked on today's books, is logged, and can be undone. The agent, buyers and the bank feed are refused.</w:t>
       </w:r>
     </w:p>
     <w:p>
@@ -15235,7 +15283,7 @@
         <w:rPr>
           <w:sz w:val="20"/>
         </w:rPr>
-        <w:t xml:space="preserve"> Contract reading is 75% on unseen text-layer contracts. Scans and photos are refused, since there is no OCR. Confirming a contract files its reading but does not change the books.</w:t>
+        <w:t xml:space="preserve"> Contract reading is 75% on unseen text-layer contracts. Scans and photos are refused, since there is no OCR. Setting up a contract's invoices covers one repeating invoice per contract; a contract that differs from a repeating invoice already in the books is refused rather than replacing it, and rebates and milestones are shown, not set up.</w:t>
       </w:r>
     </w:p>
     <w:p>
@@ -16419,6 +16467,19 @@
               </w:rPr>
               <w:t>POST /nl/opener</w:t>
             </w:r>
+            <w:r>
+              <w:rPr>
+                <w:sz w:val="18"/>
+              </w:rPr>
+              <w:t xml:space="preserve">; </w:t>
+            </w:r>
+            <w:r>
+              <w:rPr>
+                <w:rFonts w:ascii="Courier New" w:hAnsi="Courier New"/>
+                <w:sz w:val="18"/>
+              </w:rPr>
+              <w:t>POST /nl/session/reset</w:t>
+            </w:r>
           </w:p>
         </w:tc>
       </w:tr>
@@ -16848,6 +16909,71 @@
                 <w:sz w:val="18"/>
               </w:rPr>
               <w:t>/reject</w:t>
+            </w:r>
+            <w:r>
+              <w:rPr>
+                <w:sz w:val="18"/>
+              </w:rPr>
+              <w:t xml:space="preserve">, </w:t>
+            </w:r>
+            <w:r>
+              <w:rPr>
+                <w:rFonts w:ascii="Courier New" w:hAnsi="Courier New"/>
+                <w:sz w:val="18"/>
+              </w:rPr>
+              <w:t>/refile</w:t>
+            </w:r>
+            <w:r>
+              <w:rPr>
+                <w:sz w:val="18"/>
+              </w:rPr>
+              <w:t xml:space="preserve">; </w:t>
+            </w:r>
+            <w:r>
+              <w:rPr>
+                <w:rFonts w:ascii="Courier New" w:hAnsi="Courier New"/>
+                <w:sz w:val="18"/>
+              </w:rPr>
+              <w:t>GET</w:t>
+            </w:r>
+            <w:r>
+              <w:rPr>
+                <w:sz w:val="18"/>
+              </w:rPr>
+              <w:t>/</w:t>
+            </w:r>
+            <w:r>
+              <w:rPr>
+                <w:rFonts w:ascii="Courier New" w:hAnsi="Courier New"/>
+                <w:sz w:val="18"/>
+              </w:rPr>
+              <w:t>POST /documents/{id}/terms</w:t>
+            </w:r>
+            <w:r>
+              <w:rPr>
+                <w:sz w:val="18"/>
+              </w:rPr>
+              <w:t xml:space="preserve">, </w:t>
+            </w:r>
+            <w:r>
+              <w:rPr>
+                <w:rFonts w:ascii="Courier New" w:hAnsi="Courier New"/>
+                <w:sz w:val="18"/>
+              </w:rPr>
+              <w:t>POST /documents/{id}/terms/undo</w:t>
+            </w:r>
+            <w:r>
+              <w:rPr>
+                <w:sz w:val="18"/>
+              </w:rPr>
+              <w:t xml:space="preserve">; </w:t>
+            </w:r>
+            <w:r>
+              <w:rPr>
+                <w:rFonts w:ascii="Courier New" w:hAnsi="Courier New"/>
+                <w:sz w:val="18"/>
+              </w:rPr>
+              <w:t>POST /customers</w:t>
             </w:r>
             <w:r>
               <w:rPr>

</xml_diff>

<commit_message>
docs(deliverables): video timestamps in the feature tour
The final recordings of ed5e0932 are made; Appendix E now points each
stage at its place in the submission video and the full tour.

- Appendix E: timestamps for both cuts (4:22 and 17:31) per stage,
  and where the chapter lists live

Tests: build_deliverables.py verification passes.
Refs: feat/demo-video 605889f4
</commit_message>
<xml_diff>
--- a/docs/deliverables/out/Technical_Document.docx
+++ b/docs/deliverables/out/Technical_Document.docx
@@ -21445,7 +21445,72 @@
         <w:rPr>
           <w:sz w:val="20"/>
         </w:rPr>
-        <w:t xml:space="preserve"> The lead fills these in after the final recording. They are kept together here, as one list.</w:t>
+        <w:t xml:space="preserve"> Two recordings of build </w:t>
+      </w:r>
+      <w:r>
+        <w:rPr>
+          <w:rFonts w:ascii="Courier New" w:hAnsi="Courier New"/>
+          <w:sz w:val="18"/>
+        </w:rPr>
+        <w:t>ed5e0932</w:t>
+      </w:r>
+      <w:r>
+        <w:rPr>
+          <w:sz w:val="20"/>
+        </w:rPr>
+        <w:t xml:space="preserve"> (18 Oct 2026), made by </w:t>
+      </w:r>
+      <w:r>
+        <w:rPr>
+          <w:rFonts w:ascii="Courier New" w:hAnsi="Courier New"/>
+          <w:sz w:val="18"/>
+        </w:rPr>
+        <w:t>pnpm demo:video</w:t>
+      </w:r>
+      <w:r>
+        <w:rPr>
+          <w:sz w:val="20"/>
+        </w:rPr>
+        <w:t>: the submission video (</w:t>
+      </w:r>
+      <w:r>
+        <w:rPr>
+          <w:rFonts w:ascii="Courier New" w:hAnsi="Courier New"/>
+          <w:sz w:val="18"/>
+        </w:rPr>
+        <w:t>flow-demo-5min</w:t>
+      </w:r>
+      <w:r>
+        <w:rPr>
+          <w:sz w:val="20"/>
+        </w:rPr>
+        <w:t>, 4:22) and the full tour (</w:t>
+      </w:r>
+      <w:r>
+        <w:rPr>
+          <w:rFonts w:ascii="Courier New" w:hAnsi="Courier New"/>
+          <w:sz w:val="18"/>
+        </w:rPr>
+        <w:t>flow-full-tour</w:t>
+      </w:r>
+      <w:r>
+        <w:rPr>
+          <w:sz w:val="20"/>
+        </w:rPr>
+        <w:t xml:space="preserve">, 17:31). The chapter lists are in </w:t>
+      </w:r>
+      <w:r>
+        <w:rPr>
+          <w:rFonts w:ascii="Courier New" w:hAnsi="Courier New"/>
+          <w:sz w:val="18"/>
+        </w:rPr>
+        <w:t>docs/deliverables/video/README.md</w:t>
+      </w:r>
+      <w:r>
+        <w:rPr>
+          <w:sz w:val="20"/>
+        </w:rPr>
+        <w:t>.</w:t>
       </w:r>
     </w:p>
     <w:p>
@@ -21463,7 +21528,7 @@
         <w:rPr>
           <w:sz w:val="20"/>
         </w:rPr>
-        <w:t>Setting up the books: [VIDEO: mm:ss]</w:t>
+        <w:t>Setting up the books: full tour 0:16; submission video 0:12</w:t>
       </w:r>
     </w:p>
     <w:p>
@@ -21481,7 +21546,7 @@
         <w:rPr>
           <w:sz w:val="20"/>
         </w:rPr>
-        <w:t>The daily view: [VIDEO: mm:ss]</w:t>
+        <w:t>The daily view: full tour 2:48; submission video 0:40</w:t>
       </w:r>
     </w:p>
     <w:p>
@@ -21499,7 +21564,7 @@
         <w:rPr>
           <w:sz w:val="20"/>
         </w:rPr>
-        <w:t>Documents: [VIDEO: mm:ss]</w:t>
+        <w:t>Documents: full tour 4:06; submission video 3:06 (a contract becomes invoices)</w:t>
       </w:r>
     </w:p>
     <w:p>
@@ -21517,7 +21582,7 @@
         <w:rPr>
           <w:sz w:val="20"/>
         </w:rPr>
-        <w:t>Customers: [VIDEO: mm:ss]</w:t>
+        <w:t>Customers: full tour 6:12</w:t>
       </w:r>
     </w:p>
     <w:p>
@@ -21535,7 +21600,7 @@
         <w:rPr>
           <w:sz w:val="20"/>
         </w:rPr>
-        <w:t>Deals and negotiation: [VIDEO: mm:ss]</w:t>
+        <w:t>Deals and negotiation: full tour 6:45; submission video 1:07 (the buyer asks), 1:19 (FLOW decides), 1:40 (the counter is sent), 1:53 (the deal, followed)</w:t>
       </w:r>
     </w:p>
     <w:p>
@@ -21553,7 +21618,7 @@
         <w:rPr>
           <w:sz w:val="20"/>
         </w:rPr>
-        <w:t>Money and approvals: [VIDEO: mm:ss]</w:t>
+        <w:t>Money and approvals: full tour 9:34; submission video 2:35 (the owner decides)</w:t>
       </w:r>
     </w:p>
     <w:p>
@@ -21571,7 +21636,7 @@
         <w:rPr>
           <w:sz w:val="20"/>
         </w:rPr>
-        <w:t>Time passing: invoices, receipts, a late payment, the cure, reconciliation: [VIDEO: mm:ss]</w:t>
+        <w:t>Time passing: invoices, receipts, a late payment, the cure, reconciliation: full tour 10:19; submission video 2:04, 2:18, 2:52</w:t>
       </w:r>
     </w:p>
     <w:p>
@@ -21589,7 +21654,7 @@
         <w:rPr>
           <w:sz w:val="20"/>
         </w:rPr>
-        <w:t>Ask FLOW: [VIDEO: mm:ss]</w:t>
+        <w:t>Ask FLOW: full tour 11:52; submission video 3:30</w:t>
       </w:r>
     </w:p>
     <w:p>
@@ -21607,7 +21672,7 @@
         <w:rPr>
           <w:sz w:val="20"/>
         </w:rPr>
-        <w:t>What-if and strategy: [VIDEO: mm:ss]</w:t>
+        <w:t>What-if and strategy: full tour 13:12</w:t>
       </w:r>
     </w:p>
     <w:p>
@@ -21625,7 +21690,7 @@
         <w:rPr>
           <w:sz w:val="20"/>
         </w:rPr>
-        <w:t>Capex: [VIDEO: mm:ss]</w:t>
+        <w:t>Capex: full tour 13:54</w:t>
       </w:r>
     </w:p>
     <w:p>
@@ -21643,7 +21708,7 @@
         <w:rPr>
           <w:sz w:val="20"/>
         </w:rPr>
-        <w:t>Records, evidence and security: [VIDEO: mm:ss]</w:t>
+        <w:t>Records, evidence and security: full tour 15:16 (records and judging), 16:48 (security); submission video 3:58</w:t>
       </w:r>
     </w:p>
     <w:p>

</xml_diff>